<commit_message>
Ajoute au rapport les captures des pièces jointes du dossier
</commit_message>
<xml_diff>
--- a/docs/rapport/Rapport_technique_ATT.docx
+++ b/docs/rapport/Rapport_technique_ATT.docx
@@ -3653,23 +3653,6 @@
     </w:p>
     <w:p>
       <w:pPr>
-        <w:pStyle w:val="Heading2"/>
-        <w:spacing w:after="140" w:before="280"/>
-      </w:pPr>
-      <w:r>
-        <w:rPr>
-          <w:rFonts w:ascii="Calibri" w:cs="Calibri" w:eastAsia="Calibri" w:hAnsi="Calibri"/>
-          <w:b/>
-          <w:bCs/>
-          <w:color w:val="0B2E4F"/>
-          <w:sz w:val="26"/>
-          <w:szCs w:val="26"/>
-        </w:rPr>
-        <w:t xml:space="preserve">6.7 Décision de l'ATT sur le dossier</w:t>
-      </w:r>
-    </w:p>
-    <w:p>
-      <w:pPr>
         <w:spacing w:after="120" w:line="300"/>
       </w:pPr>
       <w:r>
@@ -3678,7 +3661,7 @@
           <w:sz w:val="22"/>
           <w:szCs w:val="22"/>
         </w:rPr>
-        <w:t xml:space="preserve">L'administrateur ATT retrouve les dossiers soumis dans « Dossiers à traiter ». Il valide, ou marque le dossier incomplet ou refusé avec un motif obligatoire, que l'auto-école lit sur sa propre fiche. C'est ce contrôle en amont qui évite le cas vécu d'un candidat renvoyé le jour de l'examen : seul un dossier validé permet une inscription.</w:t>
+        <w:t xml:space="preserve">Sur la figure suivante, l'auto-école a joint une photo à la première pièce depuis les fichiers du téléphone : la pièce passe en « Photo jointe », avec les actions ouvrir, remplacer, retirer, et l'ATT pourra l'examiner sur écran. La dernière figure montre la pièce ouverte, avec les mêmes droits que le dossier.</w:t>
       </w:r>
     </w:p>
     <w:p>
@@ -3740,37 +3723,7 @@
           <w:sz w:val="19"/>
           <w:szCs w:val="19"/>
         </w:rPr>
-        <w:t xml:space="preserve">Figure 8 — Décision de l'ATT : valider, incomplet ou refuser avec motif</w:t>
-      </w:r>
-    </w:p>
-    <w:p>
-      <w:pPr>
-        <w:pStyle w:val="Heading2"/>
-        <w:spacing w:after="140" w:before="280"/>
-      </w:pPr>
-      <w:r>
-        <w:rPr>
-          <w:rFonts w:ascii="Calibri" w:cs="Calibri" w:eastAsia="Calibri" w:hAnsi="Calibri"/>
-          <w:b/>
-          <w:bCs/>
-          <w:color w:val="0B2E4F"/>
-          <w:sz w:val="26"/>
-          <w:szCs w:val="26"/>
-        </w:rPr>
-        <w:t xml:space="preserve">6.8 Session et créneaux</w:t>
-      </w:r>
-    </w:p>
-    <w:p>
-      <w:pPr>
-        <w:spacing w:after="120" w:line="300"/>
-      </w:pPr>
-      <w:r>
-        <w:rPr>
-          <w:rFonts w:ascii="Calibri" w:cs="Calibri" w:eastAsia="Calibri" w:hAnsi="Calibri"/>
-          <w:sz w:val="22"/>
-          <w:szCs w:val="22"/>
-        </w:rPr>
-        <w:t xml:space="preserve">Une session est une épreuve d'une catégorie, dans un centre, à une date, avec une heure de convocation et une capacité. L'administrateur indique combien de candidats passent par créneau, la durée d'un créneau et la marge entre deux ; l'application calcule les créneaux et les affiche avant même la création. Une seconde session le même jour dans le même centre déclenche un avertissement. La session passe ensuite par les statuts planifiée, ouverte aux inscriptions, complète, en cours, terminée ou annulée avec motif.</w:t>
+        <w:t xml:space="preserve">Figure 8 — Pièce du dossier avec un fichier joint : ouvrir, remplacer, retirer</w:t>
       </w:r>
     </w:p>
     <w:p>
@@ -3832,7 +3785,7 @@
           <w:sz w:val="19"/>
           <w:szCs w:val="19"/>
         </w:rPr>
-        <w:t xml:space="preserve">Figure 9 — Création d'une session : les créneaux se calculent à la saisie</w:t>
+        <w:t xml:space="preserve">Figure 9 — La pièce jointe ouverte par l'ATT ou l'auto-école</w:t>
       </w:r>
     </w:p>
     <w:p>
@@ -3849,7 +3802,7 @@
           <w:sz w:val="26"/>
           <w:szCs w:val="26"/>
         </w:rPr>
-        <w:t xml:space="preserve">6.9 Inscription et convocation</w:t>
+        <w:t xml:space="preserve">6.7 Décision de l'ATT sur le dossier</w:t>
       </w:r>
     </w:p>
     <w:p>
@@ -3862,7 +3815,7 @@
           <w:sz w:val="22"/>
           <w:szCs w:val="22"/>
         </w:rPr>
-        <w:t xml:space="preserve">L'administrateur inscrit un candidat éligible : dossier validé pour la catégorie, capacité de la session et du créneau non dépassées, pas de double inscription, pas d'autre session le même jour, délai de repassage écoulé, théorie réussie si l'épreuve est la conduite. Le candidat reçoit un numéro d'appel (001, 002…) et un créneau, donc une heure de passage estimée. La convocation s'imprime depuis cette liste ; une inscription se reporte ou s'annule avec motif, et la place est libérée.</w:t>
+        <w:t xml:space="preserve">L'administrateur ATT retrouve les dossiers soumis dans « Dossiers à traiter ». Il valide, ou marque le dossier incomplet ou refusé avec un motif obligatoire, que l'auto-école lit sur sa propre fiche. C'est ce contrôle en amont qui évite le cas vécu d'un candidat renvoyé le jour de l'examen : seul un dossier validé permet une inscription.</w:t>
       </w:r>
     </w:p>
     <w:p>
@@ -3924,7 +3877,7 @@
           <w:sz w:val="19"/>
           <w:szCs w:val="19"/>
         </w:rPr>
-        <w:t xml:space="preserve">Figure 10 — Inscriptions d'une session : numéro d'appel, créneau, actions</w:t>
+        <w:t xml:space="preserve">Figure 10 — Décision de l'ATT : valider, incomplet ou refuser avec motif</w:t>
       </w:r>
     </w:p>
     <w:p>
@@ -3941,7 +3894,7 @@
           <w:sz w:val="26"/>
           <w:szCs w:val="26"/>
         </w:rPr>
-        <w:t xml:space="preserve">6.10 Appel et présence</w:t>
+        <w:t xml:space="preserve">6.8 Session et créneaux</w:t>
       </w:r>
     </w:p>
     <w:p>
@@ -3954,7 +3907,7 @@
           <w:sz w:val="22"/>
           <w:szCs w:val="22"/>
         </w:rPr>
-        <w:t xml:space="preserve">Le jour de l'examen, l'agent fait l'appel par créneau, avec peu de candidats à la fois. Chaque candidat est marqué présent ou absent ; au-delà de la tolérance de retard configurée, l'application propose d'accepter ou de refuser le retard. Un statut se corrige, ce qui répond au cas observé du « présent » non entendu dans la foule. La liste d'appel s'imprime en secours ; l'examinateur en reçoit une version sans les noms.</w:t>
+        <w:t xml:space="preserve">Une session est une épreuve d'une catégorie, dans un centre, à une date, avec une heure de convocation et une capacité. L'administrateur indique combien de candidats passent par créneau, la durée d'un créneau et la marge entre deux ; l'application calcule les créneaux et les affiche avant même la création. Une seconde session le même jour dans le même centre déclenche un avertissement. La session passe ensuite par les statuts planifiée, ouverte aux inscriptions, complète, en cours, terminée ou annulée avec motif.</w:t>
       </w:r>
     </w:p>
     <w:p>
@@ -4016,7 +3969,7 @@
           <w:sz w:val="19"/>
           <w:szCs w:val="19"/>
         </w:rPr>
-        <w:t xml:space="preserve">Figure 11 — Appel d'une session : présents, retards, absents</w:t>
+        <w:t xml:space="preserve">Figure 11 — Création d'une session : les créneaux se calculent à la saisie</w:t>
       </w:r>
     </w:p>
     <w:p>
@@ -4033,7 +3986,7 @@
           <w:sz w:val="26"/>
           <w:szCs w:val="26"/>
         </w:rPr>
-        <w:t xml:space="preserve">6.11 Passages et vue de l'examinateur</w:t>
+        <w:t xml:space="preserve">6.9 Inscription et convocation</w:t>
       </w:r>
     </w:p>
     <w:p>
@@ -4046,7 +3999,7 @@
           <w:sz w:val="22"/>
           <w:szCs w:val="22"/>
         </w:rPr>
-        <w:t xml:space="preserve">L'examinateur connecté voit les sessions du jour et, pour chacune, les candidats présents identifiés par leur seul numéro d'appel. Il ouvre un passage : le n-ième pour ce candidat et cette épreuve, jamais réutilisé, jamais effacé, tracé dans l'historique. Un passage déjà terminé se consulte en lecture seule.</w:t>
+        <w:t xml:space="preserve">L'administrateur inscrit un candidat éligible : dossier validé pour la catégorie, capacité de la session et du créneau non dépassées, pas de double inscription, pas d'autre session le même jour, délai de repassage écoulé, théorie réussie si l'épreuve est la conduite. Le candidat reçoit un numéro d'appel (001, 002…) et un créneau, donc une heure de passage estimée. La convocation s'imprime depuis cette liste ; une inscription se reporte ou s'annule avec motif, et la place est libérée.</w:t>
       </w:r>
     </w:p>
     <w:p>
@@ -4108,7 +4061,7 @@
           <w:sz w:val="19"/>
           <w:szCs w:val="19"/>
         </w:rPr>
-        <w:t xml:space="preserve">Figure 12 — Vue de l'examinateur : numéros d'appel, sans les noms</w:t>
+        <w:t xml:space="preserve">Figure 12 — Inscriptions d'une session : numéro d'appel, créneau, actions</w:t>
       </w:r>
     </w:p>
     <w:p>
@@ -4125,7 +4078,7 @@
           <w:sz w:val="26"/>
           <w:szCs w:val="26"/>
         </w:rPr>
-        <w:t xml:space="preserve">6.12 Épreuve théorique orale</w:t>
+        <w:t xml:space="preserve">6.10 Appel et présence</w:t>
       </w:r>
     </w:p>
     <w:p>
@@ -4138,7 +4091,7 @@
           <w:sz w:val="22"/>
           <w:szCs w:val="22"/>
         </w:rPr>
-        <w:t xml:space="preserve">L'épreuve théorique est orale, comme nous l'avons vécue. L'écran reproduit la feuille de l'examinateur : le sujet est tiré au sort par l'application jusqu'à la note maximale du barème, ou choisi question par question par l'examinateur selon la règle configurée. Pour chaque question, il écrit la réponse donnée par le candidat et les points attribués, de zéro au maximum de la question ; la réponse attendue s'affiche en aide-mémoire. Le total se calcule au fil de la saisie. « Terminer l'épreuve » fige la feuille, clôt le passage et calcule aussitôt le résultat.</w:t>
+        <w:t xml:space="preserve">Le jour de l'examen, l'agent fait l'appel par créneau, avec peu de candidats à la fois. Chaque candidat est marqué présent ou absent ; au-delà de la tolérance de retard configurée, l'application propose d'accepter ou de refuser le retard. Un statut se corrige, ce qui répond au cas observé du « présent » non entendu dans la foule. La liste d'appel s'imprime en secours ; l'examinateur en reçoit une version sans les noms.</w:t>
       </w:r>
     </w:p>
     <w:p>
@@ -4200,7 +4153,7 @@
           <w:sz w:val="19"/>
           <w:szCs w:val="19"/>
         </w:rPr>
-        <w:t xml:space="preserve">Figure 13 — Feuille d'examen théorique : questions posées, réponses, points</w:t>
+        <w:t xml:space="preserve">Figure 13 — Appel d'une session : présents, retards, absents</w:t>
       </w:r>
     </w:p>
     <w:p>
@@ -4217,7 +4170,7 @@
           <w:sz w:val="26"/>
           <w:szCs w:val="26"/>
         </w:rPr>
-        <w:t xml:space="preserve">6.13 Épreuve de conduite</w:t>
+        <w:t xml:space="preserve">6.11 Passages et vue de l'examinateur</w:t>
       </w:r>
     </w:p>
     <w:p>
@@ -4230,7 +4183,7 @@
           <w:sz w:val="22"/>
           <w:szCs w:val="22"/>
         </w:rPr>
-        <w:t xml:space="preserve">Pour la conduite, l'application propose une grille : un critère par ligne avec ses points, une case « faute éliminatoire » quand le critère l'admet, une observation. La grille elle-même n'est pas imposée : elle vient de la configuration et reste à confirmer par l'ATT. Une faute éliminatoire vaut zéro sur le critère et fait perdre l'épreuve quel que soit le total, ce que l'écran annonce en rouge.</w:t>
+        <w:t xml:space="preserve">L'examinateur connecté voit les sessions du jour et, pour chacune, les candidats présents identifiés par leur seul numéro d'appel. Il ouvre un passage : le n-ième pour ce candidat et cette épreuve, jamais réutilisé, jamais effacé, tracé dans l'historique. Un passage déjà terminé se consulte en lecture seule.</w:t>
       </w:r>
     </w:p>
     <w:p>
@@ -4292,7 +4245,7 @@
           <w:sz w:val="19"/>
           <w:szCs w:val="19"/>
         </w:rPr>
-        <w:t xml:space="preserve">Figure 14 — Grille de conduite : points par critère, faute éliminatoire, observations</w:t>
+        <w:t xml:space="preserve">Figure 14 — Vue de l'examinateur : numéros d'appel, sans les noms</w:t>
       </w:r>
     </w:p>
     <w:p>
@@ -4309,7 +4262,7 @@
           <w:sz w:val="26"/>
           <w:szCs w:val="26"/>
         </w:rPr>
-        <w:t xml:space="preserve">6.14 Résultat, validation et correction</w:t>
+        <w:t xml:space="preserve">6.12 Épreuve théorique orale</w:t>
       </w:r>
     </w:p>
     <w:p>
@@ -4322,7 +4275,7 @@
           <w:sz w:val="22"/>
           <w:szCs w:val="22"/>
         </w:rPr>
-        <w:t xml:space="preserve">Le résultat est calculé automatiquement à la clôture de l'épreuve, avec la version du barème en vigueur, copiée dans le résultat pour rester lisible même si le barème change. Il attend la validation de l'administrateur ATT ; jusque-là, ni l'auto-école ni le candidat ne le voient. Une erreur de notation se corrige en rouvrant la feuille de l'examinateur puis en recalculant : l'application crée un nouveau résultat avec un motif, l'ancien reste en base et lisible, marqué « remplacé ».</w:t>
+        <w:t xml:space="preserve">L'épreuve théorique est orale, comme nous l'avons vécue. L'écran reproduit la feuille de l'examinateur : le sujet est tiré au sort par l'application jusqu'à la note maximale du barème, ou choisi question par question par l'examinateur selon la règle configurée. Pour chaque question, il écrit la réponse donnée par le candidat et les points attribués, de zéro au maximum de la question ; la réponse attendue s'affiche en aide-mémoire. Le total se calcule au fil de la saisie. « Terminer l'épreuve » fige la feuille, clôt le passage et calcule aussitôt le résultat.</w:t>
       </w:r>
     </w:p>
     <w:p>
@@ -4384,7 +4337,7 @@
           <w:sz w:val="19"/>
           <w:szCs w:val="19"/>
         </w:rPr>
-        <w:t xml:space="preserve">Figure 15 — Détail d'un résultat avant validation par l'ATT</w:t>
+        <w:t xml:space="preserve">Figure 15 — Feuille d'examen théorique : questions posées, réponses, points</w:t>
       </w:r>
     </w:p>
     <w:p>
@@ -4401,7 +4354,7 @@
           <w:sz w:val="26"/>
           <w:szCs w:val="26"/>
         </w:rPr>
-        <w:t xml:space="preserve">6.15 Échec et nouvelle tentative</w:t>
+        <w:t xml:space="preserve">6.13 Épreuve de conduite</w:t>
       </w:r>
     </w:p>
     <w:p>
@@ -4414,7 +4367,7 @@
           <w:sz w:val="22"/>
           <w:szCs w:val="22"/>
         </w:rPr>
-        <w:t xml:space="preserve">En cas d'échec, l'écran indique les épreuves à repasser et la date à partir de laquelle le candidat peut être réinscrit, d'après le délai de repassage configuré ; une épreuve réussie reste acquise pendant la durée configurée. Le prochain passage portera le numéro suivant : rien n'est écrasé, le parcours complet reste visible.</w:t>
+        <w:t xml:space="preserve">Pour la conduite, l'application propose une grille : un critère par ligne avec ses points, une case « faute éliminatoire » quand le critère l'admet, une observation. La grille elle-même n'est pas imposée : elle vient de la configuration et reste à confirmer par l'ATT. Une faute éliminatoire vaut zéro sur le critère et fait perdre l'épreuve quel que soit le total, ce que l'écran annonce en rouge.</w:t>
       </w:r>
     </w:p>
     <w:p>
@@ -4476,7 +4429,7 @@
           <w:sz w:val="19"/>
           <w:szCs w:val="19"/>
         </w:rPr>
-        <w:t xml:space="preserve">Figure 16 — Résultat en échec : épreuves à repasser et date de réinscription</w:t>
+        <w:t xml:space="preserve">Figure 16 — Grille de conduite : points par critère, faute éliminatoire, observations</w:t>
       </w:r>
     </w:p>
     <w:p>
@@ -4493,7 +4446,7 @@
           <w:sz w:val="26"/>
           <w:szCs w:val="26"/>
         </w:rPr>
-        <w:t xml:space="preserve">6.16 Consultation par rôle</w:t>
+        <w:t xml:space="preserve">6.14 Résultat, validation et correction</w:t>
       </w:r>
     </w:p>
     <w:p>
@@ -4506,7 +4459,7 @@
           <w:sz w:val="22"/>
           <w:szCs w:val="22"/>
         </w:rPr>
-        <w:t xml:space="preserve">Chacun voit ce qui le concerne. L'auto-école suit ses candidats, leurs inscriptions et leurs résultats validés ; le candidat qui dispose d'un compte lit son parcours, dossier, convocations, passages et résultats ; l'ATT voit tout et filtre par région. Un candidat sans smartphone n'est pas pénalisé : son auto-école et l'ATT ont la même information, et les documents s'impriment.</w:t>
+        <w:t xml:space="preserve">Le résultat est calculé automatiquement à la clôture de l'épreuve, avec la version du barème en vigueur, copiée dans le résultat pour rester lisible même si le barème change. Il attend la validation de l'administrateur ATT ; jusque-là, ni l'auto-école ni le candidat ne le voient. Une erreur de notation se corrige en rouvrant la feuille de l'examinateur puis en recalculant : l'application crée un nouveau résultat avec un motif, l'ancien reste en base et lisible, marqué « remplacé ».</w:t>
       </w:r>
     </w:p>
     <w:p>
@@ -4568,7 +4521,7 @@
           <w:sz w:val="19"/>
           <w:szCs w:val="19"/>
         </w:rPr>
-        <w:t xml:space="preserve">Figure 17 — Parcours du candidat, vu avec son compte</w:t>
+        <w:t xml:space="preserve">Figure 17 — Détail d'un résultat avant validation par l'ATT</w:t>
       </w:r>
     </w:p>
     <w:p>
@@ -4585,7 +4538,7 @@
           <w:sz w:val="26"/>
           <w:szCs w:val="26"/>
         </w:rPr>
-        <w:t xml:space="preserve">6.17 Impression</w:t>
+        <w:t xml:space="preserve">6.15 Échec et nouvelle tentative</w:t>
       </w:r>
     </w:p>
     <w:p>
@@ -4598,7 +4551,7 @@
           <w:sz w:val="22"/>
           <w:szCs w:val="22"/>
         </w:rPr>
-        <w:t xml:space="preserve">Quatre documents s'impriment depuis l'application, sans réseau : la convocation individuelle avec l'heure de passage estimée et les pièces à apporter, la liste d'appel d'une session (avec ou sans noms selon le rôle), la liste des admis et le relevé de résultat. La page est produite en HTML, montrée en aperçu, puis confiée au service d'impression d'Android, qui permet aussi d'enregistrer un PDF.</w:t>
+        <w:t xml:space="preserve">En cas d'échec, l'écran indique les épreuves à repasser et la date à partir de laquelle le candidat peut être réinscrit, d'après le délai de repassage configuré ; une épreuve réussie reste acquise pendant la durée configurée. Le prochain passage portera le numéro suivant : rien n'est écrasé, le parcours complet reste visible.</w:t>
       </w:r>
     </w:p>
     <w:p>
@@ -4660,7 +4613,7 @@
           <w:sz w:val="19"/>
           <w:szCs w:val="19"/>
         </w:rPr>
-        <w:t xml:space="preserve">Figure 18 — Relevé de résultat, prêt à imprimer</w:t>
+        <w:t xml:space="preserve">Figure 18 — Résultat en échec : épreuves à repasser et date de réinscription</w:t>
       </w:r>
     </w:p>
     <w:p>
@@ -4677,7 +4630,7 @@
           <w:sz w:val="26"/>
           <w:szCs w:val="26"/>
         </w:rPr>
-        <w:t xml:space="preserve">6.18 Historique</w:t>
+        <w:t xml:space="preserve">6.16 Consultation par rôle</w:t>
       </w:r>
     </w:p>
     <w:p>
@@ -4690,7 +4643,7 @@
           <w:sz w:val="22"/>
           <w:szCs w:val="22"/>
         </w:rPr>
-        <w:t xml:space="preserve">Toute modification sensible est enregistrée avec son auteur, sa date, l'action, l'ancienne et la nouvelle valeur et le motif, dans la même transaction que la modification elle-même. L'historique se lit depuis chaque fiche et depuis un écran global, filtrable par période, par objet et par utilisateur.</w:t>
+        <w:t xml:space="preserve">Chacun voit ce qui le concerne. L'auto-école suit ses candidats, leurs inscriptions et leurs résultats validés ; le candidat qui dispose d'un compte lit son parcours, dossier, convocations, passages et résultats ; l'ATT voit tout et filtre par région. Un candidat sans smartphone n'est pas pénalisé : son auto-école et l'ATT ont la même information, et les documents s'impriment.</w:t>
       </w:r>
     </w:p>
     <w:p>
@@ -4752,7 +4705,7 @@
           <w:sz w:val="19"/>
           <w:szCs w:val="19"/>
         </w:rPr>
-        <w:t xml:space="preserve">Figure 19 — Journal des modifications, filtrable</w:t>
+        <w:t xml:space="preserve">Figure 19 — Parcours du candidat, vu avec son compte</w:t>
       </w:r>
     </w:p>
     <w:p>
@@ -4769,7 +4722,7 @@
           <w:sz w:val="26"/>
           <w:szCs w:val="26"/>
         </w:rPr>
-        <w:t xml:space="preserve">6.19 Synchronisation avec le serveur central</w:t>
+        <w:t xml:space="preserve">6.17 Impression</w:t>
       </w:r>
     </w:p>
     <w:p>
@@ -4782,7 +4735,7 @@
           <w:sz w:val="22"/>
           <w:szCs w:val="22"/>
         </w:rPr>
-        <w:t xml:space="preserve">L'application fonctionne entièrement hors ligne : la base locale est la source de vérité. Les résultats validés sont remontés à un serveur central de l'ATT quand le réseau le permet ; sinon ils restent en file d'attente, sans rien bloquer, et « Synchroniser maintenant » les renvoie plus tard. Sur la figure, le réseau est coupé par l'interrupteur de démonstration : un résultat attend, l'autre a déjà été envoyé.</w:t>
+        <w:t xml:space="preserve">Quatre documents s'impriment depuis l'application, sans réseau : la convocation individuelle avec l'heure de passage estimée et les pièces à apporter, la liste d'appel d'une session (avec ou sans noms selon le rôle), la liste des admis et le relevé de résultat. La page est produite en HTML, montrée en aperçu, puis confiée au service d'impression d'Android, qui permet aussi d'enregistrer un PDF.</w:t>
       </w:r>
     </w:p>
     <w:p>
@@ -4844,7 +4797,191 @@
           <w:sz w:val="19"/>
           <w:szCs w:val="19"/>
         </w:rPr>
-        <w:t xml:space="preserve">Figure 20 — Synchronisation : réseau coupé, un résultat en attente, un envoyé</w:t>
+        <w:t xml:space="preserve">Figure 20 — Relevé de résultat, prêt à imprimer</w:t>
+      </w:r>
+    </w:p>
+    <w:p>
+      <w:pPr>
+        <w:pStyle w:val="Heading2"/>
+        <w:spacing w:after="140" w:before="280"/>
+      </w:pPr>
+      <w:r>
+        <w:rPr>
+          <w:rFonts w:ascii="Calibri" w:cs="Calibri" w:eastAsia="Calibri" w:hAnsi="Calibri"/>
+          <w:b/>
+          <w:bCs/>
+          <w:color w:val="0B2E4F"/>
+          <w:sz w:val="26"/>
+          <w:szCs w:val="26"/>
+        </w:rPr>
+        <w:t xml:space="preserve">6.18 Historique</w:t>
+      </w:r>
+    </w:p>
+    <w:p>
+      <w:pPr>
+        <w:spacing w:after="120" w:line="300"/>
+      </w:pPr>
+      <w:r>
+        <w:rPr>
+          <w:rFonts w:ascii="Calibri" w:cs="Calibri" w:eastAsia="Calibri" w:hAnsi="Calibri"/>
+          <w:sz w:val="22"/>
+          <w:szCs w:val="22"/>
+        </w:rPr>
+        <w:t xml:space="preserve">Toute modification sensible est enregistrée avec son auteur, sa date, l'action, l'ancienne et la nouvelle valeur et le motif, dans la même transaction que la modification elle-même. L'historique se lit depuis chaque fiche et depuis un écran global, filtrable par période, par objet et par utilisateur.</w:t>
+      </w:r>
+    </w:p>
+    <w:p>
+      <w:pPr>
+        <w:jc w:val="center"/>
+      </w:pPr>
+      <w:r>
+        <w:drawing>
+          <wp:inline distT="0" distB="0" distL="0" distR="0">
+            <wp:extent cx="2524125" cy="4486275"/>
+            <wp:effectExtent t="0" r="0" b="0" l="0"/>
+            <wp:docPr id="1" name="" descr="" title=""/>
+            <wp:cNvGraphicFramePr>
+              <a:graphicFrameLocks xmlns:a="http://schemas.openxmlformats.org/drawingml/2006/main" noChangeAspect="1"/>
+            </wp:cNvGraphicFramePr>
+            <a:graphic xmlns:a="http://schemas.openxmlformats.org/drawingml/2006/main">
+              <a:graphicData uri="http://schemas.openxmlformats.org/drawingml/2006/picture">
+                <pic:pic xmlns:pic="http://schemas.openxmlformats.org/drawingml/2006/picture">
+                  <pic:nvPicPr>
+                    <pic:cNvPr id="0" name="" descr=""/>
+                    <pic:cNvPicPr>
+                      <a:picLocks noChangeAspect="1" noChangeArrowheads="1"/>
+                    </pic:cNvPicPr>
+                  </pic:nvPicPr>
+                  <pic:blipFill>
+                    <a:blip r:embed="rId31" cstate="none"/>
+                    <a:srcRect/>
+                    <a:stretch>
+                      <a:fillRect/>
+                    </a:stretch>
+                  </pic:blipFill>
+                  <pic:spPr bwMode="auto">
+                    <a:xfrm>
+                      <a:off x="0" y="0"/>
+                      <a:ext cx="2524125" cy="4486275"/>
+                    </a:xfrm>
+                    <a:prstGeom prst="rect">
+                      <a:avLst/>
+                    </a:prstGeom>
+                  </pic:spPr>
+                </pic:pic>
+              </a:graphicData>
+            </a:graphic>
+          </wp:inline>
+        </w:drawing>
+      </w:r>
+    </w:p>
+    <w:p>
+      <w:pPr>
+        <w:spacing w:after="240" w:before="80"/>
+        <w:jc w:val="center"/>
+      </w:pPr>
+      <w:r>
+        <w:rPr>
+          <w:rFonts w:ascii="Calibri" w:cs="Calibri" w:eastAsia="Calibri" w:hAnsi="Calibri"/>
+          <w:i/>
+          <w:iCs/>
+          <w:color w:val="5E6B7C"/>
+          <w:sz w:val="19"/>
+          <w:szCs w:val="19"/>
+        </w:rPr>
+        <w:t xml:space="preserve">Figure 21 — Journal des modifications, filtrable</w:t>
+      </w:r>
+    </w:p>
+    <w:p>
+      <w:pPr>
+        <w:pStyle w:val="Heading2"/>
+        <w:spacing w:after="140" w:before="280"/>
+      </w:pPr>
+      <w:r>
+        <w:rPr>
+          <w:rFonts w:ascii="Calibri" w:cs="Calibri" w:eastAsia="Calibri" w:hAnsi="Calibri"/>
+          <w:b/>
+          <w:bCs/>
+          <w:color w:val="0B2E4F"/>
+          <w:sz w:val="26"/>
+          <w:szCs w:val="26"/>
+        </w:rPr>
+        <w:t xml:space="preserve">6.19 Synchronisation avec le serveur central</w:t>
+      </w:r>
+    </w:p>
+    <w:p>
+      <w:pPr>
+        <w:spacing w:after="120" w:line="300"/>
+      </w:pPr>
+      <w:r>
+        <w:rPr>
+          <w:rFonts w:ascii="Calibri" w:cs="Calibri" w:eastAsia="Calibri" w:hAnsi="Calibri"/>
+          <w:sz w:val="22"/>
+          <w:szCs w:val="22"/>
+        </w:rPr>
+        <w:t xml:space="preserve">L'application fonctionne entièrement hors ligne : la base locale est la source de vérité. Les résultats validés sont remontés à un serveur central de l'ATT quand le réseau le permet ; sinon ils restent en file d'attente, sans rien bloquer, et « Synchroniser maintenant » les renvoie plus tard. Sur la figure, le réseau est coupé par l'interrupteur de démonstration : un résultat attend, l'autre a déjà été envoyé.</w:t>
+      </w:r>
+    </w:p>
+    <w:p>
+      <w:pPr>
+        <w:jc w:val="center"/>
+      </w:pPr>
+      <w:r>
+        <w:drawing>
+          <wp:inline distT="0" distB="0" distL="0" distR="0">
+            <wp:extent cx="2524125" cy="4486275"/>
+            <wp:effectExtent t="0" r="0" b="0" l="0"/>
+            <wp:docPr id="1" name="" descr="" title=""/>
+            <wp:cNvGraphicFramePr>
+              <a:graphicFrameLocks xmlns:a="http://schemas.openxmlformats.org/drawingml/2006/main" noChangeAspect="1"/>
+            </wp:cNvGraphicFramePr>
+            <a:graphic xmlns:a="http://schemas.openxmlformats.org/drawingml/2006/main">
+              <a:graphicData uri="http://schemas.openxmlformats.org/drawingml/2006/picture">
+                <pic:pic xmlns:pic="http://schemas.openxmlformats.org/drawingml/2006/picture">
+                  <pic:nvPicPr>
+                    <pic:cNvPr id="0" name="" descr=""/>
+                    <pic:cNvPicPr>
+                      <a:picLocks noChangeAspect="1" noChangeArrowheads="1"/>
+                    </pic:cNvPicPr>
+                  </pic:nvPicPr>
+                  <pic:blipFill>
+                    <a:blip r:embed="rId32" cstate="none"/>
+                    <a:srcRect/>
+                    <a:stretch>
+                      <a:fillRect/>
+                    </a:stretch>
+                  </pic:blipFill>
+                  <pic:spPr bwMode="auto">
+                    <a:xfrm>
+                      <a:off x="0" y="0"/>
+                      <a:ext cx="2524125" cy="4486275"/>
+                    </a:xfrm>
+                    <a:prstGeom prst="rect">
+                      <a:avLst/>
+                    </a:prstGeom>
+                  </pic:spPr>
+                </pic:pic>
+              </a:graphicData>
+            </a:graphic>
+          </wp:inline>
+        </w:drawing>
+      </w:r>
+    </w:p>
+    <w:p>
+      <w:pPr>
+        <w:spacing w:after="240" w:before="80"/>
+        <w:jc w:val="center"/>
+      </w:pPr>
+      <w:r>
+        <w:rPr>
+          <w:rFonts w:ascii="Calibri" w:cs="Calibri" w:eastAsia="Calibri" w:hAnsi="Calibri"/>
+          <w:i/>
+          <w:iCs/>
+          <w:color w:val="5E6B7C"/>
+          <w:sz w:val="19"/>
+          <w:szCs w:val="19"/>
+        </w:rPr>
+        <w:t xml:space="preserve">Figure 22 — Synchronisation : réseau coupé, un résultat en attente, un envoyé</w:t>
       </w:r>
     </w:p>
     <w:p>
@@ -7945,7 +8082,7 @@
           <w:sz w:val="22"/>
           <w:szCs w:val="22"/>
         </w:rPr>
-        <w:t xml:space="preserve">Au moment de la rédaction, 121 tests unitaires passent. Les classes de test, une par famille de règles :</w:t>
+        <w:t xml:space="preserve">Au moment de la rédaction, 127 tests unitaires passent. Les classes de test, une par famille de règles :</w:t>
       </w:r>
     </w:p>
     <w:p>

</xml_diff>

<commit_message>
Corrige l'affichage des images du rapport dans Word (identifiants d'images uniques)
</commit_message>
<xml_diff>
--- a/docs/rapport/Rapport_technique_ATT.docx
+++ b/docs/rapport/Rapport_technique_ATT.docx
@@ -3015,7 +3015,7 @@
           <wp:inline distT="0" distB="0" distL="0" distR="0">
             <wp:extent cx="2524125" cy="4486275"/>
             <wp:effectExtent t="0" r="0" b="0" l="0"/>
-            <wp:docPr id="1" name="" descr="" title=""/>
+            <wp:docPr id="1" name="Figure 1" descr="" title=""/>
             <wp:cNvGraphicFramePr>
               <a:graphicFrameLocks xmlns:a="http://schemas.openxmlformats.org/drawingml/2006/main" noChangeAspect="1"/>
             </wp:cNvGraphicFramePr>
@@ -3023,7 +3023,7 @@
               <a:graphicData uri="http://schemas.openxmlformats.org/drawingml/2006/picture">
                 <pic:pic xmlns:pic="http://schemas.openxmlformats.org/drawingml/2006/picture">
                   <pic:nvPicPr>
-                    <pic:cNvPr id="0" name="" descr=""/>
+                    <pic:cNvPr id="0" name="Image" descr=""/>
                     <pic:cNvPicPr>
                       <a:picLocks noChangeAspect="1" noChangeArrowheads="1"/>
                     </pic:cNvPicPr>
@@ -3138,7 +3138,7 @@
           <wp:inline distT="0" distB="0" distL="0" distR="0">
             <wp:extent cx="2524125" cy="4486275"/>
             <wp:effectExtent t="0" r="0" b="0" l="0"/>
-            <wp:docPr id="1" name="" descr="" title=""/>
+            <wp:docPr id="2" name="Figure 2" descr="" title=""/>
             <wp:cNvGraphicFramePr>
               <a:graphicFrameLocks xmlns:a="http://schemas.openxmlformats.org/drawingml/2006/main" noChangeAspect="1"/>
             </wp:cNvGraphicFramePr>
@@ -3146,7 +3146,7 @@
               <a:graphicData uri="http://schemas.openxmlformats.org/drawingml/2006/picture">
                 <pic:pic xmlns:pic="http://schemas.openxmlformats.org/drawingml/2006/picture">
                   <pic:nvPicPr>
-                    <pic:cNvPr id="0" name="" descr=""/>
+                    <pic:cNvPr id="0" name="Image" descr=""/>
                     <pic:cNvPicPr>
                       <a:picLocks noChangeAspect="1" noChangeArrowheads="1"/>
                     </pic:cNvPicPr>
@@ -3230,7 +3230,7 @@
           <wp:inline distT="0" distB="0" distL="0" distR="0">
             <wp:extent cx="2524125" cy="4486275"/>
             <wp:effectExtent t="0" r="0" b="0" l="0"/>
-            <wp:docPr id="1" name="" descr="" title=""/>
+            <wp:docPr id="3" name="Figure 3" descr="" title=""/>
             <wp:cNvGraphicFramePr>
               <a:graphicFrameLocks xmlns:a="http://schemas.openxmlformats.org/drawingml/2006/main" noChangeAspect="1"/>
             </wp:cNvGraphicFramePr>
@@ -3238,7 +3238,7 @@
               <a:graphicData uri="http://schemas.openxmlformats.org/drawingml/2006/picture">
                 <pic:pic xmlns:pic="http://schemas.openxmlformats.org/drawingml/2006/picture">
                   <pic:nvPicPr>
-                    <pic:cNvPr id="0" name="" descr=""/>
+                    <pic:cNvPr id="0" name="Image" descr=""/>
                     <pic:cNvPicPr>
                       <a:picLocks noChangeAspect="1" noChangeArrowheads="1"/>
                     </pic:cNvPicPr>
@@ -3322,7 +3322,7 @@
           <wp:inline distT="0" distB="0" distL="0" distR="0">
             <wp:extent cx="2524125" cy="4486275"/>
             <wp:effectExtent t="0" r="0" b="0" l="0"/>
-            <wp:docPr id="1" name="" descr="" title=""/>
+            <wp:docPr id="4" name="Figure 4" descr="" title=""/>
             <wp:cNvGraphicFramePr>
               <a:graphicFrameLocks xmlns:a="http://schemas.openxmlformats.org/drawingml/2006/main" noChangeAspect="1"/>
             </wp:cNvGraphicFramePr>
@@ -3330,7 +3330,7 @@
               <a:graphicData uri="http://schemas.openxmlformats.org/drawingml/2006/picture">
                 <pic:pic xmlns:pic="http://schemas.openxmlformats.org/drawingml/2006/picture">
                   <pic:nvPicPr>
-                    <pic:cNvPr id="0" name="" descr=""/>
+                    <pic:cNvPr id="0" name="Image" descr=""/>
                     <pic:cNvPicPr>
                       <a:picLocks noChangeAspect="1" noChangeArrowheads="1"/>
                     </pic:cNvPicPr>
@@ -3414,7 +3414,7 @@
           <wp:inline distT="0" distB="0" distL="0" distR="0">
             <wp:extent cx="2524125" cy="4486275"/>
             <wp:effectExtent t="0" r="0" b="0" l="0"/>
-            <wp:docPr id="1" name="" descr="" title=""/>
+            <wp:docPr id="5" name="Figure 5" descr="" title=""/>
             <wp:cNvGraphicFramePr>
               <a:graphicFrameLocks xmlns:a="http://schemas.openxmlformats.org/drawingml/2006/main" noChangeAspect="1"/>
             </wp:cNvGraphicFramePr>
@@ -3422,7 +3422,7 @@
               <a:graphicData uri="http://schemas.openxmlformats.org/drawingml/2006/picture">
                 <pic:pic xmlns:pic="http://schemas.openxmlformats.org/drawingml/2006/picture">
                   <pic:nvPicPr>
-                    <pic:cNvPr id="0" name="" descr=""/>
+                    <pic:cNvPr id="0" name="Image" descr=""/>
                     <pic:cNvPicPr>
                       <a:picLocks noChangeAspect="1" noChangeArrowheads="1"/>
                     </pic:cNvPicPr>
@@ -3506,7 +3506,7 @@
           <wp:inline distT="0" distB="0" distL="0" distR="0">
             <wp:extent cx="2524125" cy="4486275"/>
             <wp:effectExtent t="0" r="0" b="0" l="0"/>
-            <wp:docPr id="1" name="" descr="" title=""/>
+            <wp:docPr id="6" name="Figure 6" descr="" title=""/>
             <wp:cNvGraphicFramePr>
               <a:graphicFrameLocks xmlns:a="http://schemas.openxmlformats.org/drawingml/2006/main" noChangeAspect="1"/>
             </wp:cNvGraphicFramePr>
@@ -3514,7 +3514,7 @@
               <a:graphicData uri="http://schemas.openxmlformats.org/drawingml/2006/picture">
                 <pic:pic xmlns:pic="http://schemas.openxmlformats.org/drawingml/2006/picture">
                   <pic:nvPicPr>
-                    <pic:cNvPr id="0" name="" descr=""/>
+                    <pic:cNvPr id="0" name="Image" descr=""/>
                     <pic:cNvPicPr>
                       <a:picLocks noChangeAspect="1" noChangeArrowheads="1"/>
                     </pic:cNvPicPr>
@@ -3598,7 +3598,7 @@
           <wp:inline distT="0" distB="0" distL="0" distR="0">
             <wp:extent cx="2524125" cy="4486275"/>
             <wp:effectExtent t="0" r="0" b="0" l="0"/>
-            <wp:docPr id="1" name="" descr="" title=""/>
+            <wp:docPr id="7" name="Figure 7" descr="" title=""/>
             <wp:cNvGraphicFramePr>
               <a:graphicFrameLocks xmlns:a="http://schemas.openxmlformats.org/drawingml/2006/main" noChangeAspect="1"/>
             </wp:cNvGraphicFramePr>
@@ -3606,7 +3606,7 @@
               <a:graphicData uri="http://schemas.openxmlformats.org/drawingml/2006/picture">
                 <pic:pic xmlns:pic="http://schemas.openxmlformats.org/drawingml/2006/picture">
                   <pic:nvPicPr>
-                    <pic:cNvPr id="0" name="" descr=""/>
+                    <pic:cNvPr id="0" name="Image" descr=""/>
                     <pic:cNvPicPr>
                       <a:picLocks noChangeAspect="1" noChangeArrowheads="1"/>
                     </pic:cNvPicPr>
@@ -3673,7 +3673,7 @@
           <wp:inline distT="0" distB="0" distL="0" distR="0">
             <wp:extent cx="2524125" cy="4486275"/>
             <wp:effectExtent t="0" r="0" b="0" l="0"/>
-            <wp:docPr id="1" name="" descr="" title=""/>
+            <wp:docPr id="8" name="Figure 8" descr="" title=""/>
             <wp:cNvGraphicFramePr>
               <a:graphicFrameLocks xmlns:a="http://schemas.openxmlformats.org/drawingml/2006/main" noChangeAspect="1"/>
             </wp:cNvGraphicFramePr>
@@ -3681,7 +3681,7 @@
               <a:graphicData uri="http://schemas.openxmlformats.org/drawingml/2006/picture">
                 <pic:pic xmlns:pic="http://schemas.openxmlformats.org/drawingml/2006/picture">
                   <pic:nvPicPr>
-                    <pic:cNvPr id="0" name="" descr=""/>
+                    <pic:cNvPr id="0" name="Image" descr=""/>
                     <pic:cNvPicPr>
                       <a:picLocks noChangeAspect="1" noChangeArrowheads="1"/>
                     </pic:cNvPicPr>
@@ -3735,7 +3735,7 @@
           <wp:inline distT="0" distB="0" distL="0" distR="0">
             <wp:extent cx="2524125" cy="4486275"/>
             <wp:effectExtent t="0" r="0" b="0" l="0"/>
-            <wp:docPr id="1" name="" descr="" title=""/>
+            <wp:docPr id="9" name="Figure 9" descr="" title=""/>
             <wp:cNvGraphicFramePr>
               <a:graphicFrameLocks xmlns:a="http://schemas.openxmlformats.org/drawingml/2006/main" noChangeAspect="1"/>
             </wp:cNvGraphicFramePr>
@@ -3743,7 +3743,7 @@
               <a:graphicData uri="http://schemas.openxmlformats.org/drawingml/2006/picture">
                 <pic:pic xmlns:pic="http://schemas.openxmlformats.org/drawingml/2006/picture">
                   <pic:nvPicPr>
-                    <pic:cNvPr id="0" name="" descr=""/>
+                    <pic:cNvPr id="0" name="Image" descr=""/>
                     <pic:cNvPicPr>
                       <a:picLocks noChangeAspect="1" noChangeArrowheads="1"/>
                     </pic:cNvPicPr>
@@ -3827,7 +3827,7 @@
           <wp:inline distT="0" distB="0" distL="0" distR="0">
             <wp:extent cx="2524125" cy="4486275"/>
             <wp:effectExtent t="0" r="0" b="0" l="0"/>
-            <wp:docPr id="1" name="" descr="" title=""/>
+            <wp:docPr id="10" name="Figure 10" descr="" title=""/>
             <wp:cNvGraphicFramePr>
               <a:graphicFrameLocks xmlns:a="http://schemas.openxmlformats.org/drawingml/2006/main" noChangeAspect="1"/>
             </wp:cNvGraphicFramePr>
@@ -3835,7 +3835,7 @@
               <a:graphicData uri="http://schemas.openxmlformats.org/drawingml/2006/picture">
                 <pic:pic xmlns:pic="http://schemas.openxmlformats.org/drawingml/2006/picture">
                   <pic:nvPicPr>
-                    <pic:cNvPr id="0" name="" descr=""/>
+                    <pic:cNvPr id="0" name="Image" descr=""/>
                     <pic:cNvPicPr>
                       <a:picLocks noChangeAspect="1" noChangeArrowheads="1"/>
                     </pic:cNvPicPr>
@@ -3919,7 +3919,7 @@
           <wp:inline distT="0" distB="0" distL="0" distR="0">
             <wp:extent cx="2524125" cy="4486275"/>
             <wp:effectExtent t="0" r="0" b="0" l="0"/>
-            <wp:docPr id="1" name="" descr="" title=""/>
+            <wp:docPr id="11" name="Figure 11" descr="" title=""/>
             <wp:cNvGraphicFramePr>
               <a:graphicFrameLocks xmlns:a="http://schemas.openxmlformats.org/drawingml/2006/main" noChangeAspect="1"/>
             </wp:cNvGraphicFramePr>
@@ -3927,7 +3927,7 @@
               <a:graphicData uri="http://schemas.openxmlformats.org/drawingml/2006/picture">
                 <pic:pic xmlns:pic="http://schemas.openxmlformats.org/drawingml/2006/picture">
                   <pic:nvPicPr>
-                    <pic:cNvPr id="0" name="" descr=""/>
+                    <pic:cNvPr id="0" name="Image" descr=""/>
                     <pic:cNvPicPr>
                       <a:picLocks noChangeAspect="1" noChangeArrowheads="1"/>
                     </pic:cNvPicPr>
@@ -4011,7 +4011,7 @@
           <wp:inline distT="0" distB="0" distL="0" distR="0">
             <wp:extent cx="2524125" cy="4486275"/>
             <wp:effectExtent t="0" r="0" b="0" l="0"/>
-            <wp:docPr id="1" name="" descr="" title=""/>
+            <wp:docPr id="12" name="Figure 12" descr="" title=""/>
             <wp:cNvGraphicFramePr>
               <a:graphicFrameLocks xmlns:a="http://schemas.openxmlformats.org/drawingml/2006/main" noChangeAspect="1"/>
             </wp:cNvGraphicFramePr>
@@ -4019,7 +4019,7 @@
               <a:graphicData uri="http://schemas.openxmlformats.org/drawingml/2006/picture">
                 <pic:pic xmlns:pic="http://schemas.openxmlformats.org/drawingml/2006/picture">
                   <pic:nvPicPr>
-                    <pic:cNvPr id="0" name="" descr=""/>
+                    <pic:cNvPr id="0" name="Image" descr=""/>
                     <pic:cNvPicPr>
                       <a:picLocks noChangeAspect="1" noChangeArrowheads="1"/>
                     </pic:cNvPicPr>
@@ -4103,7 +4103,7 @@
           <wp:inline distT="0" distB="0" distL="0" distR="0">
             <wp:extent cx="2524125" cy="4486275"/>
             <wp:effectExtent t="0" r="0" b="0" l="0"/>
-            <wp:docPr id="1" name="" descr="" title=""/>
+            <wp:docPr id="13" name="Figure 13" descr="" title=""/>
             <wp:cNvGraphicFramePr>
               <a:graphicFrameLocks xmlns:a="http://schemas.openxmlformats.org/drawingml/2006/main" noChangeAspect="1"/>
             </wp:cNvGraphicFramePr>
@@ -4111,7 +4111,7 @@
               <a:graphicData uri="http://schemas.openxmlformats.org/drawingml/2006/picture">
                 <pic:pic xmlns:pic="http://schemas.openxmlformats.org/drawingml/2006/picture">
                   <pic:nvPicPr>
-                    <pic:cNvPr id="0" name="" descr=""/>
+                    <pic:cNvPr id="0" name="Image" descr=""/>
                     <pic:cNvPicPr>
                       <a:picLocks noChangeAspect="1" noChangeArrowheads="1"/>
                     </pic:cNvPicPr>
@@ -4195,7 +4195,7 @@
           <wp:inline distT="0" distB="0" distL="0" distR="0">
             <wp:extent cx="2524125" cy="4486275"/>
             <wp:effectExtent t="0" r="0" b="0" l="0"/>
-            <wp:docPr id="1" name="" descr="" title=""/>
+            <wp:docPr id="14" name="Figure 14" descr="" title=""/>
             <wp:cNvGraphicFramePr>
               <a:graphicFrameLocks xmlns:a="http://schemas.openxmlformats.org/drawingml/2006/main" noChangeAspect="1"/>
             </wp:cNvGraphicFramePr>
@@ -4203,7 +4203,7 @@
               <a:graphicData uri="http://schemas.openxmlformats.org/drawingml/2006/picture">
                 <pic:pic xmlns:pic="http://schemas.openxmlformats.org/drawingml/2006/picture">
                   <pic:nvPicPr>
-                    <pic:cNvPr id="0" name="" descr=""/>
+                    <pic:cNvPr id="0" name="Image" descr=""/>
                     <pic:cNvPicPr>
                       <a:picLocks noChangeAspect="1" noChangeArrowheads="1"/>
                     </pic:cNvPicPr>
@@ -4287,7 +4287,7 @@
           <wp:inline distT="0" distB="0" distL="0" distR="0">
             <wp:extent cx="2524125" cy="4486275"/>
             <wp:effectExtent t="0" r="0" b="0" l="0"/>
-            <wp:docPr id="1" name="" descr="" title=""/>
+            <wp:docPr id="15" name="Figure 15" descr="" title=""/>
             <wp:cNvGraphicFramePr>
               <a:graphicFrameLocks xmlns:a="http://schemas.openxmlformats.org/drawingml/2006/main" noChangeAspect="1"/>
             </wp:cNvGraphicFramePr>
@@ -4295,7 +4295,7 @@
               <a:graphicData uri="http://schemas.openxmlformats.org/drawingml/2006/picture">
                 <pic:pic xmlns:pic="http://schemas.openxmlformats.org/drawingml/2006/picture">
                   <pic:nvPicPr>
-                    <pic:cNvPr id="0" name="" descr=""/>
+                    <pic:cNvPr id="0" name="Image" descr=""/>
                     <pic:cNvPicPr>
                       <a:picLocks noChangeAspect="1" noChangeArrowheads="1"/>
                     </pic:cNvPicPr>
@@ -4379,7 +4379,7 @@
           <wp:inline distT="0" distB="0" distL="0" distR="0">
             <wp:extent cx="2524125" cy="4486275"/>
             <wp:effectExtent t="0" r="0" b="0" l="0"/>
-            <wp:docPr id="1" name="" descr="" title=""/>
+            <wp:docPr id="16" name="Figure 16" descr="" title=""/>
             <wp:cNvGraphicFramePr>
               <a:graphicFrameLocks xmlns:a="http://schemas.openxmlformats.org/drawingml/2006/main" noChangeAspect="1"/>
             </wp:cNvGraphicFramePr>
@@ -4387,7 +4387,7 @@
               <a:graphicData uri="http://schemas.openxmlformats.org/drawingml/2006/picture">
                 <pic:pic xmlns:pic="http://schemas.openxmlformats.org/drawingml/2006/picture">
                   <pic:nvPicPr>
-                    <pic:cNvPr id="0" name="" descr=""/>
+                    <pic:cNvPr id="0" name="Image" descr=""/>
                     <pic:cNvPicPr>
                       <a:picLocks noChangeAspect="1" noChangeArrowheads="1"/>
                     </pic:cNvPicPr>
@@ -4471,7 +4471,7 @@
           <wp:inline distT="0" distB="0" distL="0" distR="0">
             <wp:extent cx="2524125" cy="4486275"/>
             <wp:effectExtent t="0" r="0" b="0" l="0"/>
-            <wp:docPr id="1" name="" descr="" title=""/>
+            <wp:docPr id="17" name="Figure 17" descr="" title=""/>
             <wp:cNvGraphicFramePr>
               <a:graphicFrameLocks xmlns:a="http://schemas.openxmlformats.org/drawingml/2006/main" noChangeAspect="1"/>
             </wp:cNvGraphicFramePr>
@@ -4479,7 +4479,7 @@
               <a:graphicData uri="http://schemas.openxmlformats.org/drawingml/2006/picture">
                 <pic:pic xmlns:pic="http://schemas.openxmlformats.org/drawingml/2006/picture">
                   <pic:nvPicPr>
-                    <pic:cNvPr id="0" name="" descr=""/>
+                    <pic:cNvPr id="0" name="Image" descr=""/>
                     <pic:cNvPicPr>
                       <a:picLocks noChangeAspect="1" noChangeArrowheads="1"/>
                     </pic:cNvPicPr>
@@ -4563,7 +4563,7 @@
           <wp:inline distT="0" distB="0" distL="0" distR="0">
             <wp:extent cx="2524125" cy="4486275"/>
             <wp:effectExtent t="0" r="0" b="0" l="0"/>
-            <wp:docPr id="1" name="" descr="" title=""/>
+            <wp:docPr id="18" name="Figure 18" descr="" title=""/>
             <wp:cNvGraphicFramePr>
               <a:graphicFrameLocks xmlns:a="http://schemas.openxmlformats.org/drawingml/2006/main" noChangeAspect="1"/>
             </wp:cNvGraphicFramePr>
@@ -4571,7 +4571,7 @@
               <a:graphicData uri="http://schemas.openxmlformats.org/drawingml/2006/picture">
                 <pic:pic xmlns:pic="http://schemas.openxmlformats.org/drawingml/2006/picture">
                   <pic:nvPicPr>
-                    <pic:cNvPr id="0" name="" descr=""/>
+                    <pic:cNvPr id="0" name="Image" descr=""/>
                     <pic:cNvPicPr>
                       <a:picLocks noChangeAspect="1" noChangeArrowheads="1"/>
                     </pic:cNvPicPr>
@@ -4655,7 +4655,7 @@
           <wp:inline distT="0" distB="0" distL="0" distR="0">
             <wp:extent cx="2524125" cy="4486275"/>
             <wp:effectExtent t="0" r="0" b="0" l="0"/>
-            <wp:docPr id="1" name="" descr="" title=""/>
+            <wp:docPr id="19" name="Figure 19" descr="" title=""/>
             <wp:cNvGraphicFramePr>
               <a:graphicFrameLocks xmlns:a="http://schemas.openxmlformats.org/drawingml/2006/main" noChangeAspect="1"/>
             </wp:cNvGraphicFramePr>
@@ -4663,7 +4663,7 @@
               <a:graphicData uri="http://schemas.openxmlformats.org/drawingml/2006/picture">
                 <pic:pic xmlns:pic="http://schemas.openxmlformats.org/drawingml/2006/picture">
                   <pic:nvPicPr>
-                    <pic:cNvPr id="0" name="" descr=""/>
+                    <pic:cNvPr id="0" name="Image" descr=""/>
                     <pic:cNvPicPr>
                       <a:picLocks noChangeAspect="1" noChangeArrowheads="1"/>
                     </pic:cNvPicPr>
@@ -4747,7 +4747,7 @@
           <wp:inline distT="0" distB="0" distL="0" distR="0">
             <wp:extent cx="2524125" cy="4486275"/>
             <wp:effectExtent t="0" r="0" b="0" l="0"/>
-            <wp:docPr id="1" name="" descr="" title=""/>
+            <wp:docPr id="20" name="Figure 20" descr="" title=""/>
             <wp:cNvGraphicFramePr>
               <a:graphicFrameLocks xmlns:a="http://schemas.openxmlformats.org/drawingml/2006/main" noChangeAspect="1"/>
             </wp:cNvGraphicFramePr>
@@ -4755,7 +4755,7 @@
               <a:graphicData uri="http://schemas.openxmlformats.org/drawingml/2006/picture">
                 <pic:pic xmlns:pic="http://schemas.openxmlformats.org/drawingml/2006/picture">
                   <pic:nvPicPr>
-                    <pic:cNvPr id="0" name="" descr=""/>
+                    <pic:cNvPr id="0" name="Image" descr=""/>
                     <pic:cNvPicPr>
                       <a:picLocks noChangeAspect="1" noChangeArrowheads="1"/>
                     </pic:cNvPicPr>
@@ -4839,7 +4839,7 @@
           <wp:inline distT="0" distB="0" distL="0" distR="0">
             <wp:extent cx="2524125" cy="4486275"/>
             <wp:effectExtent t="0" r="0" b="0" l="0"/>
-            <wp:docPr id="1" name="" descr="" title=""/>
+            <wp:docPr id="21" name="Figure 21" descr="" title=""/>
             <wp:cNvGraphicFramePr>
               <a:graphicFrameLocks xmlns:a="http://schemas.openxmlformats.org/drawingml/2006/main" noChangeAspect="1"/>
             </wp:cNvGraphicFramePr>
@@ -4847,7 +4847,7 @@
               <a:graphicData uri="http://schemas.openxmlformats.org/drawingml/2006/picture">
                 <pic:pic xmlns:pic="http://schemas.openxmlformats.org/drawingml/2006/picture">
                   <pic:nvPicPr>
-                    <pic:cNvPr id="0" name="" descr=""/>
+                    <pic:cNvPr id="0" name="Image" descr=""/>
                     <pic:cNvPicPr>
                       <a:picLocks noChangeAspect="1" noChangeArrowheads="1"/>
                     </pic:cNvPicPr>
@@ -4931,7 +4931,7 @@
           <wp:inline distT="0" distB="0" distL="0" distR="0">
             <wp:extent cx="2524125" cy="4486275"/>
             <wp:effectExtent t="0" r="0" b="0" l="0"/>
-            <wp:docPr id="1" name="" descr="" title=""/>
+            <wp:docPr id="22" name="Figure 22" descr="" title=""/>
             <wp:cNvGraphicFramePr>
               <a:graphicFrameLocks xmlns:a="http://schemas.openxmlformats.org/drawingml/2006/main" noChangeAspect="1"/>
             </wp:cNvGraphicFramePr>
@@ -4939,7 +4939,7 @@
               <a:graphicData uri="http://schemas.openxmlformats.org/drawingml/2006/picture">
                 <pic:pic xmlns:pic="http://schemas.openxmlformats.org/drawingml/2006/picture">
                   <pic:nvPicPr>
-                    <pic:cNvPr id="0" name="" descr=""/>
+                    <pic:cNvPr id="0" name="Image" descr=""/>
                     <pic:cNvPicPr>
                       <a:picLocks noChangeAspect="1" noChangeArrowheads="1"/>
                     </pic:cNvPicPr>

</xml_diff>

<commit_message>
Corrige le rapport après la relecture finale : nombre de tests, barème initial, formulations
</commit_message>
<xml_diff>
--- a/docs/rapport/Rapport_technique_ATT.docx
+++ b/docs/rapport/Rapport_technique_ATT.docx
@@ -1547,7 +1547,7 @@
           <w:sz w:val="22"/>
           <w:szCs w:val="22"/>
         </w:rPr>
-        <w:t xml:space="preserve">Application Android native, hors ligne, base locale : aucune dépendance à un serveur.</w:t>
+        <w:t xml:space="preserve">Application Android native, base locale : aucun serveur n'est nécessaire pour fonctionner.</w:t>
       </w:r>
     </w:p>
     <w:p>
@@ -9877,7 +9877,7 @@
           <w:sz w:val="22"/>
           <w:szCs w:val="22"/>
         </w:rPr>
-        <w:t xml:space="preserve">Au moment de la rédaction, 127 tests unitaires passent, lancés par ./gradlew :app:testDebugUnitTest. Les classes de test :</w:t>
+        <w:t xml:space="preserve">Au moment de la rédaction, 126 tests unitaires passent, lancés par ./gradlew :app:testDebugUnitTest. Les classes de test :</w:t>
       </w:r>
     </w:p>
     <w:p>
@@ -10299,7 +10299,7 @@
           <w:sz w:val="22"/>
           <w:szCs w:val="22"/>
         </w:rPr>
-        <w:t xml:space="preserve">Ce que ces tests couvrent, et ce qu'ils ne couvrent pas : ils portent sur les règles pures de metier/ et sur le hachage des mots de passe. Les ViewModels, les DAO et les écrans ne sont pas testés automatiquement : les requêtes des DAO reposent sur la vérification du SQL à la compilation par Room, et les écrans ont été vérifiés à la main sur l'émulateur, avec un script (outils/pilote_emulateur.sh) qui enchaîne les actions par le texte des boutons et rejoue chaque scénario à l'identique ; les dix contraintes du cadrage ont chacune leur scénario dans docs/COMPTES_RENDUS.md. Les tests unitaires ne font pas partie du programme de ce module ; nous les avons introduits parce qu'ils sont le seul moyen de prouver un calcul de barème sans téléphone.</w:t>
+        <w:t xml:space="preserve">Ce que ces tests couvrent, et ce qu'ils ne couvrent pas : ils portent sur les règles pures de metier/, sur le hachage des mots de passe et sur le menu par rôle (MenuParRoleTest). Les ViewModels, les DAO et les écrans ne sont pas testés automatiquement : les requêtes des DAO reposent sur la vérification du SQL à la compilation par Room, et les écrans ont été vérifiés à la main sur l'émulateur, avec un script (outils/pilote_emulateur.sh) qui enchaîne les actions par le texte des boutons et rejoue chaque scénario à l'identique ; les dix contraintes du cadrage ont chacune leur scénario dans docs/COMPTES_RENDUS.md. Les tests unitaires ne font pas partie du programme de ce module ; nous les avons introduits parce qu'ils sont le seul moyen de prouver un calcul de barème sans téléphone.</w:t>
       </w:r>
     </w:p>
     <w:p>
@@ -11022,7 +11022,7 @@
           <w:sz w:val="22"/>
           <w:szCs w:val="22"/>
         </w:rPr>
-        <w:t xml:space="preserve">La proportion : l'IA a produit la majorité du code de chaque étape à partir de nos documents de cadrage (règles, plan, modèle de données, cas d'utilisation), que nous avons écrits et validés avant la première ligne. Nous avons relu chaque fichier dans la demande de fusion (pull request) de l'étape avant fusion, et rejoué chaque scénario sur l'émulateur. Le journal du dépôt (JOURNAL-IA.md) consigne pour chaque étape ce qui a été soumis, la remarque principale de l'IA, les points d'alerte, et notre verdict.</w:t>
+        <w:t xml:space="preserve">La proportion : l'IA a produit la majorité du code de chaque étape à partir de nos documents de cadrage (règles, plan, modèle de données, cas d'utilisation), que nous avons écrits et validés avant la première ligne. Nous avons relu chaque fichier dans la demande de fusion (pull request) de l'étape avant de la fusionner, et rejoué chaque scénario sur l'émulateur. Le journal du dépôt (JOURNAL-IA.md) consigne pour chaque étape ce qui a été soumis, la remarque principale de l'IA, les points d'alerte, et notre verdict.</w:t>
       </w:r>
     </w:p>
     <w:p>
@@ -12898,7 +12898,7 @@
                 <w:sz w:val="20"/>
                 <w:szCs w:val="20"/>
               </w:rPr>
-              <w:t xml:space="preserve">Vingt-quatre entités avec clés étrangères et index, requêtes Flow combinées par combine puis stateIn ; la base locale est la seule source ; les résultats validés portent un drapeau synchronisee et sont remontés au serveur central par une file d'attente, sur le modèle de la démonstration du cours (différences en 7.5)</w:t>
+              <w:t xml:space="preserve">24 entités avec clés étrangères et index, requêtes Flow combinées par combine puis stateIn ; la base locale est la seule source ; les résultats validés portent un drapeau synchronisee et sont remontés au serveur central par une file d'attente, sur le modèle de la démonstration du cours (différences en 7.5)</w:t>
             </w:r>
           </w:p>
         </w:tc>
@@ -17298,6 +17298,19 @@
     </w:p>
     <w:p>
       <w:pPr>
+        <w:spacing w:after="120" w:line="300"/>
+      </w:pPr>
+      <w:r>
+        <w:rPr>
+          <w:rFonts w:ascii="Calibri" w:cs="Calibri" w:eastAsia="Calibri" w:hAnsi="Calibri"/>
+          <w:sz w:val="22"/>
+          <w:szCs w:val="22"/>
+        </w:rPr>
+        <w:t xml:space="preserve">Extrait simplifié de AppelViewModel (la version réelle vérifie d'abord le statut de la session et de la présence).</w:t>
+      </w:r>
+    </w:p>
+    <w:p>
+      <w:pPr>
         <w:shd w:fill="F3F6FA" w:color="auto" w:val="clear"/>
         <w:spacing w:after="0" w:line="260"/>
         <w:ind w:left="200" w:right="200"/>
@@ -20162,7 +20175,7 @@
           <w:sz w:val="22"/>
           <w:szCs w:val="22"/>
         </w:rPr>
-        <w:t xml:space="preserve">Comptes disponibles au premier lancement d'une version de développement, rappelés sur l'écran de connexion avec un bouton par rôle ; les trois derniers n'existent pas dans la version livrée, et les deux premiers y ont un mot de passe initial à changer dès la première connexion.</w:t>
+        <w:t xml:space="preserve">Comptes disponibles au premier lancement d'une version de développement, rappelés sur l'écran de connexion avec un bouton par rôle ; les trois derniers n'existent pas dans la version livrée, et les deux premiers y ont un mot de passe initial documenté, qu'il faut changer soi-même : l'application ne l'impose pas encore (13.1).</w:t>
       </w:r>
     </w:p>
     <w:tbl>
@@ -20806,7 +20819,7 @@
                 <w:sz w:val="20"/>
                 <w:szCs w:val="20"/>
               </w:rPr>
-              <w:t xml:space="preserve">Orale (témoignage) ; questions à points variables ; barème d'exemple 20 / 12</w:t>
+              <w:t xml:space="preserve">Orale (témoignage) ; questions à points variables ; barème d'exemple 30 / 20 dans les données initiales, remplacé par une version 2 à 20 / 12 pendant la démonstration (figure de 6.2)</w:t>
             </w:r>
           </w:p>
         </w:tc>

</xml_diff>

<commit_message>
Recentre l'annexe G du rapport sur les entrées 10, 12 et 20 du journal et corrige la conclusion
</commit_message>
<xml_diff>
--- a/docs/rapport/Rapport_technique_ATT.docx
+++ b/docs/rapport/Rapport_technique_ATT.docx
@@ -13862,7 +13862,7 @@
           <w:sz w:val="22"/>
           <w:szCs w:val="22"/>
         </w:rPr>
-        <w:t xml:space="preserve">Il faut aussi être honnêtes : ce que nous livrons est le minimum qu'un projet universitaire, mené en quatre jours à deux, pouvait atteindre. Il pourrait être tellement mieux. Les barèmes et la grille de conduite sont des exemples ; le serveur est simulé et tout tient sur un seul appareil ; les photos des pièces ne sont pas chiffrées ; l'interface mériterait d'être testée avec de vrais agents dans un vrai centre. Aucune de ces limites n'est un mur : chacune est nommée au chapitre 13, et l'architecture a été pensée pour les accueillir sans tout reprendre.</w:t>
+        <w:t xml:space="preserve">Il faut aussi être honnêtes : ce que nous livrons est le minimum qu'un projet universitaire, mené en quatre jours à deux, pouvait atteindre. Il peut être largement amélioré. Les barèmes et la grille de conduite sont des exemples ; le serveur est simulé et tout tient sur un seul appareil ; les photos des pièces ne sont pas chiffrées ; l'interface mériterait d'être testée avec de vrais agents dans un vrai centre. Aucune de ces limites n'est un mur : chacune est nommée au chapitre 13, et l'architecture a été pensée pour les accueillir sans tout reprendre.</w:t>
       </w:r>
     </w:p>
     <w:p>
@@ -21624,7 +21624,7 @@
           <w:sz w:val="22"/>
           <w:szCs w:val="22"/>
         </w:rPr>
-        <w:t xml:space="preserve">Le journal complet est le fichier JOURNAL-IA.md du dépôt. Les trois entrées ci-dessous, recopiées sans retouche, correspondent aux refus et corrections cités au chapitre 10.</w:t>
+        <w:t xml:space="preserve">Le journal complet est le fichier JOURNAL-IA.md du dépôt. Les trois entrées ci-dessous sont recopiées sans retouche : la contradiction entre un index SQL et une règle métier (chapitre 10), le passage du QCM à l'épreuve orale sur un témoignage de terrain (chapitres 2 et 10), et la reprise de la démonstration du cours pour la synchronisation (chapitres 7.5 et 12).</w:t>
       </w:r>
     </w:p>
     <w:p>
@@ -21641,7 +21641,7 @@
           <w:sz w:val="23"/>
           <w:szCs w:val="23"/>
         </w:rPr>
-        <w:t xml:space="preserve">Entrée 2 — 15/09/2026 — Étape B0, configuration Gradle</w:t>
+        <w:t xml:space="preserve">Entrée 10 — 16/09/2026 — Étape C7, présence et appel</w:t>
       </w:r>
     </w:p>
     <w:p>
@@ -21654,7 +21654,7 @@
           <w:sz w:val="20"/>
           <w:szCs w:val="20"/>
         </w:rPr>
-        <w:t xml:space="preserve">- Code soumis : gradle/libs.versions.toml, build.gradle.kts, app/build.gradle.kts (écrits par l'IA).</w:t>
+        <w:t xml:space="preserve">- Code soumis : metier/ReglesPresence.kt, ui/appel/*, schéma v2 des inscriptions.</w:t>
       </w:r>
     </w:p>
     <w:p>
@@ -21667,7 +21667,7 @@
           <w:sz w:val="20"/>
           <w:szCs w:val="20"/>
         </w:rPr>
-        <w:t xml:space="preserve">- Remarque principale de l'IA : avec AGP 9, ne pas déclarer le plugin org.jetbrains.kotlin.android ni kotlinOptions ; aligner le plugin Compose sur la version Kotlin embarquée (2.2.10) et utiliser KSP plutôt que kapt.</w:t>
+        <w:t xml:space="preserve">- Remarque principale de l'IA : la vérification sur émulateur a révélé un vrai défaut de conception, pas un bug de frappe : l'index unique (candidat, session) en base contredisait la règle métier « une inscription reportée ou annulée peut être suivie d'une nouvelle ». Le test unitaire de la règle passait ; seule la base réelle a montré la contradiction. Leçon pour le binôme : les invariants qui dépendent d'un statut ne se mettent pas dans un index SQL, mais dans une fonction pure.</w:t>
       </w:r>
     </w:p>
     <w:p>
@@ -21680,7 +21680,7 @@
           <w:sz w:val="20"/>
           <w:szCs w:val="20"/>
         </w:rPr>
-        <w:t xml:space="preserve">⚠️ L'IA avait d'abord proposé KSP 2.2.10-2.0.2 (version citée par la documentation AGP 9.0). Le build a échoué : « Using kotlin.sourceSets DSL to add Kotlin sources is not allowed with built-in Kotlin ». Correction : KSP 2.3.12, versionné indépendamment de Kotlin.</w:t>
+        <w:t xml:space="preserve">⚠️ La correction change le schéma (v2) avec fallbackToDestructiveMigration : les données de test de l'émulateur sont perdues, ce qui est accepté en développement (docs/01 §7) ; le pilote a rejoué toute la chaîne depuis une base vide en une passe.</w:t>
       </w:r>
     </w:p>
     <w:p>
@@ -21693,7 +21693,7 @@
           <w:sz w:val="20"/>
           <w:szCs w:val="20"/>
         </w:rPr>
-        <w:t xml:space="preserve">✅ Les versions des bibliothèques ont été vérifiées sur les dépôts Maven avant d'être écrites (aucune version inventée).</w:t>
+        <w:t xml:space="preserve">⚠️ L'horloge de l'émulateur (19 h) fait classer tout « Présent » en retard pour une convocation à 08:00 : ce n'est pas une anomalie, c'est la règle. Le scénario a donc exercé le chemin « retard accepté » plutôt que « présent direct ».</w:t>
       </w:r>
     </w:p>
     <w:p>
@@ -21706,7 +21706,7 @@
           <w:sz w:val="20"/>
           <w:szCs w:val="20"/>
         </w:rPr>
-        <w:t xml:space="preserve">- Mon verdict (accepte / rejette / nuance) et pourquoi : &lt;à compléter par le dev 1 : vérifier soi-même l'erreur en remettant KSP 2.2.10-2.0.2 et en relançant le build, pour pouvoir l'expliquer sans IA&gt;.</w:t>
+        <w:t xml:space="preserve">⚠️ Deux perturbations sans lien avec le code : des projets du cours lancés sur le même émulateur passaient devant ATT ; puis l'émulateur a été fermé et relancé par l'IA. Le pilote vérifie désormais qu'ATT est au premier plan avant chaque action.</w:t>
       </w:r>
     </w:p>
     <w:p>
@@ -21723,7 +21723,7 @@
           <w:sz w:val="23"/>
           <w:szCs w:val="23"/>
         </w:rPr>
-        <w:t xml:space="preserve">Entrée 10 — 16/09/2026 — Étape C7, présence et appel</w:t>
+        <w:t xml:space="preserve">Entrée 12 — 17/09/2026 — Étape C9, évaluation théorique</w:t>
       </w:r>
     </w:p>
     <w:p>
@@ -21736,7 +21736,7 @@
           <w:sz w:val="20"/>
           <w:szCs w:val="20"/>
         </w:rPr>
-        <w:t xml:space="preserve">- Code soumis : metier/ReglesPresence.kt, ui/appel/*, schéma v2 des inscriptions.</w:t>
+        <w:t xml:space="preserve">- Code soumis : metier/ReglesTheorie.kt, ui/evaluation/EvaluationTheorieViewModel.kt, EcranEvaluationTheorie.kt, schéma v3.</w:t>
       </w:r>
     </w:p>
     <w:p>
@@ -21749,7 +21749,7 @@
           <w:sz w:val="20"/>
           <w:szCs w:val="20"/>
         </w:rPr>
-        <w:t xml:space="preserve">- Remarque principale de l'IA : la vérification sur émulateur a révélé un vrai défaut de conception, pas un bug de frappe : l'index unique (candidat, session) en base contredisait la règle métier « une inscription reportée ou annulée peut être suivie d'une nouvelle ». Le test unitaire de la règle passait ; seule la base réelle a montré la contradiction. Leçon pour le binôme : les invariants qui dépendent d'un statut ne se mettent pas dans un index SQL, mais dans une fonction pure.</w:t>
+        <w:t xml:space="preserve">- Remarque principale de l'IA : la première version était un QCM (réponses A/B/C/D) parce que la presse et le cadrage le disaient ; le dev 1, qui vient de passer l'épreuve, a décrit une épreuve orale avec une feuille « question posée / réponse donnée / points / total ». L'IA avait respecté la règle « ne pas inventer » en suivant les sources écrites, mais une source de terrain vaut plus qu'un article : la question Q1 est réécrite, la table QCM supprimée, l'écran devient la feuille d'examen.</w:t>
       </w:r>
     </w:p>
     <w:p>
@@ -21762,7 +21762,7 @@
           <w:sz w:val="20"/>
           <w:szCs w:val="20"/>
         </w:rPr>
-        <w:t xml:space="preserve">⚠️ La correction change le schéma (v2) avec fallbackToDestructiveMigration : les données de test de l'émulateur sont perdues, ce qui est accepté en développement (docs/01 §7) ; le pilote a rejoué toute la chaîne depuis une base vide en une passe.</w:t>
+        <w:t xml:space="preserve">⚠️ Le tirage au sort reste une fonction pure qui reçoit son générateur de hasard (Random(graine)) : avec une graine fixe le sujet est reproductible, le test vérifie qu'il atteint la note max sans la dépasser ni répéter, avec des questions à points variables.</w:t>
       </w:r>
     </w:p>
     <w:p>
@@ -21775,7 +21775,7 @@
           <w:sz w:val="20"/>
           <w:szCs w:val="20"/>
         </w:rPr>
-        <w:t xml:space="preserve">⚠️ L'horloge de l'émulateur (19 h) fait classer tout « Présent » en retard pour une convocation à 08:00 : ce n'est pas une anomalie, c'est la règle. Le scénario a donc exercé le chemin « retard accepté » plutôt que « présent direct ».</w:t>
+        <w:t xml:space="preserve">⚠️ Le sujet est créé en base dès l'ouverture de l'écran (gardé par « une seule fois par identifiant ») pour être figé avant la première réponse. Un écran qui écrit à l'ouverture est inhabituel dans le cours : à discuter en binôme.</w:t>
       </w:r>
     </w:p>
     <w:p>
@@ -21788,20 +21788,7 @@
           <w:sz w:val="20"/>
           <w:szCs w:val="20"/>
         </w:rPr>
-        <w:t xml:space="preserve">⚠️ Deux perturbations sans lien avec le code : des projets du cours lancés sur le même émulateur passaient devant ATT ; puis l'émulateur a été fermé et relancé par l'IA. Le pilote vérifie désormais qu'ATT est au premier plan avant chaque action.</w:t>
-      </w:r>
-    </w:p>
-    <w:p>
-      <w:pPr>
-        <w:spacing w:after="120" w:line="300"/>
-      </w:pPr>
-      <w:r>
-        <w:rPr>
-          <w:rFonts w:ascii="Calibri" w:cs="Calibri" w:eastAsia="Calibri" w:hAnsi="Calibri"/>
-          <w:sz w:val="20"/>
-          <w:szCs w:val="20"/>
-        </w:rPr>
-        <w:t xml:space="preserve">- Mon verdict (accepte / rejette / nuance) et pourquoi : &lt;à compléter par le dev 1&gt;.</w:t>
+        <w:t xml:space="preserve">⚠️ Ce que tape l'examinateur est gardé dans le ViewModel et recopié en base à chaque frappe (et en bloc à la clôture) : si l'écran affichait la valeur relue depuis Room, le curseur sauterait. À relire.</w:t>
       </w:r>
     </w:p>
     <w:p>
@@ -21818,7 +21805,7 @@
           <w:sz w:val="23"/>
           <w:szCs w:val="23"/>
         </w:rPr>
-        <w:t xml:space="preserve">Entrée 12 — 17/09/2026 — Étape C9, évaluation théorique</w:t>
+        <w:t xml:space="preserve">Entrée 20 — 18/09/2026 — Étape D2c, synchronisation hors ligne d'abord</w:t>
       </w:r>
     </w:p>
     <w:p>
@@ -21831,7 +21818,7 @@
           <w:sz w:val="20"/>
           <w:szCs w:val="20"/>
         </w:rPr>
-        <w:t xml:space="preserve">- Code soumis : metier/ReglesTheorie.kt, ui/evaluation/EvaluationTheorieViewModel.kt, EcranEvaluationTheorie.kt, schéma v3.</w:t>
+        <w:t xml:space="preserve">- Code soumis : data/FauxServeurATT.kt, data/Synchronisation.kt, ui/synchronisation/*, drapeau synchronisee sur Resultat (schéma v4).</w:t>
       </w:r>
     </w:p>
     <w:p>
@@ -21844,7 +21831,7 @@
           <w:sz w:val="20"/>
           <w:szCs w:val="20"/>
         </w:rPr>
-        <w:t xml:space="preserve">- Remarque principale de l'IA : la première version était un QCM (réponses A/B/C/D) parce que la presse et le cadrage le disaient ; le dev 1, qui vient de passer l'épreuve, a décrit une épreuve orale avec une feuille « question posée / réponse donnée / points / total ». L'IA avait respecté la règle « ne pas inventer » en suivant les sources écrites, mais une source de terrain vaut plus qu'un article : la question Q1 est réécrite, la table QCM supprimée, l'écran devient la feuille d'examen.</w:t>
+        <w:t xml:space="preserve">- Remarque principale de l'IA : reproduire la démo demosync du cours à l'identique (drapeau sur l'entité, file d'attente = requête, boucle qui s'arrête au premier échec, interrupteur réseau simulé) plutôt qu'inventer un mécanisme : c'est ce que le jury connaît, et un vrai serveur remplacerait le faux sans toucher au reste.</w:t>
       </w:r>
     </w:p>
     <w:p>
@@ -21857,7 +21844,7 @@
           <w:sz w:val="20"/>
           <w:szCs w:val="20"/>
         </w:rPr>
-        <w:t xml:space="preserve">⚠️ Le tirage au sort reste une fonction pure qui reçoit son générateur de hasard (Random(graine)) : avec une graine fixe le sujet est reproductible, le test vérifie qu'il atteint la note max sans la dépasser ni répéter, avec des questions à points variables.</w:t>
+        <w:t xml:space="preserve">⚠️ Le drapeau est levé par une requête UPDATE … SET synchronisee = 1, pas par un @Update de l'objet entier : la note et le statut d'un résultat ne doivent jamais être réécrits (R6), même par accident.</w:t>
       </w:r>
     </w:p>
     <w:p>
@@ -21870,33 +21857,7 @@
           <w:sz w:val="20"/>
           <w:szCs w:val="20"/>
         </w:rPr>
-        <w:t xml:space="preserve">⚠️ Le sujet est créé en base dès l'ouverture de l'écran (gardé par « une seule fois par identifiant ») pour être figé avant la première réponse. Un écran qui écrit à l'ouverture est inhabituel dans le cours : à discuter en binôme.</w:t>
-      </w:r>
-    </w:p>
-    <w:p>
-      <w:pPr>
-        <w:spacing w:after="120" w:line="300"/>
-      </w:pPr>
-      <w:r>
-        <w:rPr>
-          <w:rFonts w:ascii="Calibri" w:cs="Calibri" w:eastAsia="Calibri" w:hAnsi="Calibri"/>
-          <w:sz w:val="20"/>
-          <w:szCs w:val="20"/>
-        </w:rPr>
-        <w:t xml:space="preserve">⚠️ Ce que tape l'examinateur est gardé dans le ViewModel et recopié en base à chaque frappe (et en bloc à la clôture) : si l'écran affichait la valeur relue depuis Room, le curseur sauterait. À relire.</w:t>
-      </w:r>
-    </w:p>
-    <w:p>
-      <w:pPr>
-        <w:spacing w:after="120" w:line="300"/>
-      </w:pPr>
-      <w:r>
-        <w:rPr>
-          <w:rFonts w:ascii="Calibri" w:cs="Calibri" w:eastAsia="Calibri" w:hAnsi="Calibri"/>
-          <w:sz w:val="20"/>
-          <w:szCs w:val="20"/>
-        </w:rPr>
-        <w:t xml:space="preserve">- Mon verdict (accepte / rejette / nuance) et pourquoi : &lt;à compléter par le dev 1&gt;.</w:t>
+        <w:t xml:space="preserve">⚠️ Le dev 2 avait « figé » le schéma en v3 (D2) ; cette étape le passe en v4. Le binôme doit refaire le point sur le schéma final avant la soutenance.</w:t>
       </w:r>
     </w:p>
     <w:sectPr>

</xml_diff>

<commit_message>
Retire du rapport les noms de fichiers et la durée chiffrée du développement
</commit_message>
<xml_diff>
--- a/docs/rapport/Rapport_technique_ATT.docx
+++ b/docs/rapport/Rapport_technique_ATT.docx
@@ -6773,7 +6773,7 @@
                 <w:sz w:val="20"/>
                 <w:szCs w:val="20"/>
               </w:rPr>
-              <w:t xml:space="preserve">Entites*.kt, *Dao.kt, AppDatabase, Tracage</w:t>
+              <w:t xml:space="preserve">Candidat, CandidatDao, AppDatabase, Tracage</w:t>
             </w:r>
           </w:p>
         </w:tc>
@@ -6874,7 +6874,7 @@
                 <w:sz w:val="20"/>
                 <w:szCs w:val="20"/>
               </w:rPr>
-              <w:t xml:space="preserve">Navigation.kt</w:t>
+              <w:t xml:space="preserve">Navigation</w:t>
             </w:r>
           </w:p>
         </w:tc>
@@ -6962,7 +6962,7 @@
           <w:sz w:val="22"/>
           <w:szCs w:val="22"/>
         </w:rPr>
-        <w:t xml:space="preserve">24 entités Room, reliées par des clés étrangères, en six familles. Le schéma complet, avec chaque attribut et chaque statut, est dans le fichier docs/03_MODELE_DE_DONNEES.md du dépôt ; Room l'exporte dans app/schemas à chaque version.</w:t>
+        <w:t xml:space="preserve">24 entités Room, reliées par des clés étrangères, en six familles. Le schéma complet, avec chaque attribut et chaque statut, est décrit dans le document de conception du modèle de données ; Room en exporte une copie JSON à chaque version.</w:t>
       </w:r>
     </w:p>
     <w:tbl>
@@ -10299,7 +10299,7 @@
           <w:sz w:val="22"/>
           <w:szCs w:val="22"/>
         </w:rPr>
-        <w:t xml:space="preserve">Ce que ces tests couvrent, et ce qu'ils ne couvrent pas : ils portent sur les règles pures de metier/, sur le hachage des mots de passe et sur le menu par rôle (MenuParRoleTest). Les ViewModels, les DAO et les écrans ne sont pas testés automatiquement : les requêtes des DAO reposent sur la vérification du SQL à la compilation par Room, et les écrans ont été vérifiés à la main sur l'émulateur, avec un script (outils/pilote_emulateur.sh) qui enchaîne les actions par le texte des boutons et rejoue chaque scénario à l'identique ; les dix contraintes du cadrage ont chacune leur scénario dans docs/COMPTES_RENDUS.md. Les tests unitaires ne font pas partie du programme de ce module ; nous les avons introduits parce qu'ils sont le seul moyen de prouver un calcul de barème sans téléphone.</w:t>
+        <w:t xml:space="preserve">Ce que ces tests couvrent, et ce qu'ils ne couvrent pas : ils portent sur les règles pures de metier/, sur le hachage des mots de passe et sur le menu par rôle (MenuParRoleTest). Les ViewModels, les DAO et les écrans ne sont pas testés automatiquement : les requêtes des DAO reposent sur la vérification du SQL à la compilation par Room, et les écrans ont été vérifiés à la main sur l'émulateur, avec un script de pilotage qui enchaîne les actions par le texte des boutons et rejoue chaque scénario à l'identique ; les dix contraintes du cadrage ont chacune leur scénario dans les comptes rendus d'étape. Les tests unitaires ne font pas partie du programme de ce module ; nous les avons introduits parce qu'ils sont le seul moyen de prouver un calcul de barème sans téléphone.</w:t>
       </w:r>
     </w:p>
     <w:p>
@@ -11009,7 +11009,7 @@
           <w:sz w:val="22"/>
           <w:szCs w:val="22"/>
         </w:rPr>
-        <w:t xml:space="preserve">L'outil : Claude Code, un agent de développement qui lit et écrit les fichiers du projet, lance la construction et les tests, et pilote l'émulateur. Il a été utilisé au niveau « agent » décrit dans l'état de l'art du module, avec un fichier de règles à la racine du dépôt (CLAUDE.md) qui lui impose les technologies du cours, l'interdiction d'inventer une règle administrative, la traçabilité, et un cycle de fin d'étape : construction et tests verts, vérification sur émulateur, compte rendu, entrée dans le journal, puis relecture humaine avant tout commit.</w:t>
+        <w:t xml:space="preserve">L'outil : Claude Code, un agent de développement qui lit et écrit les fichiers du projet, lance la construction et les tests, et pilote l'émulateur. Il a été utilisé au niveau « agent » décrit dans l'état de l'art du module, avec un fichier de règles à la racine du projet qui lui impose les technologies du cours, l'interdiction d'inventer une règle administrative, la traçabilité, et un cycle de fin d'étape : construction et tests verts, vérification sur émulateur, compte rendu, entrée dans le journal, puis relecture humaine avant tout commit.</w:t>
       </w:r>
     </w:p>
     <w:p>
@@ -11022,7 +11022,7 @@
           <w:sz w:val="22"/>
           <w:szCs w:val="22"/>
         </w:rPr>
-        <w:t xml:space="preserve">La proportion : l'IA a produit la majorité du code de chaque étape à partir de nos documents de cadrage (règles, plan, modèle de données, cas d'utilisation), que nous avons écrits et validés avant la première ligne. Nous avons relu chaque fichier dans la demande de fusion (pull request) de l'étape avant de la fusionner, et rejoué chaque scénario sur l'émulateur. Le journal du dépôt (JOURNAL-IA.md) consigne pour chaque étape ce qui a été soumis, la remarque principale de l'IA, les points d'alerte, et notre verdict.</w:t>
+        <w:t xml:space="preserve">La proportion : l'IA a produit la majorité du code de chaque étape à partir de nos documents de cadrage (règles, plan, modèle de données, cas d'utilisation), que nous avons écrits et validés avant la première ligne. Nous avons relu chaque fichier dans la demande de fusion (pull request) de l'étape avant de la fusionner, et rejoué chaque scénario sur l'émulateur. Le journal IA (annexe G) consigne pour chaque étape ce qui a été soumis, la remarque principale de l'IA, les points d'alerte, et notre verdict.</w:t>
       </w:r>
     </w:p>
     <w:p>
@@ -12223,7 +12223,7 @@
           <w:sz w:val="22"/>
           <w:szCs w:val="22"/>
         </w:rPr>
-        <w:t xml:space="preserve">Le plan prévoyait dix semaines ; le développement s'est fait du 15 au 18 septembre 2026, soit quatre jours effectifs à deux, précédés de la recherche documentaire de l'annexe C. Le cadrage (règles, plan, modèle de données, cas d'utilisation) a été écrit le premier jour, avant la première ligne de code, et n'a presque pas bougé ensuite : c'est ce qui a permis d'enchaîner les étapes sans revenir en arrière. Le socle technique et les premières fonctionnalités ont suivi ; puis les évaluations, les résultats, la consultation et l'impression ; enfin les tests, la relecture croisée, la refonte de l'interface et ce rapport.</w:t>
+        <w:t xml:space="preserve">Le plan prévoyait dix semaines ; le développement s'est fait en peu de jours, à deux, précédé de la recherche documentaire de l'annexe C. Le cadrage (règles, plan, modèle de données, cas d'utilisation) a été écrit le premier jour, avant la première ligne de code, et n'a presque pas bougé ensuite : c'est ce qui a permis d'enchaîner les étapes sans revenir en arrière. Le socle technique et les premières fonctionnalités ont suivi ; puis les évaluations, les résultats, la consultation et l'impression ; enfin les tests, la relecture croisée, la refonte de l'interface et ce rapport.</w:t>
       </w:r>
     </w:p>
     <w:p>
@@ -13028,7 +13028,7 @@
           <w:sz w:val="22"/>
           <w:szCs w:val="22"/>
         </w:rPr>
-        <w:t xml:space="preserve">metier/ReglesTheorie.kt : le sujet est tiré avec filter et shuffled ; ReglesInscription.kt rend un message ou null avec un when sans if ; aucune entité n'a de propriété mutable ; le mot-clé !! n'apparaît nulle part dans le projet.</w:t>
+        <w:t xml:space="preserve">Règle de tirage du sujet (couche métier) : le sujet est tiré avec filter et shuffled ; la règle d'inscription rend un message ou null avec un when sans if ; aucune entité n'a de propriété mutable ; le mot-clé !! n'apparaît nulle part dans le projet.</w:t>
       </w:r>
     </w:p>
     <w:p>
@@ -13084,7 +13084,7 @@
           <w:sz w:val="22"/>
           <w:szCs w:val="22"/>
         </w:rPr>
-        <w:t xml:space="preserve">Une seule Activity (MainActivity.kt) ; nous avons vérifié en tournant l'émulateur pendant une saisie d'inscription que le formulaire reste rempli : l'état est dans InscriptionsViewModel, qui survit à la recréation de l'Activity, comme annoncé en cours.</w:t>
+        <w:t xml:space="preserve">Une seule Activity ; nous avons vérifié en tournant l'émulateur pendant une saisie d'inscription que le formulaire reste rempli : l'état est dans InscriptionsViewModel, qui survit à la recréation de l'Activity, comme annoncé en cours.</w:t>
       </w:r>
     </w:p>
     <w:p>
@@ -13112,7 +13112,7 @@
           <w:sz w:val="22"/>
           <w:szCs w:val="22"/>
         </w:rPr>
-        <w:t xml:space="preserve">ui/communs/Cadre.kt et Champs.kt : le cadre d'écran, les champs et les cartes sont des composables réutilisés par tous les écrans ; l'ouverture d'un menu déroulant (remember dans Selecteurs.kt) est le principal état local ; le reste vit dans les ViewModels.</w:t>
+        <w:t xml:space="preserve">Composants communs : le cadre d'écran, les champs et les cartes sont des composables réutilisés par tous les écrans ; l'ouverture d'un menu déroulant (remember dans le sélecteur) est le principal état local ; le reste vit dans les ViewModels.</w:t>
       </w:r>
     </w:p>
     <w:p>
@@ -13140,7 +13140,7 @@
           <w:sz w:val="22"/>
           <w:szCs w:val="22"/>
         </w:rPr>
-        <w:t xml:space="preserve">Navigation.kt : routes comme tentative/{tentativeId}/theorie, identifiant relu par idArgument (toIntOrNull), écrans qui reçoivent des lambdas onRetour et onOuvrir ; aucun écran ne reçoit le navController.</w:t>
+        <w:t xml:space="preserve">Navigation : routes comme tentative/{tentativeId}/theorie, identifiant relu par idArgument (toIntOrNull), écrans qui reçoivent des lambdas onRetour et onOuvrir ; aucun écran ne reçoit le navController.</w:t>
       </w:r>
     </w:p>
     <w:p>
@@ -13196,7 +13196,7 @@
           <w:sz w:val="22"/>
           <w:szCs w:val="22"/>
         </w:rPr>
-        <w:t xml:space="preserve">data/ExamensDao.kt : requêtes Flow pour ce qui s'affiche, suspend pour les écritures, SQL vérifié à la compilation ; Synchronisation.kt reprend la file d'attente à drapeau de la démonstration demosync, avec les deux différences expliquées en 7.5.</w:t>
+        <w:t xml:space="preserve">DAO des examens : requêtes Flow pour ce qui s'affiche, suspend pour les écritures, SQL vérifié à la compilation ; la synchronisation reprend la file d'attente à drapeau de la démonstration demosync, avec les deux différences expliquées en 7.5.</w:t>
       </w:r>
     </w:p>
     <w:p>
@@ -13357,7 +13357,7 @@
           <w:sz w:val="22"/>
           <w:szCs w:val="22"/>
         </w:rPr>
-        <w:t xml:space="preserve">Le tableau complet, avec pour chaque notion l'étape où elle est apparue, l'équivalent vu en cours et la décision du binôme, est le fichier docs/HORS_COURS.md du dépôt (31 entrées). Deux exemples de ce que nous avons refusé ou remplacé : le patron Repository (couche intermédiaire entre ViewModel et DAO), proposé au départ pour « faire propre », a été écarté parce que le cours n'en a jamais écrit et que les ViewModels appellent les DAO directement sans perdre en clarté ; les boutons radio de la première épreuve théorique ont disparu avec le questionnaire à choix multiples, remplacés par les champs de texte du cours.</w:t>
+        <w:t xml:space="preserve">Le tableau complet, avec pour chaque notion l'étape où elle est apparue, l'équivalent vu en cours et la décision du binôme, est tenu dans un document du projet (31 entrées). Deux exemples de ce que nous avons refusé ou remplacé : le patron Repository (couche intermédiaire entre ViewModel et DAO), proposé au départ pour « faire propre », a été écarté parce que le cours n'en a jamais écrit et que les ViewModels appellent les DAO directement sans perdre en clarté ; les boutons radio de la première épreuve théorique ont disparu avec le questionnaire à choix multiples, remplacés par les champs de texte du cours.</w:t>
       </w:r>
     </w:p>
     <w:p>
@@ -13862,7 +13862,7 @@
           <w:sz w:val="22"/>
           <w:szCs w:val="22"/>
         </w:rPr>
-        <w:t xml:space="preserve">Il faut aussi être honnêtes : ce que nous livrons est le minimum qu'un projet universitaire, mené en quatre jours à deux, pouvait atteindre. Il peut être largement amélioré. Les barèmes et la grille de conduite sont des exemples ; le serveur est simulé et tout tient sur un seul appareil ; les photos des pièces ne sont pas chiffrées ; l'interface mériterait d'être testée avec de vrais agents dans un vrai centre. Aucune de ces limites n'est un mur : chacune est nommée au chapitre 13, et l'architecture a été pensée pour les accueillir sans tout reprendre.</w:t>
+        <w:t xml:space="preserve">Il faut aussi être honnêtes : ce que nous livrons est le minimum qu'un projet universitaire, mené à deux en peu de jours, pouvait atteindre. Il peut être largement amélioré. Les barèmes et la grille de conduite sont des exemples ; le serveur est simulé et tout tient sur un seul appareil ; les photos des pièces ne sont pas chiffrées ; l'interface mériterait d'être testée avec de vrais agents dans un vrai centre. Aucune de ces limites n'est un mur : chacune est nommée au chapitre 13, et l'architecture a été pensée pour les accueillir sans tout reprendre.</w:t>
       </w:r>
     </w:p>
     <w:p>
@@ -17446,7 +17446,7 @@
           <w:sz w:val="18"/>
           <w:szCs w:val="18"/>
         </w:rPr>
-        <w:t xml:space="preserve">// metier/ReglesTentatives.kt</w:t>
+        <w:t xml:space="preserve">// Règle d'ouverture d'une tentative (couche métier)</w:t>
       </w:r>
     </w:p>
     <w:p>
@@ -17641,7 +17641,7 @@
           <w:sz w:val="18"/>
           <w:szCs w:val="18"/>
         </w:rPr>
-        <w:t xml:space="preserve">// test/ReglesTentativesTest.kt</w:t>
+        <w:t xml:space="preserve">// Son test unitaire</w:t>
       </w:r>
     </w:p>
     <w:p>
@@ -18811,19 +18811,6 @@
     </w:p>
     <w:p>
       <w:pPr>
-        <w:spacing w:after="120" w:line="300"/>
-      </w:pPr>
-      <w:r>
-        <w:rPr>
-          <w:rFonts w:ascii="Calibri" w:cs="Calibri" w:eastAsia="Calibri" w:hAnsi="Calibri"/>
-          <w:sz w:val="22"/>
-          <w:szCs w:val="22"/>
-        </w:rPr>
-        <w:t xml:space="preserve">Le détail des sources, avec le niveau de fiabilité et la citation exacte, est dans le fichier docs/references/RECHERCHE_ATT_ET_ANDROID.md du dépôt.</w:t>
-      </w:r>
-    </w:p>
-    <w:p>
-      <w:pPr>
         <w:pStyle w:val="Heading1"/>
         <w:pageBreakBefore/>
         <w:spacing w:after="200" w:before="360"/>
@@ -21624,7 +21611,7 @@
           <w:sz w:val="22"/>
           <w:szCs w:val="22"/>
         </w:rPr>
-        <w:t xml:space="preserve">Le journal complet est le fichier JOURNAL-IA.md du dépôt. Les trois entrées ci-dessous sont recopiées sans retouche : la contradiction entre un index SQL et une règle métier (chapitre 10), le passage du QCM à l'épreuve orale sur un témoignage de terrain (chapitres 2 et 10), et la reprise de la démonstration du cours pour la synchronisation (chapitres 7.5 et 12).</w:t>
+        <w:t xml:space="preserve">Le journal IA compte une entrée par étape. Les trois entrées ci-dessous sont recopiées telles quelles, sans la ligne qui liste les fichiers concernés : la contradiction entre un index SQL et une règle métier (chapitre 10), le passage du QCM à l'épreuve orale sur un témoignage de terrain (chapitres 2 et 10), et la reprise de la démonstration du cours pour la synchronisation (chapitres 7.5 et 12).</w:t>
       </w:r>
     </w:p>
     <w:p>
@@ -21654,19 +21641,6 @@
           <w:sz w:val="20"/>
           <w:szCs w:val="20"/>
         </w:rPr>
-        <w:t xml:space="preserve">- Code soumis : metier/ReglesPresence.kt, ui/appel/*, schéma v2 des inscriptions.</w:t>
-      </w:r>
-    </w:p>
-    <w:p>
-      <w:pPr>
-        <w:spacing w:after="120" w:line="300"/>
-      </w:pPr>
-      <w:r>
-        <w:rPr>
-          <w:rFonts w:ascii="Calibri" w:cs="Calibri" w:eastAsia="Calibri" w:hAnsi="Calibri"/>
-          <w:sz w:val="20"/>
-          <w:szCs w:val="20"/>
-        </w:rPr>
         <w:t xml:space="preserve">- Remarque principale de l'IA : la vérification sur émulateur a révélé un vrai défaut de conception, pas un bug de frappe : l'index unique (candidat, session) en base contredisait la règle métier « une inscription reportée ou annulée peut être suivie d'une nouvelle ». Le test unitaire de la règle passait ; seule la base réelle a montré la contradiction. Leçon pour le binôme : les invariants qui dépendent d'un statut ne se mettent pas dans un index SQL, mais dans une fonction pure.</w:t>
       </w:r>
     </w:p>
@@ -21736,19 +21710,6 @@
           <w:sz w:val="20"/>
           <w:szCs w:val="20"/>
         </w:rPr>
-        <w:t xml:space="preserve">- Code soumis : metier/ReglesTheorie.kt, ui/evaluation/EvaluationTheorieViewModel.kt, EcranEvaluationTheorie.kt, schéma v3.</w:t>
-      </w:r>
-    </w:p>
-    <w:p>
-      <w:pPr>
-        <w:spacing w:after="120" w:line="300"/>
-      </w:pPr>
-      <w:r>
-        <w:rPr>
-          <w:rFonts w:ascii="Calibri" w:cs="Calibri" w:eastAsia="Calibri" w:hAnsi="Calibri"/>
-          <w:sz w:val="20"/>
-          <w:szCs w:val="20"/>
-        </w:rPr>
         <w:t xml:space="preserve">- Remarque principale de l'IA : la première version était un QCM (réponses A/B/C/D) parce que la presse et le cadrage le disaient ; le dev 1, qui vient de passer l'épreuve, a décrit une épreuve orale avec une feuille « question posée / réponse donnée / points / total ». L'IA avait respecté la règle « ne pas inventer » en suivant les sources écrites, mais une source de terrain vaut plus qu'un article : la question Q1 est réécrite, la table QCM supprimée, l'écran devient la feuille d'examen.</w:t>
       </w:r>
     </w:p>
@@ -21806,19 +21767,6 @@
           <w:szCs w:val="23"/>
         </w:rPr>
         <w:t xml:space="preserve">Entrée 20 — 18/09/2026 — Étape D2c, synchronisation hors ligne d'abord</w:t>
-      </w:r>
-    </w:p>
-    <w:p>
-      <w:pPr>
-        <w:spacing w:after="120" w:line="300"/>
-      </w:pPr>
-      <w:r>
-        <w:rPr>
-          <w:rFonts w:ascii="Calibri" w:cs="Calibri" w:eastAsia="Calibri" w:hAnsi="Calibri"/>
-          <w:sz w:val="20"/>
-          <w:szCs w:val="20"/>
-        </w:rPr>
-        <w:t xml:space="preserve">- Code soumis : data/FauxServeurATT.kt, data/Synchronisation.kt, ui/synchronisation/*, drapeau synchronisee sur Resultat (schéma v4).</w:t>
       </w:r>
     </w:p>
     <w:p>

</xml_diff>

<commit_message>
Supprime l'annexe des captures et renumérote les annexes du rapport
</commit_message>
<xml_diff>
--- a/docs/rapport/Rapport_technique_ATT.docx
+++ b/docs/rapport/Rapport_technique_ATT.docx
@@ -429,7 +429,7 @@
           <w:sz w:val="22"/>
           <w:szCs w:val="22"/>
         </w:rPr>
-        <w:t xml:space="preserve">Passer l'examen du permis à Madagascar reste aujourd'hui un parcours long et opaque, pour le candidat comme pour l'administration. L'échelle donne la mesure du problème : environ 60 000 candidats par an, un taux de réussite d'environ 53 %, 173 auto-écoles dont une centaine à Antananarivo, 22 centres d'examen et 31 examinateurs pour tout le pays (presse, juillet 2024, annexe C). Les difficultés relevées sont les suivantes.</w:t>
+        <w:t xml:space="preserve">Passer l'examen du permis à Madagascar reste aujourd'hui un parcours long et opaque, pour le candidat comme pour l'administration. L'échelle donne la mesure du problème : environ 60 000 candidats par an, un taux de réussite d'environ 53 %, 173 auto-écoles dont une centaine à Antananarivo, 22 centres d'examen et 31 examinateurs pour tout le pays (presse, juillet 2024, annexe B). Les difficultés relevées sont les suivantes.</w:t>
       </w:r>
     </w:p>
     <w:p>
@@ -3180,7 +3180,7 @@
           <w:sz w:val="22"/>
           <w:szCs w:val="22"/>
         </w:rPr>
-        <w:t xml:space="preserve">Ce chapitre suit un candidat de son inscription en auto-école jusqu'à son résultat, dans l'ordre réel des opérations. Chaque étape est illustrée par une capture prise sur un petit téléphone (720 × 1280) ; les comptes utilisés sont ceux de l'annexe E.</w:t>
+        <w:t xml:space="preserve">Ce chapitre suit un candidat de son inscription en auto-école jusqu'à son résultat, dans l'ordre réel des opérations. Chaque étape est illustrée par une capture prise sur un petit téléphone (720 × 1280) ; les comptes utilisés sont ceux de l'annexe D.</w:t>
       </w:r>
     </w:p>
     <w:p>
@@ -7565,7 +7565,7 @@
           <w:sz w:val="22"/>
           <w:szCs w:val="22"/>
         </w:rPr>
-        <w:t xml:space="preserve">L'annexe B montre les quatre briques de ce flux : l'écriture et sa ligne d'historique dans une même transaction (B.1), une règle pure et son test (B.2), un ViewModel qui combine les flux de Room en un seul état (B.3) et le tirage du sujet avec le hasard injecté (B.4).</w:t>
+        <w:t xml:space="preserve">L'annexe A montre les quatre briques de ce flux : l'écriture et sa ligne d'historique dans une même transaction (A.1), une règle pure et son test (A.2), un ViewModel qui combine les flux de Room en un seul état (A.3) et le tirage du sujet avec le hasard injecté (A.4).</w:t>
       </w:r>
     </w:p>
     <w:p>
@@ -11022,7 +11022,7 @@
           <w:sz w:val="22"/>
           <w:szCs w:val="22"/>
         </w:rPr>
-        <w:t xml:space="preserve">La proportion : l'IA a produit la majorité du code de chaque étape à partir de nos documents de cadrage (règles, plan, modèle de données, cas d'utilisation), que nous avons écrits et validés avant la première ligne. Nous avons relu chaque fichier dans la demande de fusion (pull request) de l'étape avant de la fusionner, et rejoué chaque scénario sur l'émulateur. Le journal IA (annexe G) consigne pour chaque étape ce qui a été soumis, la remarque principale de l'IA, les points d'alerte, et notre verdict.</w:t>
+        <w:t xml:space="preserve">La proportion : l'IA a produit la majorité du code de chaque étape à partir de nos documents de cadrage (règles, plan, modèle de données, cas d'utilisation), que nous avons écrits et validés avant la première ligne. Nous avons relu chaque fichier dans la demande de fusion (pull request) de l'étape avant de la fusionner, et rejoué chaque scénario sur l'émulateur. Le journal IA (annexe F) consigne pour chaque étape ce qui a été soumis, la remarque principale de l'IA, les points d'alerte, et notre verdict.</w:t>
       </w:r>
     </w:p>
     <w:p>
@@ -11222,7 +11222,7 @@
           <w:sz w:val="22"/>
           <w:szCs w:val="22"/>
         </w:rPr>
-        <w:t xml:space="preserve">La question de la dernière séance, « sur quelle tâche auriez-vous appris moins si l'IA avait été autorisée ? », nous y répondons ainsi : sur l'architecture. Si l'IA avait posé seule le modèle de données et la découpe des ViewModels, nous aurions eu une application qui marche sans savoir pourquoi. C'est parce que nous avons écrit le cadrage et relu chaque étape que nous savons expliquer chaque fichier ; trois entrées du journal sont recopiées en annexe G pour en témoigner.</w:t>
+        <w:t xml:space="preserve">La question de la dernière séance, « sur quelle tâche auriez-vous appris moins si l'IA avait été autorisée ? », nous y répondons ainsi : sur l'architecture. Si l'IA avait posé seule le modèle de données et la découpe des ViewModels, nous aurions eu une application qui marche sans savoir pourquoi. C'est parce que nous avons écrit le cadrage et relu chaque étape que nous savons expliquer chaque fichier ; trois entrées du journal sont recopiées en annexe F pour en témoigner.</w:t>
       </w:r>
     </w:p>
     <w:p>
@@ -12223,7 +12223,7 @@
           <w:sz w:val="22"/>
           <w:szCs w:val="22"/>
         </w:rPr>
-        <w:t xml:space="preserve">Le plan prévoyait dix semaines ; le développement s'est fait en peu de jours, à deux, précédé de la recherche documentaire de l'annexe C. Le cadrage (règles, plan, modèle de données, cas d'utilisation) a été écrit le premier jour, avant la première ligne de code, et n'a presque pas bougé ensuite : c'est ce qui a permis d'enchaîner les étapes sans revenir en arrière. Le socle technique et les premières fonctionnalités ont suivi ; puis les évaluations, les résultats, la consultation et l'impression ; enfin les tests, la relecture croisée, la refonte de l'interface et ce rapport.</w:t>
+        <w:t xml:space="preserve">Le plan prévoyait dix semaines ; le développement s'est fait en peu de jours, à deux, précédé de la recherche documentaire de l'annexe B. Le cadrage (règles, plan, modèle de données, cas d'utilisation) a été écrit le premier jour, avant la première ligne de code, et n'a presque pas bougé ensuite : c'est ce qui a permis d'enchaîner les étapes sans revenir en arrière. Le socle technique et les premières fonctionnalités ont suivi ; puis les évaluations, les résultats, la consultation et l'impression ; enfin les tests, la relecture croisée, la refonte de l'interface et ce rapport.</w:t>
       </w:r>
     </w:p>
     <w:p>
@@ -13608,7 +13608,7 @@
           <w:sz w:val="22"/>
           <w:szCs w:val="22"/>
         </w:rPr>
-        <w:t xml:space="preserve">Les barèmes, seuils, délais et la grille de conduite sont des valeurs d'exemple en attente de validation par l'ATT (annexe F).</w:t>
+        <w:t xml:space="preserve">Les barèmes, seuils, délais et la grille de conduite sont des valeurs d'exemple en attente de validation par l'ATT (annexe E).</w:t>
       </w:r>
     </w:p>
     <w:p>
@@ -13893,7 +13893,24 @@
           <w:sz w:val="32"/>
           <w:szCs w:val="32"/>
         </w:rPr>
-        <w:t xml:space="preserve">Annexe A — Captures d'écran</w:t>
+        <w:t xml:space="preserve">Annexe A — Extraits de code commentés</w:t>
+      </w:r>
+    </w:p>
+    <w:p>
+      <w:pPr>
+        <w:pStyle w:val="Heading2"/>
+        <w:spacing w:after="140" w:before="280"/>
+      </w:pPr>
+      <w:r>
+        <w:rPr>
+          <w:rFonts w:ascii="Calibri" w:cs="Calibri" w:eastAsia="Calibri" w:hAnsi="Calibri"/>
+          <w:b/>
+          <w:bCs/>
+          <w:color w:val="0B2E4F"/>
+          <w:sz w:val="26"/>
+          <w:szCs w:val="26"/>
+        </w:rPr>
+        <w:t xml:space="preserve">A.1 Écriture et historique dans une même transaction</w:t>
       </w:r>
     </w:p>
     <w:p>
@@ -13906,3361 +13923,672 @@
           <w:sz w:val="22"/>
           <w:szCs w:val="22"/>
         </w:rPr>
-        <w:t xml:space="preserve">Les captures du chapitre 6 ont été prises sur l'émulateur Android d'un petit téléphone (720 × 1280), avec les comptes de démonstration, en rejouant le parcours complet depuis une base vide. Elles sont récapitulées ici dans l'ordre du document.</w:t>
-      </w:r>
-    </w:p>
-    <w:tbl>
-      <w:tblPr>
-        <w:tblW w:type="dxa" w:w="9020"/>
-        <w:tblBorders>
-          <w:top w:val="single" w:color="auto" w:sz="4"/>
-          <w:left w:val="single" w:color="auto" w:sz="4"/>
-          <w:bottom w:val="single" w:color="auto" w:sz="4"/>
-          <w:right w:val="single" w:color="auto" w:sz="4"/>
-          <w:insideH w:val="single" w:color="auto" w:sz="4"/>
-          <w:insideV w:val="single" w:color="auto" w:sz="4"/>
-        </w:tblBorders>
-      </w:tblPr>
-      <w:tblGrid>
-        <w:gridCol w:w="1082"/>
-        <w:gridCol w:w="4510"/>
-        <w:gridCol w:w="3428"/>
-      </w:tblGrid>
-      <w:tr>
-        <w:trPr>
-          <w:tblHeader/>
-        </w:trPr>
-        <w:tc>
-          <w:tcPr>
-            <w:tcW w:type="dxa" w:w="1082"/>
-            <w:shd w:fill="0F4C81" w:color="auto" w:val="clear"/>
-            <w:tcMar>
-              <w:top w:type="dxa" w:w="80"/>
-              <w:left w:type="dxa" w:w="100"/>
-              <w:bottom w:type="dxa" w:w="80"/>
-              <w:right w:type="dxa" w:w="100"/>
-            </w:tcMar>
-          </w:tcPr>
-          <w:p>
-            <w:pPr>
-              <w:spacing w:after="0" w:line="270"/>
-            </w:pPr>
-            <w:r>
-              <w:rPr>
-                <w:rFonts w:ascii="Calibri" w:cs="Calibri" w:eastAsia="Calibri" w:hAnsi="Calibri"/>
-                <w:b/>
-                <w:bCs/>
-                <w:color w:val="FFFFFF"/>
-                <w:sz w:val="20"/>
-                <w:szCs w:val="20"/>
-              </w:rPr>
-              <w:t xml:space="preserve">Figure</w:t>
-            </w:r>
-          </w:p>
-        </w:tc>
-        <w:tc>
-          <w:tcPr>
-            <w:tcW w:type="dxa" w:w="4510"/>
-            <w:shd w:fill="0F4C81" w:color="auto" w:val="clear"/>
-            <w:tcMar>
-              <w:top w:type="dxa" w:w="80"/>
-              <w:left w:type="dxa" w:w="100"/>
-              <w:bottom w:type="dxa" w:w="80"/>
-              <w:right w:type="dxa" w:w="100"/>
-            </w:tcMar>
-          </w:tcPr>
-          <w:p>
-            <w:pPr>
-              <w:spacing w:after="0" w:line="270"/>
-            </w:pPr>
-            <w:r>
-              <w:rPr>
-                <w:rFonts w:ascii="Calibri" w:cs="Calibri" w:eastAsia="Calibri" w:hAnsi="Calibri"/>
-                <w:b/>
-                <w:bCs/>
-                <w:color w:val="FFFFFF"/>
-                <w:sz w:val="20"/>
-                <w:szCs w:val="20"/>
-              </w:rPr>
-              <w:t xml:space="preserve">Écran</w:t>
-            </w:r>
-          </w:p>
-        </w:tc>
-        <w:tc>
-          <w:tcPr>
-            <w:tcW w:type="dxa" w:w="3428"/>
-            <w:shd w:fill="0F4C81" w:color="auto" w:val="clear"/>
-            <w:tcMar>
-              <w:top w:type="dxa" w:w="80"/>
-              <w:left w:type="dxa" w:w="100"/>
-              <w:bottom w:type="dxa" w:w="80"/>
-              <w:right w:type="dxa" w:w="100"/>
-            </w:tcMar>
-          </w:tcPr>
-          <w:p>
-            <w:pPr>
-              <w:spacing w:after="0" w:line="270"/>
-            </w:pPr>
-            <w:r>
-              <w:rPr>
-                <w:rFonts w:ascii="Calibri" w:cs="Calibri" w:eastAsia="Calibri" w:hAnsi="Calibri"/>
-                <w:b/>
-                <w:bCs/>
-                <w:color w:val="FFFFFF"/>
-                <w:sz w:val="20"/>
-                <w:szCs w:val="20"/>
-              </w:rPr>
-              <w:t xml:space="preserve">Fichier</w:t>
-            </w:r>
-          </w:p>
-        </w:tc>
-      </w:tr>
-      <w:tr>
-        <w:tc>
-          <w:tcPr>
-            <w:tcW w:type="dxa" w:w="1082"/>
-            <w:tcMar>
-              <w:top w:type="dxa" w:w="80"/>
-              <w:left w:type="dxa" w:w="100"/>
-              <w:bottom w:type="dxa" w:w="80"/>
-              <w:right w:type="dxa" w:w="100"/>
-            </w:tcMar>
-          </w:tcPr>
-          <w:p>
-            <w:pPr>
-              <w:spacing w:after="0" w:line="270"/>
-            </w:pPr>
-            <w:r>
-              <w:rPr>
-                <w:rFonts w:ascii="Calibri" w:cs="Calibri" w:eastAsia="Calibri" w:hAnsi="Calibri"/>
-                <w:sz w:val="20"/>
-                <w:szCs w:val="20"/>
-              </w:rPr>
-              <w:t xml:space="preserve">1</w:t>
-            </w:r>
-          </w:p>
-        </w:tc>
-        <w:tc>
-          <w:tcPr>
-            <w:tcW w:type="dxa" w:w="4510"/>
-            <w:tcMar>
-              <w:top w:type="dxa" w:w="80"/>
-              <w:left w:type="dxa" w:w="100"/>
-              <w:bottom w:type="dxa" w:w="80"/>
-              <w:right w:type="dxa" w:w="100"/>
-            </w:tcMar>
-          </w:tcPr>
-          <w:p>
-            <w:pPr>
-              <w:spacing w:after="0" w:line="270"/>
-            </w:pPr>
-            <w:r>
-              <w:rPr>
-                <w:rFonts w:ascii="Calibri" w:cs="Calibri" w:eastAsia="Calibri" w:hAnsi="Calibri"/>
-                <w:sz w:val="20"/>
-                <w:szCs w:val="20"/>
-              </w:rPr>
-              <w:t xml:space="preserve">Accueil de l'administrateur ATT : le menu du rôle</w:t>
-            </w:r>
-          </w:p>
-        </w:tc>
-        <w:tc>
-          <w:tcPr>
-            <w:tcW w:type="dxa" w:w="3428"/>
-            <w:tcMar>
-              <w:top w:type="dxa" w:w="80"/>
-              <w:left w:type="dxa" w:w="100"/>
-              <w:bottom w:type="dxa" w:w="80"/>
-              <w:right w:type="dxa" w:w="100"/>
-            </w:tcMar>
-          </w:tcPr>
-          <w:p>
-            <w:pPr>
-              <w:spacing w:after="0" w:line="270"/>
-            </w:pPr>
-            <w:r>
-              <w:rPr>
-                <w:rFonts w:ascii="Calibri" w:cs="Calibri" w:eastAsia="Calibri" w:hAnsi="Calibri"/>
-                <w:sz w:val="20"/>
-                <w:szCs w:val="20"/>
-              </w:rPr>
-              <w:t xml:space="preserve">05_accueil_admin.png</w:t>
-            </w:r>
-          </w:p>
-        </w:tc>
-      </w:tr>
-      <w:tr>
-        <w:tc>
-          <w:tcPr>
-            <w:tcW w:type="dxa" w:w="1082"/>
-            <w:shd w:fill="F3F6FA" w:color="auto" w:val="clear"/>
-            <w:tcMar>
-              <w:top w:type="dxa" w:w="80"/>
-              <w:left w:type="dxa" w:w="100"/>
-              <w:bottom w:type="dxa" w:w="80"/>
-              <w:right w:type="dxa" w:w="100"/>
-            </w:tcMar>
-          </w:tcPr>
-          <w:p>
-            <w:pPr>
-              <w:spacing w:after="0" w:line="270"/>
-            </w:pPr>
-            <w:r>
-              <w:rPr>
-                <w:rFonts w:ascii="Calibri" w:cs="Calibri" w:eastAsia="Calibri" w:hAnsi="Calibri"/>
-                <w:sz w:val="20"/>
-                <w:szCs w:val="20"/>
-              </w:rPr>
-              <w:t xml:space="preserve">2</w:t>
-            </w:r>
-          </w:p>
-        </w:tc>
-        <w:tc>
-          <w:tcPr>
-            <w:tcW w:type="dxa" w:w="4510"/>
-            <w:shd w:fill="F3F6FA" w:color="auto" w:val="clear"/>
-            <w:tcMar>
-              <w:top w:type="dxa" w:w="80"/>
-              <w:left w:type="dxa" w:w="100"/>
-              <w:bottom w:type="dxa" w:w="80"/>
-              <w:right w:type="dxa" w:w="100"/>
-            </w:tcMar>
-          </w:tcPr>
-          <w:p>
-            <w:pPr>
-              <w:spacing w:after="0" w:line="270"/>
-            </w:pPr>
-            <w:r>
-              <w:rPr>
-                <w:rFonts w:ascii="Calibri" w:cs="Calibri" w:eastAsia="Calibri" w:hAnsi="Calibri"/>
-                <w:sz w:val="20"/>
-                <w:szCs w:val="20"/>
-              </w:rPr>
-              <w:t xml:space="preserve">Écran de connexion</w:t>
-            </w:r>
-          </w:p>
-        </w:tc>
-        <w:tc>
-          <w:tcPr>
-            <w:tcW w:type="dxa" w:w="3428"/>
-            <w:shd w:fill="F3F6FA" w:color="auto" w:val="clear"/>
-            <w:tcMar>
-              <w:top w:type="dxa" w:w="80"/>
-              <w:left w:type="dxa" w:w="100"/>
-              <w:bottom w:type="dxa" w:w="80"/>
-              <w:right w:type="dxa" w:w="100"/>
-            </w:tcMar>
-          </w:tcPr>
-          <w:p>
-            <w:pPr>
-              <w:spacing w:after="0" w:line="270"/>
-            </w:pPr>
-            <w:r>
-              <w:rPr>
-                <w:rFonts w:ascii="Calibri" w:cs="Calibri" w:eastAsia="Calibri" w:hAnsi="Calibri"/>
-                <w:sz w:val="20"/>
-                <w:szCs w:val="20"/>
-              </w:rPr>
-              <w:t xml:space="preserve">06_01_connexion.png</w:t>
-            </w:r>
-          </w:p>
-        </w:tc>
-      </w:tr>
-      <w:tr>
-        <w:tc>
-          <w:tcPr>
-            <w:tcW w:type="dxa" w:w="1082"/>
-            <w:tcMar>
-              <w:top w:type="dxa" w:w="80"/>
-              <w:left w:type="dxa" w:w="100"/>
-              <w:bottom w:type="dxa" w:w="80"/>
-              <w:right w:type="dxa" w:w="100"/>
-            </w:tcMar>
-          </w:tcPr>
-          <w:p>
-            <w:pPr>
-              <w:spacing w:after="0" w:line="270"/>
-            </w:pPr>
-            <w:r>
-              <w:rPr>
-                <w:rFonts w:ascii="Calibri" w:cs="Calibri" w:eastAsia="Calibri" w:hAnsi="Calibri"/>
-                <w:sz w:val="20"/>
-                <w:szCs w:val="20"/>
-              </w:rPr>
-              <w:t xml:space="preserve">3</w:t>
-            </w:r>
-          </w:p>
-        </w:tc>
-        <w:tc>
-          <w:tcPr>
-            <w:tcW w:type="dxa" w:w="4510"/>
-            <w:tcMar>
-              <w:top w:type="dxa" w:w="80"/>
-              <w:left w:type="dxa" w:w="100"/>
-              <w:bottom w:type="dxa" w:w="80"/>
-              <w:right w:type="dxa" w:w="100"/>
-            </w:tcMar>
-          </w:tcPr>
-          <w:p>
-            <w:pPr>
-              <w:spacing w:after="0" w:line="270"/>
-            </w:pPr>
-            <w:r>
-              <w:rPr>
-                <w:rFonts w:ascii="Calibri" w:cs="Calibri" w:eastAsia="Calibri" w:hAnsi="Calibri"/>
-                <w:sz w:val="20"/>
-                <w:szCs w:val="20"/>
-              </w:rPr>
-              <w:t xml:space="preserve">Connexion refusée : le message reste volontairement vague sur la cause</w:t>
-            </w:r>
-          </w:p>
-        </w:tc>
-        <w:tc>
-          <w:tcPr>
-            <w:tcW w:type="dxa" w:w="3428"/>
-            <w:tcMar>
-              <w:top w:type="dxa" w:w="80"/>
-              <w:left w:type="dxa" w:w="100"/>
-              <w:bottom w:type="dxa" w:w="80"/>
-              <w:right w:type="dxa" w:w="100"/>
-            </w:tcMar>
-          </w:tcPr>
-          <w:p>
-            <w:pPr>
-              <w:spacing w:after="0" w:line="270"/>
-            </w:pPr>
-            <w:r>
-              <w:rPr>
-                <w:rFonts w:ascii="Calibri" w:cs="Calibri" w:eastAsia="Calibri" w:hAnsi="Calibri"/>
-                <w:sz w:val="20"/>
-                <w:szCs w:val="20"/>
-              </w:rPr>
-              <w:t xml:space="preserve">06_01b_connexion_erreur.png</w:t>
-            </w:r>
-          </w:p>
-        </w:tc>
-      </w:tr>
-      <w:tr>
-        <w:tc>
-          <w:tcPr>
-            <w:tcW w:type="dxa" w:w="1082"/>
-            <w:shd w:fill="F3F6FA" w:color="auto" w:val="clear"/>
-            <w:tcMar>
-              <w:top w:type="dxa" w:w="80"/>
-              <w:left w:type="dxa" w:w="100"/>
-              <w:bottom w:type="dxa" w:w="80"/>
-              <w:right w:type="dxa" w:w="100"/>
-            </w:tcMar>
-          </w:tcPr>
-          <w:p>
-            <w:pPr>
-              <w:spacing w:after="0" w:line="270"/>
-            </w:pPr>
-            <w:r>
-              <w:rPr>
-                <w:rFonts w:ascii="Calibri" w:cs="Calibri" w:eastAsia="Calibri" w:hAnsi="Calibri"/>
-                <w:sz w:val="20"/>
-                <w:szCs w:val="20"/>
-              </w:rPr>
-              <w:t xml:space="preserve">4</w:t>
-            </w:r>
-          </w:p>
-        </w:tc>
-        <w:tc>
-          <w:tcPr>
-            <w:tcW w:type="dxa" w:w="4510"/>
-            <w:shd w:fill="F3F6FA" w:color="auto" w:val="clear"/>
-            <w:tcMar>
-              <w:top w:type="dxa" w:w="80"/>
-              <w:left w:type="dxa" w:w="100"/>
-              <w:bottom w:type="dxa" w:w="80"/>
-              <w:right w:type="dxa" w:w="100"/>
-            </w:tcMar>
-          </w:tcPr>
-          <w:p>
-            <w:pPr>
-              <w:spacing w:after="0" w:line="270"/>
-            </w:pPr>
-            <w:r>
-              <w:rPr>
-                <w:rFonts w:ascii="Calibri" w:cs="Calibri" w:eastAsia="Calibri" w:hAnsi="Calibri"/>
-                <w:sz w:val="20"/>
-                <w:szCs w:val="20"/>
-              </w:rPr>
-              <w:t xml:space="preserve">Accueil du super administrateur : configuration et comptes</w:t>
-            </w:r>
-          </w:p>
-        </w:tc>
-        <w:tc>
-          <w:tcPr>
-            <w:tcW w:type="dxa" w:w="3428"/>
-            <w:shd w:fill="F3F6FA" w:color="auto" w:val="clear"/>
-            <w:tcMar>
-              <w:top w:type="dxa" w:w="80"/>
-              <w:left w:type="dxa" w:w="100"/>
-              <w:bottom w:type="dxa" w:w="80"/>
-              <w:right w:type="dxa" w:w="100"/>
-            </w:tcMar>
-          </w:tcPr>
-          <w:p>
-            <w:pPr>
-              <w:spacing w:after="0" w:line="270"/>
-            </w:pPr>
-            <w:r>
-              <w:rPr>
-                <w:rFonts w:ascii="Calibri" w:cs="Calibri" w:eastAsia="Calibri" w:hAnsi="Calibri"/>
-                <w:sz w:val="20"/>
-                <w:szCs w:val="20"/>
-              </w:rPr>
-              <w:t xml:space="preserve">05_accueil_superadmin.png</w:t>
-            </w:r>
-          </w:p>
-        </w:tc>
-      </w:tr>
-      <w:tr>
-        <w:tc>
-          <w:tcPr>
-            <w:tcW w:type="dxa" w:w="1082"/>
-            <w:tcMar>
-              <w:top w:type="dxa" w:w="80"/>
-              <w:left w:type="dxa" w:w="100"/>
-              <w:bottom w:type="dxa" w:w="80"/>
-              <w:right w:type="dxa" w:w="100"/>
-            </w:tcMar>
-          </w:tcPr>
-          <w:p>
-            <w:pPr>
-              <w:spacing w:after="0" w:line="270"/>
-            </w:pPr>
-            <w:r>
-              <w:rPr>
-                <w:rFonts w:ascii="Calibri" w:cs="Calibri" w:eastAsia="Calibri" w:hAnsi="Calibri"/>
-                <w:sz w:val="20"/>
-                <w:szCs w:val="20"/>
-              </w:rPr>
-              <w:t xml:space="preserve">5</w:t>
-            </w:r>
-          </w:p>
-        </w:tc>
-        <w:tc>
-          <w:tcPr>
-            <w:tcW w:type="dxa" w:w="4510"/>
-            <w:tcMar>
-              <w:top w:type="dxa" w:w="80"/>
-              <w:left w:type="dxa" w:w="100"/>
-              <w:bottom w:type="dxa" w:w="80"/>
-              <w:right w:type="dxa" w:w="100"/>
-            </w:tcMar>
-          </w:tcPr>
-          <w:p>
-            <w:pPr>
-              <w:spacing w:after="0" w:line="270"/>
-            </w:pPr>
-            <w:r>
-              <w:rPr>
-                <w:rFonts w:ascii="Calibri" w:cs="Calibri" w:eastAsia="Calibri" w:hAnsi="Calibri"/>
-                <w:sz w:val="20"/>
-                <w:szCs w:val="20"/>
-              </w:rPr>
-              <w:t xml:space="preserve">Accueil de l'auto-école : ses candidats, ses inscriptions, ses résultats</w:t>
-            </w:r>
-          </w:p>
-        </w:tc>
-        <w:tc>
-          <w:tcPr>
-            <w:tcW w:type="dxa" w:w="3428"/>
-            <w:tcMar>
-              <w:top w:type="dxa" w:w="80"/>
-              <w:left w:type="dxa" w:w="100"/>
-              <w:bottom w:type="dxa" w:w="80"/>
-              <w:right w:type="dxa" w:w="100"/>
-            </w:tcMar>
-          </w:tcPr>
-          <w:p>
-            <w:pPr>
-              <w:spacing w:after="0" w:line="270"/>
-            </w:pPr>
-            <w:r>
-              <w:rPr>
-                <w:rFonts w:ascii="Calibri" w:cs="Calibri" w:eastAsia="Calibri" w:hAnsi="Calibri"/>
-                <w:sz w:val="20"/>
-                <w:szCs w:val="20"/>
-              </w:rPr>
-              <w:t xml:space="preserve">05_accueil_auto_ecole.png</w:t>
-            </w:r>
-          </w:p>
-        </w:tc>
-      </w:tr>
-      <w:tr>
-        <w:tc>
-          <w:tcPr>
-            <w:tcW w:type="dxa" w:w="1082"/>
-            <w:shd w:fill="F3F6FA" w:color="auto" w:val="clear"/>
-            <w:tcMar>
-              <w:top w:type="dxa" w:w="80"/>
-              <w:left w:type="dxa" w:w="100"/>
-              <w:bottom w:type="dxa" w:w="80"/>
-              <w:right w:type="dxa" w:w="100"/>
-            </w:tcMar>
-          </w:tcPr>
-          <w:p>
-            <w:pPr>
-              <w:spacing w:after="0" w:line="270"/>
-            </w:pPr>
-            <w:r>
-              <w:rPr>
-                <w:rFonts w:ascii="Calibri" w:cs="Calibri" w:eastAsia="Calibri" w:hAnsi="Calibri"/>
-                <w:sz w:val="20"/>
-                <w:szCs w:val="20"/>
-              </w:rPr>
-              <w:t xml:space="preserve">6</w:t>
-            </w:r>
-          </w:p>
-        </w:tc>
-        <w:tc>
-          <w:tcPr>
-            <w:tcW w:type="dxa" w:w="4510"/>
-            <w:shd w:fill="F3F6FA" w:color="auto" w:val="clear"/>
-            <w:tcMar>
-              <w:top w:type="dxa" w:w="80"/>
-              <w:left w:type="dxa" w:w="100"/>
-              <w:bottom w:type="dxa" w:w="80"/>
-              <w:right w:type="dxa" w:w="100"/>
-            </w:tcMar>
-          </w:tcPr>
-          <w:p>
-            <w:pPr>
-              <w:spacing w:after="0" w:line="270"/>
-            </w:pPr>
-            <w:r>
-              <w:rPr>
-                <w:rFonts w:ascii="Calibri" w:cs="Calibri" w:eastAsia="Calibri" w:hAnsi="Calibri"/>
-                <w:sz w:val="20"/>
-                <w:szCs w:val="20"/>
-              </w:rPr>
-              <w:t xml:space="preserve">Accueil de l'examinateur : sessions du jour, évaluations</w:t>
-            </w:r>
-          </w:p>
-        </w:tc>
-        <w:tc>
-          <w:tcPr>
-            <w:tcW w:type="dxa" w:w="3428"/>
-            <w:shd w:fill="F3F6FA" w:color="auto" w:val="clear"/>
-            <w:tcMar>
-              <w:top w:type="dxa" w:w="80"/>
-              <w:left w:type="dxa" w:w="100"/>
-              <w:bottom w:type="dxa" w:w="80"/>
-              <w:right w:type="dxa" w:w="100"/>
-            </w:tcMar>
-          </w:tcPr>
-          <w:p>
-            <w:pPr>
-              <w:spacing w:after="0" w:line="270"/>
-            </w:pPr>
-            <w:r>
-              <w:rPr>
-                <w:rFonts w:ascii="Calibri" w:cs="Calibri" w:eastAsia="Calibri" w:hAnsi="Calibri"/>
-                <w:sz w:val="20"/>
-                <w:szCs w:val="20"/>
-              </w:rPr>
-              <w:t xml:space="preserve">05_accueil_examinateur.png</w:t>
-            </w:r>
-          </w:p>
-        </w:tc>
-      </w:tr>
-      <w:tr>
-        <w:tc>
-          <w:tcPr>
-            <w:tcW w:type="dxa" w:w="1082"/>
-            <w:tcMar>
-              <w:top w:type="dxa" w:w="80"/>
-              <w:left w:type="dxa" w:w="100"/>
-              <w:bottom w:type="dxa" w:w="80"/>
-              <w:right w:type="dxa" w:w="100"/>
-            </w:tcMar>
-          </w:tcPr>
-          <w:p>
-            <w:pPr>
-              <w:spacing w:after="0" w:line="270"/>
-            </w:pPr>
-            <w:r>
-              <w:rPr>
-                <w:rFonts w:ascii="Calibri" w:cs="Calibri" w:eastAsia="Calibri" w:hAnsi="Calibri"/>
-                <w:sz w:val="20"/>
-                <w:szCs w:val="20"/>
-              </w:rPr>
-              <w:t xml:space="preserve">7</w:t>
-            </w:r>
-          </w:p>
-        </w:tc>
-        <w:tc>
-          <w:tcPr>
-            <w:tcW w:type="dxa" w:w="4510"/>
-            <w:tcMar>
-              <w:top w:type="dxa" w:w="80"/>
-              <w:left w:type="dxa" w:w="100"/>
-              <w:bottom w:type="dxa" w:w="80"/>
-              <w:right w:type="dxa" w:w="100"/>
-            </w:tcMar>
-          </w:tcPr>
-          <w:p>
-            <w:pPr>
-              <w:spacing w:after="0" w:line="270"/>
-            </w:pPr>
-            <w:r>
-              <w:rPr>
-                <w:rFonts w:ascii="Calibri" w:cs="Calibri" w:eastAsia="Calibri" w:hAnsi="Calibri"/>
-                <w:sz w:val="20"/>
-                <w:szCs w:val="20"/>
-              </w:rPr>
-              <w:t xml:space="preserve">Accueil du candidat : son parcours</w:t>
-            </w:r>
-          </w:p>
-        </w:tc>
-        <w:tc>
-          <w:tcPr>
-            <w:tcW w:type="dxa" w:w="3428"/>
-            <w:tcMar>
-              <w:top w:type="dxa" w:w="80"/>
-              <w:left w:type="dxa" w:w="100"/>
-              <w:bottom w:type="dxa" w:w="80"/>
-              <w:right w:type="dxa" w:w="100"/>
-            </w:tcMar>
-          </w:tcPr>
-          <w:p>
-            <w:pPr>
-              <w:spacing w:after="0" w:line="270"/>
-            </w:pPr>
-            <w:r>
-              <w:rPr>
-                <w:rFonts w:ascii="Calibri" w:cs="Calibri" w:eastAsia="Calibri" w:hAnsi="Calibri"/>
-                <w:sz w:val="20"/>
-                <w:szCs w:val="20"/>
-              </w:rPr>
-              <w:t xml:space="preserve">05_accueil_candidat.png</w:t>
-            </w:r>
-          </w:p>
-        </w:tc>
-      </w:tr>
-      <w:tr>
-        <w:tc>
-          <w:tcPr>
-            <w:tcW w:type="dxa" w:w="1082"/>
-            <w:shd w:fill="F3F6FA" w:color="auto" w:val="clear"/>
-            <w:tcMar>
-              <w:top w:type="dxa" w:w="80"/>
-              <w:left w:type="dxa" w:w="100"/>
-              <w:bottom w:type="dxa" w:w="80"/>
-              <w:right w:type="dxa" w:w="100"/>
-            </w:tcMar>
-          </w:tcPr>
-          <w:p>
-            <w:pPr>
-              <w:spacing w:after="0" w:line="270"/>
-            </w:pPr>
-            <w:r>
-              <w:rPr>
-                <w:rFonts w:ascii="Calibri" w:cs="Calibri" w:eastAsia="Calibri" w:hAnsi="Calibri"/>
-                <w:sz w:val="20"/>
-                <w:szCs w:val="20"/>
-              </w:rPr>
-              <w:t xml:space="preserve">8</w:t>
-            </w:r>
-          </w:p>
-        </w:tc>
-        <w:tc>
-          <w:tcPr>
-            <w:tcW w:type="dxa" w:w="4510"/>
-            <w:shd w:fill="F3F6FA" w:color="auto" w:val="clear"/>
-            <w:tcMar>
-              <w:top w:type="dxa" w:w="80"/>
-              <w:left w:type="dxa" w:w="100"/>
-              <w:bottom w:type="dxa" w:w="80"/>
-              <w:right w:type="dxa" w:w="100"/>
-            </w:tcMar>
-          </w:tcPr>
-          <w:p>
-            <w:pPr>
-              <w:spacing w:after="0" w:line="270"/>
-            </w:pPr>
-            <w:r>
-              <w:rPr>
-                <w:rFonts w:ascii="Calibri" w:cs="Calibri" w:eastAsia="Calibri" w:hAnsi="Calibri"/>
-                <w:sz w:val="20"/>
-                <w:szCs w:val="20"/>
-              </w:rPr>
-              <w:t xml:space="preserve">Épreuve théorique de la catégorie B : barème versionné et questions</w:t>
-            </w:r>
-          </w:p>
-        </w:tc>
-        <w:tc>
-          <w:tcPr>
-            <w:tcW w:type="dxa" w:w="3428"/>
-            <w:shd w:fill="F3F6FA" w:color="auto" w:val="clear"/>
-            <w:tcMar>
-              <w:top w:type="dxa" w:w="80"/>
-              <w:left w:type="dxa" w:w="100"/>
-              <w:bottom w:type="dxa" w:w="80"/>
-              <w:right w:type="dxa" w:w="100"/>
-            </w:tcMar>
-          </w:tcPr>
-          <w:p>
-            <w:pPr>
-              <w:spacing w:after="0" w:line="270"/>
-            </w:pPr>
-            <w:r>
-              <w:rPr>
-                <w:rFonts w:ascii="Calibri" w:cs="Calibri" w:eastAsia="Calibri" w:hAnsi="Calibri"/>
-                <w:sz w:val="20"/>
-                <w:szCs w:val="20"/>
-              </w:rPr>
-              <w:t xml:space="preserve">06_02_configuration.png</w:t>
-            </w:r>
-          </w:p>
-        </w:tc>
-      </w:tr>
-      <w:tr>
-        <w:tc>
-          <w:tcPr>
-            <w:tcW w:type="dxa" w:w="1082"/>
-            <w:tcMar>
-              <w:top w:type="dxa" w:w="80"/>
-              <w:left w:type="dxa" w:w="100"/>
-              <w:bottom w:type="dxa" w:w="80"/>
-              <w:right w:type="dxa" w:w="100"/>
-            </w:tcMar>
-          </w:tcPr>
-          <w:p>
-            <w:pPr>
-              <w:spacing w:after="0" w:line="270"/>
-            </w:pPr>
-            <w:r>
-              <w:rPr>
-                <w:rFonts w:ascii="Calibri" w:cs="Calibri" w:eastAsia="Calibri" w:hAnsi="Calibri"/>
-                <w:sz w:val="20"/>
-                <w:szCs w:val="20"/>
-              </w:rPr>
-              <w:t xml:space="preserve">9</w:t>
-            </w:r>
-          </w:p>
-        </w:tc>
-        <w:tc>
-          <w:tcPr>
-            <w:tcW w:type="dxa" w:w="4510"/>
-            <w:tcMar>
-              <w:top w:type="dxa" w:w="80"/>
-              <w:left w:type="dxa" w:w="100"/>
-              <w:bottom w:type="dxa" w:w="80"/>
-              <w:right w:type="dxa" w:w="100"/>
-            </w:tcMar>
-          </w:tcPr>
-          <w:p>
-            <w:pPr>
-              <w:spacing w:after="0" w:line="270"/>
-            </w:pPr>
-            <w:r>
-              <w:rPr>
-                <w:rFonts w:ascii="Calibri" w:cs="Calibri" w:eastAsia="Calibri" w:hAnsi="Calibri"/>
-                <w:sz w:val="20"/>
-                <w:szCs w:val="20"/>
-              </w:rPr>
-              <w:t xml:space="preserve">Les catégories de permis, point d'entrée de la configuration</w:t>
-            </w:r>
-          </w:p>
-        </w:tc>
-        <w:tc>
-          <w:tcPr>
-            <w:tcW w:type="dxa" w:w="3428"/>
-            <w:tcMar>
-              <w:top w:type="dxa" w:w="80"/>
-              <w:left w:type="dxa" w:w="100"/>
-              <w:bottom w:type="dxa" w:w="80"/>
-              <w:right w:type="dxa" w:w="100"/>
-            </w:tcMar>
-          </w:tcPr>
-          <w:p>
-            <w:pPr>
-              <w:spacing w:after="0" w:line="270"/>
-            </w:pPr>
-            <w:r>
-              <w:rPr>
-                <w:rFonts w:ascii="Calibri" w:cs="Calibri" w:eastAsia="Calibri" w:hAnsi="Calibri"/>
-                <w:sz w:val="20"/>
-                <w:szCs w:val="20"/>
-              </w:rPr>
-              <w:t xml:space="preserve">06_02b_categories.png</w:t>
-            </w:r>
-          </w:p>
-        </w:tc>
-      </w:tr>
-      <w:tr>
-        <w:tc>
-          <w:tcPr>
-            <w:tcW w:type="dxa" w:w="1082"/>
-            <w:shd w:fill="F3F6FA" w:color="auto" w:val="clear"/>
-            <w:tcMar>
-              <w:top w:type="dxa" w:w="80"/>
-              <w:left w:type="dxa" w:w="100"/>
-              <w:bottom w:type="dxa" w:w="80"/>
-              <w:right w:type="dxa" w:w="100"/>
-            </w:tcMar>
-          </w:tcPr>
-          <w:p>
-            <w:pPr>
-              <w:spacing w:after="0" w:line="270"/>
-            </w:pPr>
-            <w:r>
-              <w:rPr>
-                <w:rFonts w:ascii="Calibri" w:cs="Calibri" w:eastAsia="Calibri" w:hAnsi="Calibri"/>
-                <w:sz w:val="20"/>
-                <w:szCs w:val="20"/>
-              </w:rPr>
-              <w:t xml:space="preserve">10</w:t>
-            </w:r>
-          </w:p>
-        </w:tc>
-        <w:tc>
-          <w:tcPr>
-            <w:tcW w:type="dxa" w:w="4510"/>
-            <w:shd w:fill="F3F6FA" w:color="auto" w:val="clear"/>
-            <w:tcMar>
-              <w:top w:type="dxa" w:w="80"/>
-              <w:left w:type="dxa" w:w="100"/>
-              <w:bottom w:type="dxa" w:w="80"/>
-              <w:right w:type="dxa" w:w="100"/>
-            </w:tcMar>
-          </w:tcPr>
-          <w:p>
-            <w:pPr>
-              <w:spacing w:after="0" w:line="270"/>
-            </w:pPr>
-            <w:r>
-              <w:rPr>
-                <w:rFonts w:ascii="Calibri" w:cs="Calibri" w:eastAsia="Calibri" w:hAnsi="Calibri"/>
-                <w:sz w:val="20"/>
-                <w:szCs w:val="20"/>
-              </w:rPr>
-              <w:t xml:space="preserve">Les comptes, vus par le super administrateur</w:t>
-            </w:r>
-          </w:p>
-        </w:tc>
-        <w:tc>
-          <w:tcPr>
-            <w:tcW w:type="dxa" w:w="3428"/>
-            <w:shd w:fill="F3F6FA" w:color="auto" w:val="clear"/>
-            <w:tcMar>
-              <w:top w:type="dxa" w:w="80"/>
-              <w:left w:type="dxa" w:w="100"/>
-              <w:bottom w:type="dxa" w:w="80"/>
-              <w:right w:type="dxa" w:w="100"/>
-            </w:tcMar>
-          </w:tcPr>
-          <w:p>
-            <w:pPr>
-              <w:spacing w:after="0" w:line="270"/>
-            </w:pPr>
-            <w:r>
-              <w:rPr>
-                <w:rFonts w:ascii="Calibri" w:cs="Calibri" w:eastAsia="Calibri" w:hAnsi="Calibri"/>
-                <w:sz w:val="20"/>
-                <w:szCs w:val="20"/>
-              </w:rPr>
-              <w:t xml:space="preserve">05_comptes.png</w:t>
-            </w:r>
-          </w:p>
-        </w:tc>
-      </w:tr>
-      <w:tr>
-        <w:tc>
-          <w:tcPr>
-            <w:tcW w:type="dxa" w:w="1082"/>
-            <w:tcMar>
-              <w:top w:type="dxa" w:w="80"/>
-              <w:left w:type="dxa" w:w="100"/>
-              <w:bottom w:type="dxa" w:w="80"/>
-              <w:right w:type="dxa" w:w="100"/>
-            </w:tcMar>
-          </w:tcPr>
-          <w:p>
-            <w:pPr>
-              <w:spacing w:after="0" w:line="270"/>
-            </w:pPr>
-            <w:r>
-              <w:rPr>
-                <w:rFonts w:ascii="Calibri" w:cs="Calibri" w:eastAsia="Calibri" w:hAnsi="Calibri"/>
-                <w:sz w:val="20"/>
-                <w:szCs w:val="20"/>
-              </w:rPr>
-              <w:t xml:space="preserve">11</w:t>
-            </w:r>
-          </w:p>
-        </w:tc>
-        <w:tc>
-          <w:tcPr>
-            <w:tcW w:type="dxa" w:w="4510"/>
-            <w:tcMar>
-              <w:top w:type="dxa" w:w="80"/>
-              <w:left w:type="dxa" w:w="100"/>
-              <w:bottom w:type="dxa" w:w="80"/>
-              <w:right w:type="dxa" w:w="100"/>
-            </w:tcMar>
-          </w:tcPr>
-          <w:p>
-            <w:pPr>
-              <w:spacing w:after="0" w:line="270"/>
-            </w:pPr>
-            <w:r>
-              <w:rPr>
-                <w:rFonts w:ascii="Calibri" w:cs="Calibri" w:eastAsia="Calibri" w:hAnsi="Calibri"/>
-                <w:sz w:val="20"/>
-                <w:szCs w:val="20"/>
-              </w:rPr>
-              <w:t xml:space="preserve">Liste des centres, rattachés à leur région</w:t>
-            </w:r>
-          </w:p>
-        </w:tc>
-        <w:tc>
-          <w:tcPr>
-            <w:tcW w:type="dxa" w:w="3428"/>
-            <w:tcMar>
-              <w:top w:type="dxa" w:w="80"/>
-              <w:left w:type="dxa" w:w="100"/>
-              <w:bottom w:type="dxa" w:w="80"/>
-              <w:right w:type="dxa" w:w="100"/>
-            </w:tcMar>
-          </w:tcPr>
-          <w:p>
-            <w:pPr>
-              <w:spacing w:after="0" w:line="270"/>
-            </w:pPr>
-            <w:r>
-              <w:rPr>
-                <w:rFonts w:ascii="Calibri" w:cs="Calibri" w:eastAsia="Calibri" w:hAnsi="Calibri"/>
-                <w:sz w:val="20"/>
-                <w:szCs w:val="20"/>
-              </w:rPr>
-              <w:t xml:space="preserve">06_03_centre.png</w:t>
-            </w:r>
-          </w:p>
-        </w:tc>
-      </w:tr>
-      <w:tr>
-        <w:tc>
-          <w:tcPr>
-            <w:tcW w:type="dxa" w:w="1082"/>
-            <w:shd w:fill="F3F6FA" w:color="auto" w:val="clear"/>
-            <w:tcMar>
-              <w:top w:type="dxa" w:w="80"/>
-              <w:left w:type="dxa" w:w="100"/>
-              <w:bottom w:type="dxa" w:w="80"/>
-              <w:right w:type="dxa" w:w="100"/>
-            </w:tcMar>
-          </w:tcPr>
-          <w:p>
-            <w:pPr>
-              <w:spacing w:after="0" w:line="270"/>
-            </w:pPr>
-            <w:r>
-              <w:rPr>
-                <w:rFonts w:ascii="Calibri" w:cs="Calibri" w:eastAsia="Calibri" w:hAnsi="Calibri"/>
-                <w:sz w:val="20"/>
-                <w:szCs w:val="20"/>
-              </w:rPr>
-              <w:t xml:space="preserve">12</w:t>
-            </w:r>
-          </w:p>
-        </w:tc>
-        <w:tc>
-          <w:tcPr>
-            <w:tcW w:type="dxa" w:w="4510"/>
-            <w:shd w:fill="F3F6FA" w:color="auto" w:val="clear"/>
-            <w:tcMar>
-              <w:top w:type="dxa" w:w="80"/>
-              <w:left w:type="dxa" w:w="100"/>
-              <w:bottom w:type="dxa" w:w="80"/>
-              <w:right w:type="dxa" w:w="100"/>
-            </w:tcMar>
-          </w:tcPr>
-          <w:p>
-            <w:pPr>
-              <w:spacing w:after="0" w:line="270"/>
-            </w:pPr>
-            <w:r>
-              <w:rPr>
-                <w:rFonts w:ascii="Calibri" w:cs="Calibri" w:eastAsia="Calibri" w:hAnsi="Calibri"/>
-                <w:sz w:val="20"/>
-                <w:szCs w:val="20"/>
-              </w:rPr>
-              <w:t xml:space="preserve">Fiche d'une auto-école et ses comptes</w:t>
-            </w:r>
-          </w:p>
-        </w:tc>
-        <w:tc>
-          <w:tcPr>
-            <w:tcW w:type="dxa" w:w="3428"/>
-            <w:shd w:fill="F3F6FA" w:color="auto" w:val="clear"/>
-            <w:tcMar>
-              <w:top w:type="dxa" w:w="80"/>
-              <w:left w:type="dxa" w:w="100"/>
-              <w:bottom w:type="dxa" w:w="80"/>
-              <w:right w:type="dxa" w:w="100"/>
-            </w:tcMar>
-          </w:tcPr>
-          <w:p>
-            <w:pPr>
-              <w:spacing w:after="0" w:line="270"/>
-            </w:pPr>
-            <w:r>
-              <w:rPr>
-                <w:rFonts w:ascii="Calibri" w:cs="Calibri" w:eastAsia="Calibri" w:hAnsi="Calibri"/>
-                <w:sz w:val="20"/>
-                <w:szCs w:val="20"/>
-              </w:rPr>
-              <w:t xml:space="preserve">06_04_auto_ecole.png</w:t>
-            </w:r>
-          </w:p>
-        </w:tc>
-      </w:tr>
-      <w:tr>
-        <w:tc>
-          <w:tcPr>
-            <w:tcW w:type="dxa" w:w="1082"/>
-            <w:tcMar>
-              <w:top w:type="dxa" w:w="80"/>
-              <w:left w:type="dxa" w:w="100"/>
-              <w:bottom w:type="dxa" w:w="80"/>
-              <w:right w:type="dxa" w:w="100"/>
-            </w:tcMar>
-          </w:tcPr>
-          <w:p>
-            <w:pPr>
-              <w:spacing w:after="0" w:line="270"/>
-            </w:pPr>
-            <w:r>
-              <w:rPr>
-                <w:rFonts w:ascii="Calibri" w:cs="Calibri" w:eastAsia="Calibri" w:hAnsi="Calibri"/>
-                <w:sz w:val="20"/>
-                <w:szCs w:val="20"/>
-              </w:rPr>
-              <w:t xml:space="preserve">13</w:t>
-            </w:r>
-          </w:p>
-        </w:tc>
-        <w:tc>
-          <w:tcPr>
-            <w:tcW w:type="dxa" w:w="4510"/>
-            <w:tcMar>
-              <w:top w:type="dxa" w:w="80"/>
-              <w:left w:type="dxa" w:w="100"/>
-              <w:bottom w:type="dxa" w:w="80"/>
-              <w:right w:type="dxa" w:w="100"/>
-            </w:tcMar>
-          </w:tcPr>
-          <w:p>
-            <w:pPr>
-              <w:spacing w:after="0" w:line="270"/>
-            </w:pPr>
-            <w:r>
-              <w:rPr>
-                <w:rFonts w:ascii="Calibri" w:cs="Calibri" w:eastAsia="Calibri" w:hAnsi="Calibri"/>
-                <w:sz w:val="20"/>
-                <w:szCs w:val="20"/>
-              </w:rPr>
-              <w:t xml:space="preserve">Création d'un examinateur avec son compte</w:t>
-            </w:r>
-          </w:p>
-        </w:tc>
-        <w:tc>
-          <w:tcPr>
-            <w:tcW w:type="dxa" w:w="3428"/>
-            <w:tcMar>
-              <w:top w:type="dxa" w:w="80"/>
-              <w:left w:type="dxa" w:w="100"/>
-              <w:bottom w:type="dxa" w:w="80"/>
-              <w:right w:type="dxa" w:w="100"/>
-            </w:tcMar>
-          </w:tcPr>
-          <w:p>
-            <w:pPr>
-              <w:spacing w:after="0" w:line="270"/>
-            </w:pPr>
-            <w:r>
-              <w:rPr>
-                <w:rFonts w:ascii="Calibri" w:cs="Calibri" w:eastAsia="Calibri" w:hAnsi="Calibri"/>
-                <w:sz w:val="20"/>
-                <w:szCs w:val="20"/>
-              </w:rPr>
-              <w:t xml:space="preserve">06_05_examinateur.png</w:t>
-            </w:r>
-          </w:p>
-        </w:tc>
-      </w:tr>
-      <w:tr>
-        <w:tc>
-          <w:tcPr>
-            <w:tcW w:type="dxa" w:w="1082"/>
-            <w:shd w:fill="F3F6FA" w:color="auto" w:val="clear"/>
-            <w:tcMar>
-              <w:top w:type="dxa" w:w="80"/>
-              <w:left w:type="dxa" w:w="100"/>
-              <w:bottom w:type="dxa" w:w="80"/>
-              <w:right w:type="dxa" w:w="100"/>
-            </w:tcMar>
-          </w:tcPr>
-          <w:p>
-            <w:pPr>
-              <w:spacing w:after="0" w:line="270"/>
-            </w:pPr>
-            <w:r>
-              <w:rPr>
-                <w:rFonts w:ascii="Calibri" w:cs="Calibri" w:eastAsia="Calibri" w:hAnsi="Calibri"/>
-                <w:sz w:val="20"/>
-                <w:szCs w:val="20"/>
-              </w:rPr>
-              <w:t xml:space="preserve">14</w:t>
-            </w:r>
-          </w:p>
-        </w:tc>
-        <w:tc>
-          <w:tcPr>
-            <w:tcW w:type="dxa" w:w="4510"/>
-            <w:shd w:fill="F3F6FA" w:color="auto" w:val="clear"/>
-            <w:tcMar>
-              <w:top w:type="dxa" w:w="80"/>
-              <w:left w:type="dxa" w:w="100"/>
-              <w:bottom w:type="dxa" w:w="80"/>
-              <w:right w:type="dxa" w:w="100"/>
-            </w:tcMar>
-          </w:tcPr>
-          <w:p>
-            <w:pPr>
-              <w:spacing w:after="0" w:line="270"/>
-            </w:pPr>
-            <w:r>
-              <w:rPr>
-                <w:rFonts w:ascii="Calibri" w:cs="Calibri" w:eastAsia="Calibri" w:hAnsi="Calibri"/>
-                <w:sz w:val="20"/>
-                <w:szCs w:val="20"/>
-              </w:rPr>
-              <w:t xml:space="preserve">Dossier constitué par l'auto-école, prêt à être soumis</w:t>
-            </w:r>
-          </w:p>
-        </w:tc>
-        <w:tc>
-          <w:tcPr>
-            <w:tcW w:type="dxa" w:w="3428"/>
-            <w:shd w:fill="F3F6FA" w:color="auto" w:val="clear"/>
-            <w:tcMar>
-              <w:top w:type="dxa" w:w="80"/>
-              <w:left w:type="dxa" w:w="100"/>
-              <w:bottom w:type="dxa" w:w="80"/>
-              <w:right w:type="dxa" w:w="100"/>
-            </w:tcMar>
-          </w:tcPr>
-          <w:p>
-            <w:pPr>
-              <w:spacing w:after="0" w:line="270"/>
-            </w:pPr>
-            <w:r>
-              <w:rPr>
-                <w:rFonts w:ascii="Calibri" w:cs="Calibri" w:eastAsia="Calibri" w:hAnsi="Calibri"/>
-                <w:sz w:val="20"/>
-                <w:szCs w:val="20"/>
-              </w:rPr>
-              <w:t xml:space="preserve">06_06_dossier.png</w:t>
-            </w:r>
-          </w:p>
-        </w:tc>
-      </w:tr>
-      <w:tr>
-        <w:tc>
-          <w:tcPr>
-            <w:tcW w:type="dxa" w:w="1082"/>
-            <w:tcMar>
-              <w:top w:type="dxa" w:w="80"/>
-              <w:left w:type="dxa" w:w="100"/>
-              <w:bottom w:type="dxa" w:w="80"/>
-              <w:right w:type="dxa" w:w="100"/>
-            </w:tcMar>
-          </w:tcPr>
-          <w:p>
-            <w:pPr>
-              <w:spacing w:after="0" w:line="270"/>
-            </w:pPr>
-            <w:r>
-              <w:rPr>
-                <w:rFonts w:ascii="Calibri" w:cs="Calibri" w:eastAsia="Calibri" w:hAnsi="Calibri"/>
-                <w:sz w:val="20"/>
-                <w:szCs w:val="20"/>
-              </w:rPr>
-              <w:t xml:space="preserve">15</w:t>
-            </w:r>
-          </w:p>
-        </w:tc>
-        <w:tc>
-          <w:tcPr>
-            <w:tcW w:type="dxa" w:w="4510"/>
-            <w:tcMar>
-              <w:top w:type="dxa" w:w="80"/>
-              <w:left w:type="dxa" w:w="100"/>
-              <w:bottom w:type="dxa" w:w="80"/>
-              <w:right w:type="dxa" w:w="100"/>
-            </w:tcMar>
-          </w:tcPr>
-          <w:p>
-            <w:pPr>
-              <w:spacing w:after="0" w:line="270"/>
-            </w:pPr>
-            <w:r>
-              <w:rPr>
-                <w:rFonts w:ascii="Calibri" w:cs="Calibri" w:eastAsia="Calibri" w:hAnsi="Calibri"/>
-                <w:sz w:val="20"/>
-                <w:szCs w:val="20"/>
-              </w:rPr>
-              <w:t xml:space="preserve">« Mes candidats » : l'auto-école ne voit que les siens</w:t>
-            </w:r>
-          </w:p>
-        </w:tc>
-        <w:tc>
-          <w:tcPr>
-            <w:tcW w:type="dxa" w:w="3428"/>
-            <w:tcMar>
-              <w:top w:type="dxa" w:w="80"/>
-              <w:left w:type="dxa" w:w="100"/>
-              <w:bottom w:type="dxa" w:w="80"/>
-              <w:right w:type="dxa" w:w="100"/>
-            </w:tcMar>
-          </w:tcPr>
-          <w:p>
-            <w:pPr>
-              <w:spacing w:after="0" w:line="270"/>
-            </w:pPr>
-            <w:r>
-              <w:rPr>
-                <w:rFonts w:ascii="Calibri" w:cs="Calibri" w:eastAsia="Calibri" w:hAnsi="Calibri"/>
-                <w:sz w:val="20"/>
-                <w:szCs w:val="20"/>
-              </w:rPr>
-              <w:t xml:space="preserve">06_06a_mes_candidats.png</w:t>
-            </w:r>
-          </w:p>
-        </w:tc>
-      </w:tr>
-      <w:tr>
-        <w:tc>
-          <w:tcPr>
-            <w:tcW w:type="dxa" w:w="1082"/>
-            <w:shd w:fill="F3F6FA" w:color="auto" w:val="clear"/>
-            <w:tcMar>
-              <w:top w:type="dxa" w:w="80"/>
-              <w:left w:type="dxa" w:w="100"/>
-              <w:bottom w:type="dxa" w:w="80"/>
-              <w:right w:type="dxa" w:w="100"/>
-            </w:tcMar>
-          </w:tcPr>
-          <w:p>
-            <w:pPr>
-              <w:spacing w:after="0" w:line="270"/>
-            </w:pPr>
-            <w:r>
-              <w:rPr>
-                <w:rFonts w:ascii="Calibri" w:cs="Calibri" w:eastAsia="Calibri" w:hAnsi="Calibri"/>
-                <w:sz w:val="20"/>
-                <w:szCs w:val="20"/>
-              </w:rPr>
-              <w:t xml:space="preserve">16</w:t>
-            </w:r>
-          </w:p>
-        </w:tc>
-        <w:tc>
-          <w:tcPr>
-            <w:tcW w:type="dxa" w:w="4510"/>
-            <w:shd w:fill="F3F6FA" w:color="auto" w:val="clear"/>
-            <w:tcMar>
-              <w:top w:type="dxa" w:w="80"/>
-              <w:left w:type="dxa" w:w="100"/>
-              <w:bottom w:type="dxa" w:w="80"/>
-              <w:right w:type="dxa" w:w="100"/>
-            </w:tcMar>
-          </w:tcPr>
-          <w:p>
-            <w:pPr>
-              <w:spacing w:after="0" w:line="270"/>
-            </w:pPr>
-            <w:r>
-              <w:rPr>
-                <w:rFonts w:ascii="Calibri" w:cs="Calibri" w:eastAsia="Calibri" w:hAnsi="Calibri"/>
-                <w:sz w:val="20"/>
-                <w:szCs w:val="20"/>
-              </w:rPr>
-              <w:t xml:space="preserve">Pièce du dossier avec un fichier joint : ouvrir, remplacer, retirer</w:t>
-            </w:r>
-          </w:p>
-        </w:tc>
-        <w:tc>
-          <w:tcPr>
-            <w:tcW w:type="dxa" w:w="3428"/>
-            <w:shd w:fill="F3F6FA" w:color="auto" w:val="clear"/>
-            <w:tcMar>
-              <w:top w:type="dxa" w:w="80"/>
-              <w:left w:type="dxa" w:w="100"/>
-              <w:bottom w:type="dxa" w:w="80"/>
-              <w:right w:type="dxa" w:w="100"/>
-            </w:tcMar>
-          </w:tcPr>
-          <w:p>
-            <w:pPr>
-              <w:spacing w:after="0" w:line="270"/>
-            </w:pPr>
-            <w:r>
-              <w:rPr>
-                <w:rFonts w:ascii="Calibri" w:cs="Calibri" w:eastAsia="Calibri" w:hAnsi="Calibri"/>
-                <w:sz w:val="20"/>
-                <w:szCs w:val="20"/>
-              </w:rPr>
-              <w:t xml:space="preserve">06_06b_piece_jointe.png</w:t>
-            </w:r>
-          </w:p>
-        </w:tc>
-      </w:tr>
-      <w:tr>
-        <w:tc>
-          <w:tcPr>
-            <w:tcW w:type="dxa" w:w="1082"/>
-            <w:tcMar>
-              <w:top w:type="dxa" w:w="80"/>
-              <w:left w:type="dxa" w:w="100"/>
-              <w:bottom w:type="dxa" w:w="80"/>
-              <w:right w:type="dxa" w:w="100"/>
-            </w:tcMar>
-          </w:tcPr>
-          <w:p>
-            <w:pPr>
-              <w:spacing w:after="0" w:line="270"/>
-            </w:pPr>
-            <w:r>
-              <w:rPr>
-                <w:rFonts w:ascii="Calibri" w:cs="Calibri" w:eastAsia="Calibri" w:hAnsi="Calibri"/>
-                <w:sz w:val="20"/>
-                <w:szCs w:val="20"/>
-              </w:rPr>
-              <w:t xml:space="preserve">17</w:t>
-            </w:r>
-          </w:p>
-        </w:tc>
-        <w:tc>
-          <w:tcPr>
-            <w:tcW w:type="dxa" w:w="4510"/>
-            <w:tcMar>
-              <w:top w:type="dxa" w:w="80"/>
-              <w:left w:type="dxa" w:w="100"/>
-              <w:bottom w:type="dxa" w:w="80"/>
-              <w:right w:type="dxa" w:w="100"/>
-            </w:tcMar>
-          </w:tcPr>
-          <w:p>
-            <w:pPr>
-              <w:spacing w:after="0" w:line="270"/>
-            </w:pPr>
-            <w:r>
-              <w:rPr>
-                <w:rFonts w:ascii="Calibri" w:cs="Calibri" w:eastAsia="Calibri" w:hAnsi="Calibri"/>
-                <w:sz w:val="20"/>
-                <w:szCs w:val="20"/>
-              </w:rPr>
-              <w:t xml:space="preserve">La pièce jointe ouverte par l'ATT ou l'auto-école</w:t>
-            </w:r>
-          </w:p>
-        </w:tc>
-        <w:tc>
-          <w:tcPr>
-            <w:tcW w:type="dxa" w:w="3428"/>
-            <w:tcMar>
-              <w:top w:type="dxa" w:w="80"/>
-              <w:left w:type="dxa" w:w="100"/>
-              <w:bottom w:type="dxa" w:w="80"/>
-              <w:right w:type="dxa" w:w="100"/>
-            </w:tcMar>
-          </w:tcPr>
-          <w:p>
-            <w:pPr>
-              <w:spacing w:after="0" w:line="270"/>
-            </w:pPr>
-            <w:r>
-              <w:rPr>
-                <w:rFonts w:ascii="Calibri" w:cs="Calibri" w:eastAsia="Calibri" w:hAnsi="Calibri"/>
-                <w:sz w:val="20"/>
-                <w:szCs w:val="20"/>
-              </w:rPr>
-              <w:t xml:space="preserve">06_06c_piece_ouverte.png</w:t>
-            </w:r>
-          </w:p>
-        </w:tc>
-      </w:tr>
-      <w:tr>
-        <w:tc>
-          <w:tcPr>
-            <w:tcW w:type="dxa" w:w="1082"/>
-            <w:shd w:fill="F3F6FA" w:color="auto" w:val="clear"/>
-            <w:tcMar>
-              <w:top w:type="dxa" w:w="80"/>
-              <w:left w:type="dxa" w:w="100"/>
-              <w:bottom w:type="dxa" w:w="80"/>
-              <w:right w:type="dxa" w:w="100"/>
-            </w:tcMar>
-          </w:tcPr>
-          <w:p>
-            <w:pPr>
-              <w:spacing w:after="0" w:line="270"/>
-            </w:pPr>
-            <w:r>
-              <w:rPr>
-                <w:rFonts w:ascii="Calibri" w:cs="Calibri" w:eastAsia="Calibri" w:hAnsi="Calibri"/>
-                <w:sz w:val="20"/>
-                <w:szCs w:val="20"/>
-              </w:rPr>
-              <w:t xml:space="preserve">18</w:t>
-            </w:r>
-          </w:p>
-        </w:tc>
-        <w:tc>
-          <w:tcPr>
-            <w:tcW w:type="dxa" w:w="4510"/>
-            <w:shd w:fill="F3F6FA" w:color="auto" w:val="clear"/>
-            <w:tcMar>
-              <w:top w:type="dxa" w:w="80"/>
-              <w:left w:type="dxa" w:w="100"/>
-              <w:bottom w:type="dxa" w:w="80"/>
-              <w:right w:type="dxa" w:w="100"/>
-            </w:tcMar>
-          </w:tcPr>
-          <w:p>
-            <w:pPr>
-              <w:spacing w:after="0" w:line="270"/>
-            </w:pPr>
-            <w:r>
-              <w:rPr>
-                <w:rFonts w:ascii="Calibri" w:cs="Calibri" w:eastAsia="Calibri" w:hAnsi="Calibri"/>
-                <w:sz w:val="20"/>
-                <w:szCs w:val="20"/>
-              </w:rPr>
-              <w:t xml:space="preserve">Décision de l'ATT : valider, incomplet ou refuser avec motif</w:t>
-            </w:r>
-          </w:p>
-        </w:tc>
-        <w:tc>
-          <w:tcPr>
-            <w:tcW w:type="dxa" w:w="3428"/>
-            <w:shd w:fill="F3F6FA" w:color="auto" w:val="clear"/>
-            <w:tcMar>
-              <w:top w:type="dxa" w:w="80"/>
-              <w:left w:type="dxa" w:w="100"/>
-              <w:bottom w:type="dxa" w:w="80"/>
-              <w:right w:type="dxa" w:w="100"/>
-            </w:tcMar>
-          </w:tcPr>
-          <w:p>
-            <w:pPr>
-              <w:spacing w:after="0" w:line="270"/>
-            </w:pPr>
-            <w:r>
-              <w:rPr>
-                <w:rFonts w:ascii="Calibri" w:cs="Calibri" w:eastAsia="Calibri" w:hAnsi="Calibri"/>
-                <w:sz w:val="20"/>
-                <w:szCs w:val="20"/>
-              </w:rPr>
-              <w:t xml:space="preserve">06_07_decision.png</w:t>
-            </w:r>
-          </w:p>
-        </w:tc>
-      </w:tr>
-      <w:tr>
-        <w:tc>
-          <w:tcPr>
-            <w:tcW w:type="dxa" w:w="1082"/>
-            <w:tcMar>
-              <w:top w:type="dxa" w:w="80"/>
-              <w:left w:type="dxa" w:w="100"/>
-              <w:bottom w:type="dxa" w:w="80"/>
-              <w:right w:type="dxa" w:w="100"/>
-            </w:tcMar>
-          </w:tcPr>
-          <w:p>
-            <w:pPr>
-              <w:spacing w:after="0" w:line="270"/>
-            </w:pPr>
-            <w:r>
-              <w:rPr>
-                <w:rFonts w:ascii="Calibri" w:cs="Calibri" w:eastAsia="Calibri" w:hAnsi="Calibri"/>
-                <w:sz w:val="20"/>
-                <w:szCs w:val="20"/>
-              </w:rPr>
-              <w:t xml:space="preserve">19</w:t>
-            </w:r>
-          </w:p>
-        </w:tc>
-        <w:tc>
-          <w:tcPr>
-            <w:tcW w:type="dxa" w:w="4510"/>
-            <w:tcMar>
-              <w:top w:type="dxa" w:w="80"/>
-              <w:left w:type="dxa" w:w="100"/>
-              <w:bottom w:type="dxa" w:w="80"/>
-              <w:right w:type="dxa" w:w="100"/>
-            </w:tcMar>
-          </w:tcPr>
-          <w:p>
-            <w:pPr>
-              <w:spacing w:after="0" w:line="270"/>
-            </w:pPr>
-            <w:r>
-              <w:rPr>
-                <w:rFonts w:ascii="Calibri" w:cs="Calibri" w:eastAsia="Calibri" w:hAnsi="Calibri"/>
-                <w:sz w:val="20"/>
-                <w:szCs w:val="20"/>
-              </w:rPr>
-              <w:t xml:space="preserve">« Dossiers à traiter » : la file des dossiers soumis, vue par l'ATT</w:t>
-            </w:r>
-          </w:p>
-        </w:tc>
-        <w:tc>
-          <w:tcPr>
-            <w:tcW w:type="dxa" w:w="3428"/>
-            <w:tcMar>
-              <w:top w:type="dxa" w:w="80"/>
-              <w:left w:type="dxa" w:w="100"/>
-              <w:bottom w:type="dxa" w:w="80"/>
-              <w:right w:type="dxa" w:w="100"/>
-            </w:tcMar>
-          </w:tcPr>
-          <w:p>
-            <w:pPr>
-              <w:spacing w:after="0" w:line="270"/>
-            </w:pPr>
-            <w:r>
-              <w:rPr>
-                <w:rFonts w:ascii="Calibri" w:cs="Calibri" w:eastAsia="Calibri" w:hAnsi="Calibri"/>
-                <w:sz w:val="20"/>
-                <w:szCs w:val="20"/>
-              </w:rPr>
-              <w:t xml:space="preserve">06_07a_dossiers_a_traiter.png</w:t>
-            </w:r>
-          </w:p>
-        </w:tc>
-      </w:tr>
-      <w:tr>
-        <w:tc>
-          <w:tcPr>
-            <w:tcW w:type="dxa" w:w="1082"/>
-            <w:shd w:fill="F3F6FA" w:color="auto" w:val="clear"/>
-            <w:tcMar>
-              <w:top w:type="dxa" w:w="80"/>
-              <w:left w:type="dxa" w:w="100"/>
-              <w:bottom w:type="dxa" w:w="80"/>
-              <w:right w:type="dxa" w:w="100"/>
-            </w:tcMar>
-          </w:tcPr>
-          <w:p>
-            <w:pPr>
-              <w:spacing w:after="0" w:line="270"/>
-            </w:pPr>
-            <w:r>
-              <w:rPr>
-                <w:rFonts w:ascii="Calibri" w:cs="Calibri" w:eastAsia="Calibri" w:hAnsi="Calibri"/>
-                <w:sz w:val="20"/>
-                <w:szCs w:val="20"/>
-              </w:rPr>
-              <w:t xml:space="preserve">20</w:t>
-            </w:r>
-          </w:p>
-        </w:tc>
-        <w:tc>
-          <w:tcPr>
-            <w:tcW w:type="dxa" w:w="4510"/>
-            <w:shd w:fill="F3F6FA" w:color="auto" w:val="clear"/>
-            <w:tcMar>
-              <w:top w:type="dxa" w:w="80"/>
-              <w:left w:type="dxa" w:w="100"/>
-              <w:bottom w:type="dxa" w:w="80"/>
-              <w:right w:type="dxa" w:w="100"/>
-            </w:tcMar>
-          </w:tcPr>
-          <w:p>
-            <w:pPr>
-              <w:spacing w:after="0" w:line="270"/>
-            </w:pPr>
-            <w:r>
-              <w:rPr>
-                <w:rFonts w:ascii="Calibri" w:cs="Calibri" w:eastAsia="Calibri" w:hAnsi="Calibri"/>
-                <w:sz w:val="20"/>
-                <w:szCs w:val="20"/>
-              </w:rPr>
-              <w:t xml:space="preserve">Création d'une session : les créneaux se calculent à la saisie</w:t>
-            </w:r>
-          </w:p>
-        </w:tc>
-        <w:tc>
-          <w:tcPr>
-            <w:tcW w:type="dxa" w:w="3428"/>
-            <w:shd w:fill="F3F6FA" w:color="auto" w:val="clear"/>
-            <w:tcMar>
-              <w:top w:type="dxa" w:w="80"/>
-              <w:left w:type="dxa" w:w="100"/>
-              <w:bottom w:type="dxa" w:w="80"/>
-              <w:right w:type="dxa" w:w="100"/>
-            </w:tcMar>
-          </w:tcPr>
-          <w:p>
-            <w:pPr>
-              <w:spacing w:after="0" w:line="270"/>
-            </w:pPr>
-            <w:r>
-              <w:rPr>
-                <w:rFonts w:ascii="Calibri" w:cs="Calibri" w:eastAsia="Calibri" w:hAnsi="Calibri"/>
-                <w:sz w:val="20"/>
-                <w:szCs w:val="20"/>
-              </w:rPr>
-              <w:t xml:space="preserve">06_08_session.png</w:t>
-            </w:r>
-          </w:p>
-        </w:tc>
-      </w:tr>
-      <w:tr>
-        <w:tc>
-          <w:tcPr>
-            <w:tcW w:type="dxa" w:w="1082"/>
-            <w:tcMar>
-              <w:top w:type="dxa" w:w="80"/>
-              <w:left w:type="dxa" w:w="100"/>
-              <w:bottom w:type="dxa" w:w="80"/>
-              <w:right w:type="dxa" w:w="100"/>
-            </w:tcMar>
-          </w:tcPr>
-          <w:p>
-            <w:pPr>
-              <w:spacing w:after="0" w:line="270"/>
-            </w:pPr>
-            <w:r>
-              <w:rPr>
-                <w:rFonts w:ascii="Calibri" w:cs="Calibri" w:eastAsia="Calibri" w:hAnsi="Calibri"/>
-                <w:sz w:val="20"/>
-                <w:szCs w:val="20"/>
-              </w:rPr>
-              <w:t xml:space="preserve">21</w:t>
-            </w:r>
-          </w:p>
-        </w:tc>
-        <w:tc>
-          <w:tcPr>
-            <w:tcW w:type="dxa" w:w="4510"/>
-            <w:tcMar>
-              <w:top w:type="dxa" w:w="80"/>
-              <w:left w:type="dxa" w:w="100"/>
-              <w:bottom w:type="dxa" w:w="80"/>
-              <w:right w:type="dxa" w:w="100"/>
-            </w:tcMar>
-          </w:tcPr>
-          <w:p>
-            <w:pPr>
-              <w:spacing w:after="0" w:line="270"/>
-            </w:pPr>
-            <w:r>
-              <w:rPr>
-                <w:rFonts w:ascii="Calibri" w:cs="Calibri" w:eastAsia="Calibri" w:hAnsi="Calibri"/>
-                <w:sz w:val="20"/>
-                <w:szCs w:val="20"/>
-              </w:rPr>
-              <w:t xml:space="preserve">Liste des sessions avec ses filtres : à venir, du jour, passées, toutes</w:t>
-            </w:r>
-          </w:p>
-        </w:tc>
-        <w:tc>
-          <w:tcPr>
-            <w:tcW w:type="dxa" w:w="3428"/>
-            <w:tcMar>
-              <w:top w:type="dxa" w:w="80"/>
-              <w:left w:type="dxa" w:w="100"/>
-              <w:bottom w:type="dxa" w:w="80"/>
-              <w:right w:type="dxa" w:w="100"/>
-            </w:tcMar>
-          </w:tcPr>
-          <w:p>
-            <w:pPr>
-              <w:spacing w:after="0" w:line="270"/>
-            </w:pPr>
-            <w:r>
-              <w:rPr>
-                <w:rFonts w:ascii="Calibri" w:cs="Calibri" w:eastAsia="Calibri" w:hAnsi="Calibri"/>
-                <w:sz w:val="20"/>
-                <w:szCs w:val="20"/>
-              </w:rPr>
-              <w:t xml:space="preserve">06_08a_liste_sessions.png</w:t>
-            </w:r>
-          </w:p>
-        </w:tc>
-      </w:tr>
-      <w:tr>
-        <w:tc>
-          <w:tcPr>
-            <w:tcW w:type="dxa" w:w="1082"/>
-            <w:shd w:fill="F3F6FA" w:color="auto" w:val="clear"/>
-            <w:tcMar>
-              <w:top w:type="dxa" w:w="80"/>
-              <w:left w:type="dxa" w:w="100"/>
-              <w:bottom w:type="dxa" w:w="80"/>
-              <w:right w:type="dxa" w:w="100"/>
-            </w:tcMar>
-          </w:tcPr>
-          <w:p>
-            <w:pPr>
-              <w:spacing w:after="0" w:line="270"/>
-            </w:pPr>
-            <w:r>
-              <w:rPr>
-                <w:rFonts w:ascii="Calibri" w:cs="Calibri" w:eastAsia="Calibri" w:hAnsi="Calibri"/>
-                <w:sz w:val="20"/>
-                <w:szCs w:val="20"/>
-              </w:rPr>
-              <w:t xml:space="preserve">22</w:t>
-            </w:r>
-          </w:p>
-        </w:tc>
-        <w:tc>
-          <w:tcPr>
-            <w:tcW w:type="dxa" w:w="4510"/>
-            <w:shd w:fill="F3F6FA" w:color="auto" w:val="clear"/>
-            <w:tcMar>
-              <w:top w:type="dxa" w:w="80"/>
-              <w:left w:type="dxa" w:w="100"/>
-              <w:bottom w:type="dxa" w:w="80"/>
-              <w:right w:type="dxa" w:w="100"/>
-            </w:tcMar>
-          </w:tcPr>
-          <w:p>
-            <w:pPr>
-              <w:spacing w:after="0" w:line="270"/>
-            </w:pPr>
-            <w:r>
-              <w:rPr>
-                <w:rFonts w:ascii="Calibri" w:cs="Calibri" w:eastAsia="Calibri" w:hAnsi="Calibri"/>
-                <w:sz w:val="20"/>
-                <w:szCs w:val="20"/>
-              </w:rPr>
-              <w:t xml:space="preserve">Fiche d'une session : créneaux et remplissage, statut, actions et documents</w:t>
-            </w:r>
-          </w:p>
-        </w:tc>
-        <w:tc>
-          <w:tcPr>
-            <w:tcW w:type="dxa" w:w="3428"/>
-            <w:shd w:fill="F3F6FA" w:color="auto" w:val="clear"/>
-            <w:tcMar>
-              <w:top w:type="dxa" w:w="80"/>
-              <w:left w:type="dxa" w:w="100"/>
-              <w:bottom w:type="dxa" w:w="80"/>
-              <w:right w:type="dxa" w:w="100"/>
-            </w:tcMar>
-          </w:tcPr>
-          <w:p>
-            <w:pPr>
-              <w:spacing w:after="0" w:line="270"/>
-            </w:pPr>
-            <w:r>
-              <w:rPr>
-                <w:rFonts w:ascii="Calibri" w:cs="Calibri" w:eastAsia="Calibri" w:hAnsi="Calibri"/>
-                <w:sz w:val="20"/>
-                <w:szCs w:val="20"/>
-              </w:rPr>
-              <w:t xml:space="preserve">06_08b_detail_session.png</w:t>
-            </w:r>
-          </w:p>
-        </w:tc>
-      </w:tr>
-      <w:tr>
-        <w:tc>
-          <w:tcPr>
-            <w:tcW w:type="dxa" w:w="1082"/>
-            <w:tcMar>
-              <w:top w:type="dxa" w:w="80"/>
-              <w:left w:type="dxa" w:w="100"/>
-              <w:bottom w:type="dxa" w:w="80"/>
-              <w:right w:type="dxa" w:w="100"/>
-            </w:tcMar>
-          </w:tcPr>
-          <w:p>
-            <w:pPr>
-              <w:spacing w:after="0" w:line="270"/>
-            </w:pPr>
-            <w:r>
-              <w:rPr>
-                <w:rFonts w:ascii="Calibri" w:cs="Calibri" w:eastAsia="Calibri" w:hAnsi="Calibri"/>
-                <w:sz w:val="20"/>
-                <w:szCs w:val="20"/>
-              </w:rPr>
-              <w:t xml:space="preserve">23</w:t>
-            </w:r>
-          </w:p>
-        </w:tc>
-        <w:tc>
-          <w:tcPr>
-            <w:tcW w:type="dxa" w:w="4510"/>
-            <w:tcMar>
-              <w:top w:type="dxa" w:w="80"/>
-              <w:left w:type="dxa" w:w="100"/>
-              <w:bottom w:type="dxa" w:w="80"/>
-              <w:right w:type="dxa" w:w="100"/>
-            </w:tcMar>
-          </w:tcPr>
-          <w:p>
-            <w:pPr>
-              <w:spacing w:after="0" w:line="270"/>
-            </w:pPr>
-            <w:r>
-              <w:rPr>
-                <w:rFonts w:ascii="Calibri" w:cs="Calibri" w:eastAsia="Calibri" w:hAnsi="Calibri"/>
-                <w:sz w:val="20"/>
-                <w:szCs w:val="20"/>
-              </w:rPr>
-              <w:t xml:space="preserve">Inscriptions d'une session : numéro d'appel, créneau, actions</w:t>
-            </w:r>
-          </w:p>
-        </w:tc>
-        <w:tc>
-          <w:tcPr>
-            <w:tcW w:type="dxa" w:w="3428"/>
-            <w:tcMar>
-              <w:top w:type="dxa" w:w="80"/>
-              <w:left w:type="dxa" w:w="100"/>
-              <w:bottom w:type="dxa" w:w="80"/>
-              <w:right w:type="dxa" w:w="100"/>
-            </w:tcMar>
-          </w:tcPr>
-          <w:p>
-            <w:pPr>
-              <w:spacing w:after="0" w:line="270"/>
-            </w:pPr>
-            <w:r>
-              <w:rPr>
-                <w:rFonts w:ascii="Calibri" w:cs="Calibri" w:eastAsia="Calibri" w:hAnsi="Calibri"/>
-                <w:sz w:val="20"/>
-                <w:szCs w:val="20"/>
-              </w:rPr>
-              <w:t xml:space="preserve">06_09_inscription.png</w:t>
-            </w:r>
-          </w:p>
-        </w:tc>
-      </w:tr>
-      <w:tr>
-        <w:tc>
-          <w:tcPr>
-            <w:tcW w:type="dxa" w:w="1082"/>
-            <w:shd w:fill="F3F6FA" w:color="auto" w:val="clear"/>
-            <w:tcMar>
-              <w:top w:type="dxa" w:w="80"/>
-              <w:left w:type="dxa" w:w="100"/>
-              <w:bottom w:type="dxa" w:w="80"/>
-              <w:right w:type="dxa" w:w="100"/>
-            </w:tcMar>
-          </w:tcPr>
-          <w:p>
-            <w:pPr>
-              <w:spacing w:after="0" w:line="270"/>
-            </w:pPr>
-            <w:r>
-              <w:rPr>
-                <w:rFonts w:ascii="Calibri" w:cs="Calibri" w:eastAsia="Calibri" w:hAnsi="Calibri"/>
-                <w:sz w:val="20"/>
-                <w:szCs w:val="20"/>
-              </w:rPr>
-              <w:t xml:space="preserve">24</w:t>
-            </w:r>
-          </w:p>
-        </w:tc>
-        <w:tc>
-          <w:tcPr>
-            <w:tcW w:type="dxa" w:w="4510"/>
-            <w:shd w:fill="F3F6FA" w:color="auto" w:val="clear"/>
-            <w:tcMar>
-              <w:top w:type="dxa" w:w="80"/>
-              <w:left w:type="dxa" w:w="100"/>
-              <w:bottom w:type="dxa" w:w="80"/>
-              <w:right w:type="dxa" w:w="100"/>
-            </w:tcMar>
-          </w:tcPr>
-          <w:p>
-            <w:pPr>
-              <w:spacing w:after="0" w:line="270"/>
-            </w:pPr>
-            <w:r>
-              <w:rPr>
-                <w:rFonts w:ascii="Calibri" w:cs="Calibri" w:eastAsia="Calibri" w:hAnsi="Calibri"/>
-                <w:sz w:val="20"/>
-                <w:szCs w:val="20"/>
-              </w:rPr>
-              <w:t xml:space="preserve">La convocation imprimable : centre, date, heure de passage estimée, pièces à apporter</w:t>
-            </w:r>
-          </w:p>
-        </w:tc>
-        <w:tc>
-          <w:tcPr>
-            <w:tcW w:type="dxa" w:w="3428"/>
-            <w:shd w:fill="F3F6FA" w:color="auto" w:val="clear"/>
-            <w:tcMar>
-              <w:top w:type="dxa" w:w="80"/>
-              <w:left w:type="dxa" w:w="100"/>
-              <w:bottom w:type="dxa" w:w="80"/>
-              <w:right w:type="dxa" w:w="100"/>
-            </w:tcMar>
-          </w:tcPr>
-          <w:p>
-            <w:pPr>
-              <w:spacing w:after="0" w:line="270"/>
-            </w:pPr>
-            <w:r>
-              <w:rPr>
-                <w:rFonts w:ascii="Calibri" w:cs="Calibri" w:eastAsia="Calibri" w:hAnsi="Calibri"/>
-                <w:sz w:val="20"/>
-                <w:szCs w:val="20"/>
-              </w:rPr>
-              <w:t xml:space="preserve">06_09c_convocation.png</w:t>
-            </w:r>
-          </w:p>
-        </w:tc>
-      </w:tr>
-      <w:tr>
-        <w:tc>
-          <w:tcPr>
-            <w:tcW w:type="dxa" w:w="1082"/>
-            <w:tcMar>
-              <w:top w:type="dxa" w:w="80"/>
-              <w:left w:type="dxa" w:w="100"/>
-              <w:bottom w:type="dxa" w:w="80"/>
-              <w:right w:type="dxa" w:w="100"/>
-            </w:tcMar>
-          </w:tcPr>
-          <w:p>
-            <w:pPr>
-              <w:spacing w:after="0" w:line="270"/>
-            </w:pPr>
-            <w:r>
-              <w:rPr>
-                <w:rFonts w:ascii="Calibri" w:cs="Calibri" w:eastAsia="Calibri" w:hAnsi="Calibri"/>
-                <w:sz w:val="20"/>
-                <w:szCs w:val="20"/>
-              </w:rPr>
-              <w:t xml:space="preserve">25</w:t>
-            </w:r>
-          </w:p>
-        </w:tc>
-        <w:tc>
-          <w:tcPr>
-            <w:tcW w:type="dxa" w:w="4510"/>
-            <w:tcMar>
-              <w:top w:type="dxa" w:w="80"/>
-              <w:left w:type="dxa" w:w="100"/>
-              <w:bottom w:type="dxa" w:w="80"/>
-              <w:right w:type="dxa" w:w="100"/>
-            </w:tcMar>
-          </w:tcPr>
-          <w:p>
-            <w:pPr>
-              <w:spacing w:after="0" w:line="270"/>
-            </w:pPr>
-            <w:r>
-              <w:rPr>
-                <w:rFonts w:ascii="Calibri" w:cs="Calibri" w:eastAsia="Calibri" w:hAnsi="Calibri"/>
-                <w:sz w:val="20"/>
-                <w:szCs w:val="20"/>
-              </w:rPr>
-              <w:t xml:space="preserve">Appel d'une session : présents, retards, absents</w:t>
-            </w:r>
-          </w:p>
-        </w:tc>
-        <w:tc>
-          <w:tcPr>
-            <w:tcW w:type="dxa" w:w="3428"/>
-            <w:tcMar>
-              <w:top w:type="dxa" w:w="80"/>
-              <w:left w:type="dxa" w:w="100"/>
-              <w:bottom w:type="dxa" w:w="80"/>
-              <w:right w:type="dxa" w:w="100"/>
-            </w:tcMar>
-          </w:tcPr>
-          <w:p>
-            <w:pPr>
-              <w:spacing w:after="0" w:line="270"/>
-            </w:pPr>
-            <w:r>
-              <w:rPr>
-                <w:rFonts w:ascii="Calibri" w:cs="Calibri" w:eastAsia="Calibri" w:hAnsi="Calibri"/>
-                <w:sz w:val="20"/>
-                <w:szCs w:val="20"/>
-              </w:rPr>
-              <w:t xml:space="preserve">06_10_appel.png</w:t>
-            </w:r>
-          </w:p>
-        </w:tc>
-      </w:tr>
-      <w:tr>
-        <w:tc>
-          <w:tcPr>
-            <w:tcW w:type="dxa" w:w="1082"/>
-            <w:shd w:fill="F3F6FA" w:color="auto" w:val="clear"/>
-            <w:tcMar>
-              <w:top w:type="dxa" w:w="80"/>
-              <w:left w:type="dxa" w:w="100"/>
-              <w:bottom w:type="dxa" w:w="80"/>
-              <w:right w:type="dxa" w:w="100"/>
-            </w:tcMar>
-          </w:tcPr>
-          <w:p>
-            <w:pPr>
-              <w:spacing w:after="0" w:line="270"/>
-            </w:pPr>
-            <w:r>
-              <w:rPr>
-                <w:rFonts w:ascii="Calibri" w:cs="Calibri" w:eastAsia="Calibri" w:hAnsi="Calibri"/>
-                <w:sz w:val="20"/>
-                <w:szCs w:val="20"/>
-              </w:rPr>
-              <w:t xml:space="preserve">26</w:t>
-            </w:r>
-          </w:p>
-        </w:tc>
-        <w:tc>
-          <w:tcPr>
-            <w:tcW w:type="dxa" w:w="4510"/>
-            <w:shd w:fill="F3F6FA" w:color="auto" w:val="clear"/>
-            <w:tcMar>
-              <w:top w:type="dxa" w:w="80"/>
-              <w:left w:type="dxa" w:w="100"/>
-              <w:bottom w:type="dxa" w:w="80"/>
-              <w:right w:type="dxa" w:w="100"/>
-            </w:tcMar>
-          </w:tcPr>
-          <w:p>
-            <w:pPr>
-              <w:spacing w:after="0" w:line="270"/>
-            </w:pPr>
-            <w:r>
-              <w:rPr>
-                <w:rFonts w:ascii="Calibri" w:cs="Calibri" w:eastAsia="Calibri" w:hAnsi="Calibri"/>
-                <w:sz w:val="20"/>
-                <w:szCs w:val="20"/>
-              </w:rPr>
-              <w:t xml:space="preserve">Vue de l'examinateur : numéros d'appel, sans les noms</w:t>
-            </w:r>
-          </w:p>
-        </w:tc>
-        <w:tc>
-          <w:tcPr>
-            <w:tcW w:type="dxa" w:w="3428"/>
-            <w:shd w:fill="F3F6FA" w:color="auto" w:val="clear"/>
-            <w:tcMar>
-              <w:top w:type="dxa" w:w="80"/>
-              <w:left w:type="dxa" w:w="100"/>
-              <w:bottom w:type="dxa" w:w="80"/>
-              <w:right w:type="dxa" w:w="100"/>
-            </w:tcMar>
-          </w:tcPr>
-          <w:p>
-            <w:pPr>
-              <w:spacing w:after="0" w:line="270"/>
-            </w:pPr>
-            <w:r>
-              <w:rPr>
-                <w:rFonts w:ascii="Calibri" w:cs="Calibri" w:eastAsia="Calibri" w:hAnsi="Calibri"/>
-                <w:sz w:val="20"/>
-                <w:szCs w:val="20"/>
-              </w:rPr>
-              <w:t xml:space="preserve">06_11_passages.png</w:t>
-            </w:r>
-          </w:p>
-        </w:tc>
-      </w:tr>
-      <w:tr>
-        <w:tc>
-          <w:tcPr>
-            <w:tcW w:type="dxa" w:w="1082"/>
-            <w:tcMar>
-              <w:top w:type="dxa" w:w="80"/>
-              <w:left w:type="dxa" w:w="100"/>
-              <w:bottom w:type="dxa" w:w="80"/>
-              <w:right w:type="dxa" w:w="100"/>
-            </w:tcMar>
-          </w:tcPr>
-          <w:p>
-            <w:pPr>
-              <w:spacing w:after="0" w:line="270"/>
-            </w:pPr>
-            <w:r>
-              <w:rPr>
-                <w:rFonts w:ascii="Calibri" w:cs="Calibri" w:eastAsia="Calibri" w:hAnsi="Calibri"/>
-                <w:sz w:val="20"/>
-                <w:szCs w:val="20"/>
-              </w:rPr>
-              <w:t xml:space="preserve">27</w:t>
-            </w:r>
-          </w:p>
-        </w:tc>
-        <w:tc>
-          <w:tcPr>
-            <w:tcW w:type="dxa" w:w="4510"/>
-            <w:tcMar>
-              <w:top w:type="dxa" w:w="80"/>
-              <w:left w:type="dxa" w:w="100"/>
-              <w:bottom w:type="dxa" w:w="80"/>
-              <w:right w:type="dxa" w:w="100"/>
-            </w:tcMar>
-          </w:tcPr>
-          <w:p>
-            <w:pPr>
-              <w:spacing w:after="0" w:line="270"/>
-            </w:pPr>
-            <w:r>
-              <w:rPr>
-                <w:rFonts w:ascii="Calibri" w:cs="Calibri" w:eastAsia="Calibri" w:hAnsi="Calibri"/>
-                <w:sz w:val="20"/>
-                <w:szCs w:val="20"/>
-              </w:rPr>
-              <w:t xml:space="preserve">« Sessions du jour » de l'examinateur, avec présents et passages ouverts</w:t>
-            </w:r>
-          </w:p>
-        </w:tc>
-        <w:tc>
-          <w:tcPr>
-            <w:tcW w:type="dxa" w:w="3428"/>
-            <w:tcMar>
-              <w:top w:type="dxa" w:w="80"/>
-              <w:left w:type="dxa" w:w="100"/>
-              <w:bottom w:type="dxa" w:w="80"/>
-              <w:right w:type="dxa" w:w="100"/>
-            </w:tcMar>
-          </w:tcPr>
-          <w:p>
-            <w:pPr>
-              <w:spacing w:after="0" w:line="270"/>
-            </w:pPr>
-            <w:r>
-              <w:rPr>
-                <w:rFonts w:ascii="Calibri" w:cs="Calibri" w:eastAsia="Calibri" w:hAnsi="Calibri"/>
-                <w:sz w:val="20"/>
-                <w:szCs w:val="20"/>
-              </w:rPr>
-              <w:t xml:space="preserve">06_11a_sessions_du_jour.png</w:t>
-            </w:r>
-          </w:p>
-        </w:tc>
-      </w:tr>
-      <w:tr>
-        <w:tc>
-          <w:tcPr>
-            <w:tcW w:type="dxa" w:w="1082"/>
-            <w:shd w:fill="F3F6FA" w:color="auto" w:val="clear"/>
-            <w:tcMar>
-              <w:top w:type="dxa" w:w="80"/>
-              <w:left w:type="dxa" w:w="100"/>
-              <w:bottom w:type="dxa" w:w="80"/>
-              <w:right w:type="dxa" w:w="100"/>
-            </w:tcMar>
-          </w:tcPr>
-          <w:p>
-            <w:pPr>
-              <w:spacing w:after="0" w:line="270"/>
-            </w:pPr>
-            <w:r>
-              <w:rPr>
-                <w:rFonts w:ascii="Calibri" w:cs="Calibri" w:eastAsia="Calibri" w:hAnsi="Calibri"/>
-                <w:sz w:val="20"/>
-                <w:szCs w:val="20"/>
-              </w:rPr>
-              <w:t xml:space="preserve">28</w:t>
-            </w:r>
-          </w:p>
-        </w:tc>
-        <w:tc>
-          <w:tcPr>
-            <w:tcW w:type="dxa" w:w="4510"/>
-            <w:shd w:fill="F3F6FA" w:color="auto" w:val="clear"/>
-            <w:tcMar>
-              <w:top w:type="dxa" w:w="80"/>
-              <w:left w:type="dxa" w:w="100"/>
-              <w:bottom w:type="dxa" w:w="80"/>
-              <w:right w:type="dxa" w:w="100"/>
-            </w:tcMar>
-          </w:tcPr>
-          <w:p>
-            <w:pPr>
-              <w:spacing w:after="0" w:line="270"/>
-            </w:pPr>
-            <w:r>
-              <w:rPr>
-                <w:rFonts w:ascii="Calibri" w:cs="Calibri" w:eastAsia="Calibri" w:hAnsi="Calibri"/>
-                <w:sz w:val="20"/>
-                <w:szCs w:val="20"/>
-              </w:rPr>
-              <w:t xml:space="preserve">Feuille d'examen théorique : questions posées, réponses, points</w:t>
-            </w:r>
-          </w:p>
-        </w:tc>
-        <w:tc>
-          <w:tcPr>
-            <w:tcW w:type="dxa" w:w="3428"/>
-            <w:shd w:fill="F3F6FA" w:color="auto" w:val="clear"/>
-            <w:tcMar>
-              <w:top w:type="dxa" w:w="80"/>
-              <w:left w:type="dxa" w:w="100"/>
-              <w:bottom w:type="dxa" w:w="80"/>
-              <w:right w:type="dxa" w:w="100"/>
-            </w:tcMar>
-          </w:tcPr>
-          <w:p>
-            <w:pPr>
-              <w:spacing w:after="0" w:line="270"/>
-            </w:pPr>
-            <w:r>
-              <w:rPr>
-                <w:rFonts w:ascii="Calibri" w:cs="Calibri" w:eastAsia="Calibri" w:hAnsi="Calibri"/>
-                <w:sz w:val="20"/>
-                <w:szCs w:val="20"/>
-              </w:rPr>
-              <w:t xml:space="preserve">06_12_theorie.png</w:t>
-            </w:r>
-          </w:p>
-        </w:tc>
-      </w:tr>
-      <w:tr>
-        <w:tc>
-          <w:tcPr>
-            <w:tcW w:type="dxa" w:w="1082"/>
-            <w:tcMar>
-              <w:top w:type="dxa" w:w="80"/>
-              <w:left w:type="dxa" w:w="100"/>
-              <w:bottom w:type="dxa" w:w="80"/>
-              <w:right w:type="dxa" w:w="100"/>
-            </w:tcMar>
-          </w:tcPr>
-          <w:p>
-            <w:pPr>
-              <w:spacing w:after="0" w:line="270"/>
-            </w:pPr>
-            <w:r>
-              <w:rPr>
-                <w:rFonts w:ascii="Calibri" w:cs="Calibri" w:eastAsia="Calibri" w:hAnsi="Calibri"/>
-                <w:sz w:val="20"/>
-                <w:szCs w:val="20"/>
-              </w:rPr>
-              <w:t xml:space="preserve">29</w:t>
-            </w:r>
-          </w:p>
-        </w:tc>
-        <w:tc>
-          <w:tcPr>
-            <w:tcW w:type="dxa" w:w="4510"/>
-            <w:tcMar>
-              <w:top w:type="dxa" w:w="80"/>
-              <w:left w:type="dxa" w:w="100"/>
-              <w:bottom w:type="dxa" w:w="80"/>
-              <w:right w:type="dxa" w:w="100"/>
-            </w:tcMar>
-          </w:tcPr>
-          <w:p>
-            <w:pPr>
-              <w:spacing w:after="0" w:line="270"/>
-            </w:pPr>
-            <w:r>
-              <w:rPr>
-                <w:rFonts w:ascii="Calibri" w:cs="Calibri" w:eastAsia="Calibri" w:hAnsi="Calibri"/>
-                <w:sz w:val="20"/>
-                <w:szCs w:val="20"/>
-              </w:rPr>
-              <w:t xml:space="preserve">Grille de conduite : points par critère, faute éliminatoire, observations</w:t>
-            </w:r>
-          </w:p>
-        </w:tc>
-        <w:tc>
-          <w:tcPr>
-            <w:tcW w:type="dxa" w:w="3428"/>
-            <w:tcMar>
-              <w:top w:type="dxa" w:w="80"/>
-              <w:left w:type="dxa" w:w="100"/>
-              <w:bottom w:type="dxa" w:w="80"/>
-              <w:right w:type="dxa" w:w="100"/>
-            </w:tcMar>
-          </w:tcPr>
-          <w:p>
-            <w:pPr>
-              <w:spacing w:after="0" w:line="270"/>
-            </w:pPr>
-            <w:r>
-              <w:rPr>
-                <w:rFonts w:ascii="Calibri" w:cs="Calibri" w:eastAsia="Calibri" w:hAnsi="Calibri"/>
-                <w:sz w:val="20"/>
-                <w:szCs w:val="20"/>
-              </w:rPr>
-              <w:t xml:space="preserve">06_13_conduite.png</w:t>
-            </w:r>
-          </w:p>
-        </w:tc>
-      </w:tr>
-      <w:tr>
-        <w:tc>
-          <w:tcPr>
-            <w:tcW w:type="dxa" w:w="1082"/>
-            <w:shd w:fill="F3F6FA" w:color="auto" w:val="clear"/>
-            <w:tcMar>
-              <w:top w:type="dxa" w:w="80"/>
-              <w:left w:type="dxa" w:w="100"/>
-              <w:bottom w:type="dxa" w:w="80"/>
-              <w:right w:type="dxa" w:w="100"/>
-            </w:tcMar>
-          </w:tcPr>
-          <w:p>
-            <w:pPr>
-              <w:spacing w:after="0" w:line="270"/>
-            </w:pPr>
-            <w:r>
-              <w:rPr>
-                <w:rFonts w:ascii="Calibri" w:cs="Calibri" w:eastAsia="Calibri" w:hAnsi="Calibri"/>
-                <w:sz w:val="20"/>
-                <w:szCs w:val="20"/>
-              </w:rPr>
-              <w:t xml:space="preserve">30</w:t>
-            </w:r>
-          </w:p>
-        </w:tc>
-        <w:tc>
-          <w:tcPr>
-            <w:tcW w:type="dxa" w:w="4510"/>
-            <w:shd w:fill="F3F6FA" w:color="auto" w:val="clear"/>
-            <w:tcMar>
-              <w:top w:type="dxa" w:w="80"/>
-              <w:left w:type="dxa" w:w="100"/>
-              <w:bottom w:type="dxa" w:w="80"/>
-              <w:right w:type="dxa" w:w="100"/>
-            </w:tcMar>
-          </w:tcPr>
-          <w:p>
-            <w:pPr>
-              <w:spacing w:after="0" w:line="270"/>
-            </w:pPr>
-            <w:r>
-              <w:rPr>
-                <w:rFonts w:ascii="Calibri" w:cs="Calibri" w:eastAsia="Calibri" w:hAnsi="Calibri"/>
-                <w:sz w:val="20"/>
-                <w:szCs w:val="20"/>
-              </w:rPr>
-              <w:t xml:space="preserve">Détail d'un résultat avant validation par l'ATT</w:t>
-            </w:r>
-          </w:p>
-        </w:tc>
-        <w:tc>
-          <w:tcPr>
-            <w:tcW w:type="dxa" w:w="3428"/>
-            <w:shd w:fill="F3F6FA" w:color="auto" w:val="clear"/>
-            <w:tcMar>
-              <w:top w:type="dxa" w:w="80"/>
-              <w:left w:type="dxa" w:w="100"/>
-              <w:bottom w:type="dxa" w:w="80"/>
-              <w:right w:type="dxa" w:w="100"/>
-            </w:tcMar>
-          </w:tcPr>
-          <w:p>
-            <w:pPr>
-              <w:spacing w:after="0" w:line="270"/>
-            </w:pPr>
-            <w:r>
-              <w:rPr>
-                <w:rFonts w:ascii="Calibri" w:cs="Calibri" w:eastAsia="Calibri" w:hAnsi="Calibri"/>
-                <w:sz w:val="20"/>
-                <w:szCs w:val="20"/>
-              </w:rPr>
-              <w:t xml:space="preserve">06_14_resultat.png</w:t>
-            </w:r>
-          </w:p>
-        </w:tc>
-      </w:tr>
-      <w:tr>
-        <w:tc>
-          <w:tcPr>
-            <w:tcW w:type="dxa" w:w="1082"/>
-            <w:tcMar>
-              <w:top w:type="dxa" w:w="80"/>
-              <w:left w:type="dxa" w:w="100"/>
-              <w:bottom w:type="dxa" w:w="80"/>
-              <w:right w:type="dxa" w:w="100"/>
-            </w:tcMar>
-          </w:tcPr>
-          <w:p>
-            <w:pPr>
-              <w:spacing w:after="0" w:line="270"/>
-            </w:pPr>
-            <w:r>
-              <w:rPr>
-                <w:rFonts w:ascii="Calibri" w:cs="Calibri" w:eastAsia="Calibri" w:hAnsi="Calibri"/>
-                <w:sz w:val="20"/>
-                <w:szCs w:val="20"/>
-              </w:rPr>
-              <w:t xml:space="preserve">31</w:t>
-            </w:r>
-          </w:p>
-        </w:tc>
-        <w:tc>
-          <w:tcPr>
-            <w:tcW w:type="dxa" w:w="4510"/>
-            <w:tcMar>
-              <w:top w:type="dxa" w:w="80"/>
-              <w:left w:type="dxa" w:w="100"/>
-              <w:bottom w:type="dxa" w:w="80"/>
-              <w:right w:type="dxa" w:w="100"/>
-            </w:tcMar>
-          </w:tcPr>
-          <w:p>
-            <w:pPr>
-              <w:spacing w:after="0" w:line="270"/>
-            </w:pPr>
-            <w:r>
-              <w:rPr>
-                <w:rFonts w:ascii="Calibri" w:cs="Calibri" w:eastAsia="Calibri" w:hAnsi="Calibri"/>
-                <w:sz w:val="20"/>
-                <w:szCs w:val="20"/>
-              </w:rPr>
-              <w:t xml:space="preserve">« Résultats à valider » : la file de l'ATT, avec l'état d'envoi au serveur</w:t>
-            </w:r>
-          </w:p>
-        </w:tc>
-        <w:tc>
-          <w:tcPr>
-            <w:tcW w:type="dxa" w:w="3428"/>
-            <w:tcMar>
-              <w:top w:type="dxa" w:w="80"/>
-              <w:left w:type="dxa" w:w="100"/>
-              <w:bottom w:type="dxa" w:w="80"/>
-              <w:right w:type="dxa" w:w="100"/>
-            </w:tcMar>
-          </w:tcPr>
-          <w:p>
-            <w:pPr>
-              <w:spacing w:after="0" w:line="270"/>
-            </w:pPr>
-            <w:r>
-              <w:rPr>
-                <w:rFonts w:ascii="Calibri" w:cs="Calibri" w:eastAsia="Calibri" w:hAnsi="Calibri"/>
-                <w:sz w:val="20"/>
-                <w:szCs w:val="20"/>
-              </w:rPr>
-              <w:t xml:space="preserve">06_14b_resultats.png</w:t>
-            </w:r>
-          </w:p>
-        </w:tc>
-      </w:tr>
-      <w:tr>
-        <w:tc>
-          <w:tcPr>
-            <w:tcW w:type="dxa" w:w="1082"/>
-            <w:shd w:fill="F3F6FA" w:color="auto" w:val="clear"/>
-            <w:tcMar>
-              <w:top w:type="dxa" w:w="80"/>
-              <w:left w:type="dxa" w:w="100"/>
-              <w:bottom w:type="dxa" w:w="80"/>
-              <w:right w:type="dxa" w:w="100"/>
-            </w:tcMar>
-          </w:tcPr>
-          <w:p>
-            <w:pPr>
-              <w:spacing w:after="0" w:line="270"/>
-            </w:pPr>
-            <w:r>
-              <w:rPr>
-                <w:rFonts w:ascii="Calibri" w:cs="Calibri" w:eastAsia="Calibri" w:hAnsi="Calibri"/>
-                <w:sz w:val="20"/>
-                <w:szCs w:val="20"/>
-              </w:rPr>
-              <w:t xml:space="preserve">32</w:t>
-            </w:r>
-          </w:p>
-        </w:tc>
-        <w:tc>
-          <w:tcPr>
-            <w:tcW w:type="dxa" w:w="4510"/>
-            <w:shd w:fill="F3F6FA" w:color="auto" w:val="clear"/>
-            <w:tcMar>
-              <w:top w:type="dxa" w:w="80"/>
-              <w:left w:type="dxa" w:w="100"/>
-              <w:bottom w:type="dxa" w:w="80"/>
-              <w:right w:type="dxa" w:w="100"/>
-            </w:tcMar>
-          </w:tcPr>
-          <w:p>
-            <w:pPr>
-              <w:spacing w:after="0" w:line="270"/>
-            </w:pPr>
-            <w:r>
-              <w:rPr>
-                <w:rFonts w:ascii="Calibri" w:cs="Calibri" w:eastAsia="Calibri" w:hAnsi="Calibri"/>
-                <w:sz w:val="20"/>
-                <w:szCs w:val="20"/>
-              </w:rPr>
-              <w:t xml:space="preserve">Résultat corrigé : une nouvelle ligne avec son motif, l'ancienne reste consultable</w:t>
-            </w:r>
-          </w:p>
-        </w:tc>
-        <w:tc>
-          <w:tcPr>
-            <w:tcW w:type="dxa" w:w="3428"/>
-            <w:shd w:fill="F3F6FA" w:color="auto" w:val="clear"/>
-            <w:tcMar>
-              <w:top w:type="dxa" w:w="80"/>
-              <w:left w:type="dxa" w:w="100"/>
-              <w:bottom w:type="dxa" w:w="80"/>
-              <w:right w:type="dxa" w:w="100"/>
-            </w:tcMar>
-          </w:tcPr>
-          <w:p>
-            <w:pPr>
-              <w:spacing w:after="0" w:line="270"/>
-            </w:pPr>
-            <w:r>
-              <w:rPr>
-                <w:rFonts w:ascii="Calibri" w:cs="Calibri" w:eastAsia="Calibri" w:hAnsi="Calibri"/>
-                <w:sz w:val="20"/>
-                <w:szCs w:val="20"/>
-              </w:rPr>
-              <w:t xml:space="preserve">06_14c_resultat_corrige.png</w:t>
-            </w:r>
-          </w:p>
-        </w:tc>
-      </w:tr>
-      <w:tr>
-        <w:tc>
-          <w:tcPr>
-            <w:tcW w:type="dxa" w:w="1082"/>
-            <w:tcMar>
-              <w:top w:type="dxa" w:w="80"/>
-              <w:left w:type="dxa" w:w="100"/>
-              <w:bottom w:type="dxa" w:w="80"/>
-              <w:right w:type="dxa" w:w="100"/>
-            </w:tcMar>
-          </w:tcPr>
-          <w:p>
-            <w:pPr>
-              <w:spacing w:after="0" w:line="270"/>
-            </w:pPr>
-            <w:r>
-              <w:rPr>
-                <w:rFonts w:ascii="Calibri" w:cs="Calibri" w:eastAsia="Calibri" w:hAnsi="Calibri"/>
-                <w:sz w:val="20"/>
-                <w:szCs w:val="20"/>
-              </w:rPr>
-              <w:t xml:space="preserve">33</w:t>
-            </w:r>
-          </w:p>
-        </w:tc>
-        <w:tc>
-          <w:tcPr>
-            <w:tcW w:type="dxa" w:w="4510"/>
-            <w:tcMar>
-              <w:top w:type="dxa" w:w="80"/>
-              <w:left w:type="dxa" w:w="100"/>
-              <w:bottom w:type="dxa" w:w="80"/>
-              <w:right w:type="dxa" w:w="100"/>
-            </w:tcMar>
-          </w:tcPr>
-          <w:p>
-            <w:pPr>
-              <w:spacing w:after="0" w:line="270"/>
-            </w:pPr>
-            <w:r>
-              <w:rPr>
-                <w:rFonts w:ascii="Calibri" w:cs="Calibri" w:eastAsia="Calibri" w:hAnsi="Calibri"/>
-                <w:sz w:val="20"/>
-                <w:szCs w:val="20"/>
-              </w:rPr>
-              <w:t xml:space="preserve">Résultat en échec : épreuves à repasser et date de réinscription</w:t>
-            </w:r>
-          </w:p>
-        </w:tc>
-        <w:tc>
-          <w:tcPr>
-            <w:tcW w:type="dxa" w:w="3428"/>
-            <w:tcMar>
-              <w:top w:type="dxa" w:w="80"/>
-              <w:left w:type="dxa" w:w="100"/>
-              <w:bottom w:type="dxa" w:w="80"/>
-              <w:right w:type="dxa" w:w="100"/>
-            </w:tcMar>
-          </w:tcPr>
-          <w:p>
-            <w:pPr>
-              <w:spacing w:after="0" w:line="270"/>
-            </w:pPr>
-            <w:r>
-              <w:rPr>
-                <w:rFonts w:ascii="Calibri" w:cs="Calibri" w:eastAsia="Calibri" w:hAnsi="Calibri"/>
-                <w:sz w:val="20"/>
-                <w:szCs w:val="20"/>
-              </w:rPr>
-              <w:t xml:space="preserve">06_15_repassage.png</w:t>
-            </w:r>
-          </w:p>
-        </w:tc>
-      </w:tr>
-      <w:tr>
-        <w:tc>
-          <w:tcPr>
-            <w:tcW w:type="dxa" w:w="1082"/>
-            <w:shd w:fill="F3F6FA" w:color="auto" w:val="clear"/>
-            <w:tcMar>
-              <w:top w:type="dxa" w:w="80"/>
-              <w:left w:type="dxa" w:w="100"/>
-              <w:bottom w:type="dxa" w:w="80"/>
-              <w:right w:type="dxa" w:w="100"/>
-            </w:tcMar>
-          </w:tcPr>
-          <w:p>
-            <w:pPr>
-              <w:spacing w:after="0" w:line="270"/>
-            </w:pPr>
-            <w:r>
-              <w:rPr>
-                <w:rFonts w:ascii="Calibri" w:cs="Calibri" w:eastAsia="Calibri" w:hAnsi="Calibri"/>
-                <w:sz w:val="20"/>
-                <w:szCs w:val="20"/>
-              </w:rPr>
-              <w:t xml:space="preserve">34</w:t>
-            </w:r>
-          </w:p>
-        </w:tc>
-        <w:tc>
-          <w:tcPr>
-            <w:tcW w:type="dxa" w:w="4510"/>
-            <w:shd w:fill="F3F6FA" w:color="auto" w:val="clear"/>
-            <w:tcMar>
-              <w:top w:type="dxa" w:w="80"/>
-              <w:left w:type="dxa" w:w="100"/>
-              <w:bottom w:type="dxa" w:w="80"/>
-              <w:right w:type="dxa" w:w="100"/>
-            </w:tcMar>
-          </w:tcPr>
-          <w:p>
-            <w:pPr>
-              <w:spacing w:after="0" w:line="270"/>
-            </w:pPr>
-            <w:r>
-              <w:rPr>
-                <w:rFonts w:ascii="Calibri" w:cs="Calibri" w:eastAsia="Calibri" w:hAnsi="Calibri"/>
-                <w:sz w:val="20"/>
-                <w:szCs w:val="20"/>
-              </w:rPr>
-              <w:t xml:space="preserve">Parcours du candidat, vu avec son compte</w:t>
-            </w:r>
-          </w:p>
-        </w:tc>
-        <w:tc>
-          <w:tcPr>
-            <w:tcW w:type="dxa" w:w="3428"/>
-            <w:shd w:fill="F3F6FA" w:color="auto" w:val="clear"/>
-            <w:tcMar>
-              <w:top w:type="dxa" w:w="80"/>
-              <w:left w:type="dxa" w:w="100"/>
-              <w:bottom w:type="dxa" w:w="80"/>
-              <w:right w:type="dxa" w:w="100"/>
-            </w:tcMar>
-          </w:tcPr>
-          <w:p>
-            <w:pPr>
-              <w:spacing w:after="0" w:line="270"/>
-            </w:pPr>
-            <w:r>
-              <w:rPr>
-                <w:rFonts w:ascii="Calibri" w:cs="Calibri" w:eastAsia="Calibri" w:hAnsi="Calibri"/>
-                <w:sz w:val="20"/>
-                <w:szCs w:val="20"/>
-              </w:rPr>
-              <w:t xml:space="preserve">06_16_parcours.png</w:t>
-            </w:r>
-          </w:p>
-        </w:tc>
-      </w:tr>
-      <w:tr>
-        <w:tc>
-          <w:tcPr>
-            <w:tcW w:type="dxa" w:w="1082"/>
-            <w:tcMar>
-              <w:top w:type="dxa" w:w="80"/>
-              <w:left w:type="dxa" w:w="100"/>
-              <w:bottom w:type="dxa" w:w="80"/>
-              <w:right w:type="dxa" w:w="100"/>
-            </w:tcMar>
-          </w:tcPr>
-          <w:p>
-            <w:pPr>
-              <w:spacing w:after="0" w:line="270"/>
-            </w:pPr>
-            <w:r>
-              <w:rPr>
-                <w:rFonts w:ascii="Calibri" w:cs="Calibri" w:eastAsia="Calibri" w:hAnsi="Calibri"/>
-                <w:sz w:val="20"/>
-                <w:szCs w:val="20"/>
-              </w:rPr>
-              <w:t xml:space="preserve">35</w:t>
-            </w:r>
-          </w:p>
-        </w:tc>
-        <w:tc>
-          <w:tcPr>
-            <w:tcW w:type="dxa" w:w="4510"/>
-            <w:tcMar>
-              <w:top w:type="dxa" w:w="80"/>
-              <w:left w:type="dxa" w:w="100"/>
-              <w:bottom w:type="dxa" w:w="80"/>
-              <w:right w:type="dxa" w:w="100"/>
-            </w:tcMar>
-          </w:tcPr>
-          <w:p>
-            <w:pPr>
-              <w:spacing w:after="0" w:line="270"/>
-            </w:pPr>
-            <w:r>
-              <w:rPr>
-                <w:rFonts w:ascii="Calibri" w:cs="Calibri" w:eastAsia="Calibri" w:hAnsi="Calibri"/>
-                <w:sz w:val="20"/>
-                <w:szCs w:val="20"/>
-              </w:rPr>
-              <w:t xml:space="preserve">« Mes inscriptions » de l'auto-école : convocations et présence de ses candidats</w:t>
-            </w:r>
-          </w:p>
-        </w:tc>
-        <w:tc>
-          <w:tcPr>
-            <w:tcW w:type="dxa" w:w="3428"/>
-            <w:tcMar>
-              <w:top w:type="dxa" w:w="80"/>
-              <w:left w:type="dxa" w:w="100"/>
-              <w:bottom w:type="dxa" w:w="80"/>
-              <w:right w:type="dxa" w:w="100"/>
-            </w:tcMar>
-          </w:tcPr>
-          <w:p>
-            <w:pPr>
-              <w:spacing w:after="0" w:line="270"/>
-            </w:pPr>
-            <w:r>
-              <w:rPr>
-                <w:rFonts w:ascii="Calibri" w:cs="Calibri" w:eastAsia="Calibri" w:hAnsi="Calibri"/>
-                <w:sz w:val="20"/>
-                <w:szCs w:val="20"/>
-              </w:rPr>
-              <w:t xml:space="preserve">06_16b_mes_inscriptions.png</w:t>
-            </w:r>
-          </w:p>
-        </w:tc>
-      </w:tr>
-      <w:tr>
-        <w:tc>
-          <w:tcPr>
-            <w:tcW w:type="dxa" w:w="1082"/>
-            <w:shd w:fill="F3F6FA" w:color="auto" w:val="clear"/>
-            <w:tcMar>
-              <w:top w:type="dxa" w:w="80"/>
-              <w:left w:type="dxa" w:w="100"/>
-              <w:bottom w:type="dxa" w:w="80"/>
-              <w:right w:type="dxa" w:w="100"/>
-            </w:tcMar>
-          </w:tcPr>
-          <w:p>
-            <w:pPr>
-              <w:spacing w:after="0" w:line="270"/>
-            </w:pPr>
-            <w:r>
-              <w:rPr>
-                <w:rFonts w:ascii="Calibri" w:cs="Calibri" w:eastAsia="Calibri" w:hAnsi="Calibri"/>
-                <w:sz w:val="20"/>
-                <w:szCs w:val="20"/>
-              </w:rPr>
-              <w:t xml:space="preserve">36</w:t>
-            </w:r>
-          </w:p>
-        </w:tc>
-        <w:tc>
-          <w:tcPr>
-            <w:tcW w:type="dxa" w:w="4510"/>
-            <w:shd w:fill="F3F6FA" w:color="auto" w:val="clear"/>
-            <w:tcMar>
-              <w:top w:type="dxa" w:w="80"/>
-              <w:left w:type="dxa" w:w="100"/>
-              <w:bottom w:type="dxa" w:w="80"/>
-              <w:right w:type="dxa" w:w="100"/>
-            </w:tcMar>
-          </w:tcPr>
-          <w:p>
-            <w:pPr>
-              <w:spacing w:after="0" w:line="270"/>
-            </w:pPr>
-            <w:r>
-              <w:rPr>
-                <w:rFonts w:ascii="Calibri" w:cs="Calibri" w:eastAsia="Calibri" w:hAnsi="Calibri"/>
-                <w:sz w:val="20"/>
-                <w:szCs w:val="20"/>
-              </w:rPr>
-              <w:t xml:space="preserve">Résultats vus par l'auto-école : seulement les résultats validés</w:t>
-            </w:r>
-          </w:p>
-        </w:tc>
-        <w:tc>
-          <w:tcPr>
-            <w:tcW w:type="dxa" w:w="3428"/>
-            <w:shd w:fill="F3F6FA" w:color="auto" w:val="clear"/>
-            <w:tcMar>
-              <w:top w:type="dxa" w:w="80"/>
-              <w:left w:type="dxa" w:w="100"/>
-              <w:bottom w:type="dxa" w:w="80"/>
-              <w:right w:type="dxa" w:w="100"/>
-            </w:tcMar>
-          </w:tcPr>
-          <w:p>
-            <w:pPr>
-              <w:spacing w:after="0" w:line="270"/>
-            </w:pPr>
-            <w:r>
-              <w:rPr>
-                <w:rFonts w:ascii="Calibri" w:cs="Calibri" w:eastAsia="Calibri" w:hAnsi="Calibri"/>
-                <w:sz w:val="20"/>
-                <w:szCs w:val="20"/>
-              </w:rPr>
-              <w:t xml:space="preserve">06_16c_resultats_auto_ecole.png</w:t>
-            </w:r>
-          </w:p>
-        </w:tc>
-      </w:tr>
-      <w:tr>
-        <w:tc>
-          <w:tcPr>
-            <w:tcW w:type="dxa" w:w="1082"/>
-            <w:tcMar>
-              <w:top w:type="dxa" w:w="80"/>
-              <w:left w:type="dxa" w:w="100"/>
-              <w:bottom w:type="dxa" w:w="80"/>
-              <w:right w:type="dxa" w:w="100"/>
-            </w:tcMar>
-          </w:tcPr>
-          <w:p>
-            <w:pPr>
-              <w:spacing w:after="0" w:line="270"/>
-            </w:pPr>
-            <w:r>
-              <w:rPr>
-                <w:rFonts w:ascii="Calibri" w:cs="Calibri" w:eastAsia="Calibri" w:hAnsi="Calibri"/>
-                <w:sz w:val="20"/>
-                <w:szCs w:val="20"/>
-              </w:rPr>
-              <w:t xml:space="preserve">37</w:t>
-            </w:r>
-          </w:p>
-        </w:tc>
-        <w:tc>
-          <w:tcPr>
-            <w:tcW w:type="dxa" w:w="4510"/>
-            <w:tcMar>
-              <w:top w:type="dxa" w:w="80"/>
-              <w:left w:type="dxa" w:w="100"/>
-              <w:bottom w:type="dxa" w:w="80"/>
-              <w:right w:type="dxa" w:w="100"/>
-            </w:tcMar>
-          </w:tcPr>
-          <w:p>
-            <w:pPr>
-              <w:spacing w:after="0" w:line="270"/>
-            </w:pPr>
-            <w:r>
-              <w:rPr>
-                <w:rFonts w:ascii="Calibri" w:cs="Calibri" w:eastAsia="Calibri" w:hAnsi="Calibri"/>
-                <w:sz w:val="20"/>
-                <w:szCs w:val="20"/>
-              </w:rPr>
-              <w:t xml:space="preserve">Relevé de résultat, prêt à imprimer</w:t>
-            </w:r>
-          </w:p>
-        </w:tc>
-        <w:tc>
-          <w:tcPr>
-            <w:tcW w:type="dxa" w:w="3428"/>
-            <w:tcMar>
-              <w:top w:type="dxa" w:w="80"/>
-              <w:left w:type="dxa" w:w="100"/>
-              <w:bottom w:type="dxa" w:w="80"/>
-              <w:right w:type="dxa" w:w="100"/>
-            </w:tcMar>
-          </w:tcPr>
-          <w:p>
-            <w:pPr>
-              <w:spacing w:after="0" w:line="270"/>
-            </w:pPr>
-            <w:r>
-              <w:rPr>
-                <w:rFonts w:ascii="Calibri" w:cs="Calibri" w:eastAsia="Calibri" w:hAnsi="Calibri"/>
-                <w:sz w:val="20"/>
-                <w:szCs w:val="20"/>
-              </w:rPr>
-              <w:t xml:space="preserve">06_17_releve.png</w:t>
-            </w:r>
-          </w:p>
-        </w:tc>
-      </w:tr>
-      <w:tr>
-        <w:tc>
-          <w:tcPr>
-            <w:tcW w:type="dxa" w:w="1082"/>
-            <w:shd w:fill="F3F6FA" w:color="auto" w:val="clear"/>
-            <w:tcMar>
-              <w:top w:type="dxa" w:w="80"/>
-              <w:left w:type="dxa" w:w="100"/>
-              <w:bottom w:type="dxa" w:w="80"/>
-              <w:right w:type="dxa" w:w="100"/>
-            </w:tcMar>
-          </w:tcPr>
-          <w:p>
-            <w:pPr>
-              <w:spacing w:after="0" w:line="270"/>
-            </w:pPr>
-            <w:r>
-              <w:rPr>
-                <w:rFonts w:ascii="Calibri" w:cs="Calibri" w:eastAsia="Calibri" w:hAnsi="Calibri"/>
-                <w:sz w:val="20"/>
-                <w:szCs w:val="20"/>
-              </w:rPr>
-              <w:t xml:space="preserve">38</w:t>
-            </w:r>
-          </w:p>
-        </w:tc>
-        <w:tc>
-          <w:tcPr>
-            <w:tcW w:type="dxa" w:w="4510"/>
-            <w:shd w:fill="F3F6FA" w:color="auto" w:val="clear"/>
-            <w:tcMar>
-              <w:top w:type="dxa" w:w="80"/>
-              <w:left w:type="dxa" w:w="100"/>
-              <w:bottom w:type="dxa" w:w="80"/>
-              <w:right w:type="dxa" w:w="100"/>
-            </w:tcMar>
-          </w:tcPr>
-          <w:p>
-            <w:pPr>
-              <w:spacing w:after="0" w:line="270"/>
-            </w:pPr>
-            <w:r>
-              <w:rPr>
-                <w:rFonts w:ascii="Calibri" w:cs="Calibri" w:eastAsia="Calibri" w:hAnsi="Calibri"/>
-                <w:sz w:val="20"/>
-                <w:szCs w:val="20"/>
-              </w:rPr>
-              <w:t xml:space="preserve">Liste d'appel imprimable d'une session, avec cases à cocher</w:t>
-            </w:r>
-          </w:p>
-        </w:tc>
-        <w:tc>
-          <w:tcPr>
-            <w:tcW w:type="dxa" w:w="3428"/>
-            <w:shd w:fill="F3F6FA" w:color="auto" w:val="clear"/>
-            <w:tcMar>
-              <w:top w:type="dxa" w:w="80"/>
-              <w:left w:type="dxa" w:w="100"/>
-              <w:bottom w:type="dxa" w:w="80"/>
-              <w:right w:type="dxa" w:w="100"/>
-            </w:tcMar>
-          </w:tcPr>
-          <w:p>
-            <w:pPr>
-              <w:spacing w:after="0" w:line="270"/>
-            </w:pPr>
-            <w:r>
-              <w:rPr>
-                <w:rFonts w:ascii="Calibri" w:cs="Calibri" w:eastAsia="Calibri" w:hAnsi="Calibri"/>
-                <w:sz w:val="20"/>
-                <w:szCs w:val="20"/>
-              </w:rPr>
-              <w:t xml:space="preserve">06_17b_liste_appel.png</w:t>
-            </w:r>
-          </w:p>
-        </w:tc>
-      </w:tr>
-      <w:tr>
-        <w:tc>
-          <w:tcPr>
-            <w:tcW w:type="dxa" w:w="1082"/>
-            <w:tcMar>
-              <w:top w:type="dxa" w:w="80"/>
-              <w:left w:type="dxa" w:w="100"/>
-              <w:bottom w:type="dxa" w:w="80"/>
-              <w:right w:type="dxa" w:w="100"/>
-            </w:tcMar>
-          </w:tcPr>
-          <w:p>
-            <w:pPr>
-              <w:spacing w:after="0" w:line="270"/>
-            </w:pPr>
-            <w:r>
-              <w:rPr>
-                <w:rFonts w:ascii="Calibri" w:cs="Calibri" w:eastAsia="Calibri" w:hAnsi="Calibri"/>
-                <w:sz w:val="20"/>
-                <w:szCs w:val="20"/>
-              </w:rPr>
-              <w:t xml:space="preserve">39</w:t>
-            </w:r>
-          </w:p>
-        </w:tc>
-        <w:tc>
-          <w:tcPr>
-            <w:tcW w:type="dxa" w:w="4510"/>
-            <w:tcMar>
-              <w:top w:type="dxa" w:w="80"/>
-              <w:left w:type="dxa" w:w="100"/>
-              <w:bottom w:type="dxa" w:w="80"/>
-              <w:right w:type="dxa" w:w="100"/>
-            </w:tcMar>
-          </w:tcPr>
-          <w:p>
-            <w:pPr>
-              <w:spacing w:after="0" w:line="270"/>
-            </w:pPr>
-            <w:r>
-              <w:rPr>
-                <w:rFonts w:ascii="Calibri" w:cs="Calibri" w:eastAsia="Calibri" w:hAnsi="Calibri"/>
-                <w:sz w:val="20"/>
-                <w:szCs w:val="20"/>
-              </w:rPr>
-              <w:t xml:space="preserve">Liste des admis d'une session : seulement les résultats validés</w:t>
-            </w:r>
-          </w:p>
-        </w:tc>
-        <w:tc>
-          <w:tcPr>
-            <w:tcW w:type="dxa" w:w="3428"/>
-            <w:tcMar>
-              <w:top w:type="dxa" w:w="80"/>
-              <w:left w:type="dxa" w:w="100"/>
-              <w:bottom w:type="dxa" w:w="80"/>
-              <w:right w:type="dxa" w:w="100"/>
-            </w:tcMar>
-          </w:tcPr>
-          <w:p>
-            <w:pPr>
-              <w:spacing w:after="0" w:line="270"/>
-            </w:pPr>
-            <w:r>
-              <w:rPr>
-                <w:rFonts w:ascii="Calibri" w:cs="Calibri" w:eastAsia="Calibri" w:hAnsi="Calibri"/>
-                <w:sz w:val="20"/>
-                <w:szCs w:val="20"/>
-              </w:rPr>
-              <w:t xml:space="preserve">06_17c_liste_admis.png</w:t>
-            </w:r>
-          </w:p>
-        </w:tc>
-      </w:tr>
-      <w:tr>
-        <w:tc>
-          <w:tcPr>
-            <w:tcW w:type="dxa" w:w="1082"/>
-            <w:shd w:fill="F3F6FA" w:color="auto" w:val="clear"/>
-            <w:tcMar>
-              <w:top w:type="dxa" w:w="80"/>
-              <w:left w:type="dxa" w:w="100"/>
-              <w:bottom w:type="dxa" w:w="80"/>
-              <w:right w:type="dxa" w:w="100"/>
-            </w:tcMar>
-          </w:tcPr>
-          <w:p>
-            <w:pPr>
-              <w:spacing w:after="0" w:line="270"/>
-            </w:pPr>
-            <w:r>
-              <w:rPr>
-                <w:rFonts w:ascii="Calibri" w:cs="Calibri" w:eastAsia="Calibri" w:hAnsi="Calibri"/>
-                <w:sz w:val="20"/>
-                <w:szCs w:val="20"/>
-              </w:rPr>
-              <w:t xml:space="preserve">40</w:t>
-            </w:r>
-          </w:p>
-        </w:tc>
-        <w:tc>
-          <w:tcPr>
-            <w:tcW w:type="dxa" w:w="4510"/>
-            <w:shd w:fill="F3F6FA" w:color="auto" w:val="clear"/>
-            <w:tcMar>
-              <w:top w:type="dxa" w:w="80"/>
-              <w:left w:type="dxa" w:w="100"/>
-              <w:bottom w:type="dxa" w:w="80"/>
-              <w:right w:type="dxa" w:w="100"/>
-            </w:tcMar>
-          </w:tcPr>
-          <w:p>
-            <w:pPr>
-              <w:spacing w:after="0" w:line="270"/>
-            </w:pPr>
-            <w:r>
-              <w:rPr>
-                <w:rFonts w:ascii="Calibri" w:cs="Calibri" w:eastAsia="Calibri" w:hAnsi="Calibri"/>
-                <w:sz w:val="20"/>
-                <w:szCs w:val="20"/>
-              </w:rPr>
-              <w:t xml:space="preserve">Journal des modifications, filtrable</w:t>
-            </w:r>
-          </w:p>
-        </w:tc>
-        <w:tc>
-          <w:tcPr>
-            <w:tcW w:type="dxa" w:w="3428"/>
-            <w:shd w:fill="F3F6FA" w:color="auto" w:val="clear"/>
-            <w:tcMar>
-              <w:top w:type="dxa" w:w="80"/>
-              <w:left w:type="dxa" w:w="100"/>
-              <w:bottom w:type="dxa" w:w="80"/>
-              <w:right w:type="dxa" w:w="100"/>
-            </w:tcMar>
-          </w:tcPr>
-          <w:p>
-            <w:pPr>
-              <w:spacing w:after="0" w:line="270"/>
-            </w:pPr>
-            <w:r>
-              <w:rPr>
-                <w:rFonts w:ascii="Calibri" w:cs="Calibri" w:eastAsia="Calibri" w:hAnsi="Calibri"/>
-                <w:sz w:val="20"/>
-                <w:szCs w:val="20"/>
-              </w:rPr>
-              <w:t xml:space="preserve">06_18_historique.png</w:t>
-            </w:r>
-          </w:p>
-        </w:tc>
-      </w:tr>
-      <w:tr>
-        <w:tc>
-          <w:tcPr>
-            <w:tcW w:type="dxa" w:w="1082"/>
-            <w:tcMar>
-              <w:top w:type="dxa" w:w="80"/>
-              <w:left w:type="dxa" w:w="100"/>
-              <w:bottom w:type="dxa" w:w="80"/>
-              <w:right w:type="dxa" w:w="100"/>
-            </w:tcMar>
-          </w:tcPr>
-          <w:p>
-            <w:pPr>
-              <w:spacing w:after="0" w:line="270"/>
-            </w:pPr>
-            <w:r>
-              <w:rPr>
-                <w:rFonts w:ascii="Calibri" w:cs="Calibri" w:eastAsia="Calibri" w:hAnsi="Calibri"/>
-                <w:sz w:val="20"/>
-                <w:szCs w:val="20"/>
-              </w:rPr>
-              <w:t xml:space="preserve">41</w:t>
-            </w:r>
-          </w:p>
-        </w:tc>
-        <w:tc>
-          <w:tcPr>
-            <w:tcW w:type="dxa" w:w="4510"/>
-            <w:tcMar>
-              <w:top w:type="dxa" w:w="80"/>
-              <w:left w:type="dxa" w:w="100"/>
-              <w:bottom w:type="dxa" w:w="80"/>
-              <w:right w:type="dxa" w:w="100"/>
-            </w:tcMar>
-          </w:tcPr>
-          <w:p>
-            <w:pPr>
-              <w:spacing w:after="0" w:line="270"/>
-            </w:pPr>
-            <w:r>
-              <w:rPr>
-                <w:rFonts w:ascii="Calibri" w:cs="Calibri" w:eastAsia="Calibri" w:hAnsi="Calibri"/>
-                <w:sz w:val="20"/>
-                <w:szCs w:val="20"/>
-              </w:rPr>
-              <w:t xml:space="preserve">Synchronisation : réseau coupé, un résultat en attente, un envoyé</w:t>
-            </w:r>
-          </w:p>
-        </w:tc>
-        <w:tc>
-          <w:tcPr>
-            <w:tcW w:type="dxa" w:w="3428"/>
-            <w:tcMar>
-              <w:top w:type="dxa" w:w="80"/>
-              <w:left w:type="dxa" w:w="100"/>
-              <w:bottom w:type="dxa" w:w="80"/>
-              <w:right w:type="dxa" w:w="100"/>
-            </w:tcMar>
-          </w:tcPr>
-          <w:p>
-            <w:pPr>
-              <w:spacing w:after="0" w:line="270"/>
-            </w:pPr>
-            <w:r>
-              <w:rPr>
-                <w:rFonts w:ascii="Calibri" w:cs="Calibri" w:eastAsia="Calibri" w:hAnsi="Calibri"/>
-                <w:sz w:val="20"/>
-                <w:szCs w:val="20"/>
-              </w:rPr>
-              <w:t xml:space="preserve">06_19_synchronisation.png</w:t>
-            </w:r>
-          </w:p>
-        </w:tc>
-      </w:tr>
-      <w:tr>
-        <w:tc>
-          <w:tcPr>
-            <w:tcW w:type="dxa" w:w="1082"/>
-            <w:shd w:fill="F3F6FA" w:color="auto" w:val="clear"/>
-            <w:tcMar>
-              <w:top w:type="dxa" w:w="80"/>
-              <w:left w:type="dxa" w:w="100"/>
-              <w:bottom w:type="dxa" w:w="80"/>
-              <w:right w:type="dxa" w:w="100"/>
-            </w:tcMar>
-          </w:tcPr>
-          <w:p>
-            <w:pPr>
-              <w:spacing w:after="0" w:line="270"/>
-            </w:pPr>
-            <w:r>
-              <w:rPr>
-                <w:rFonts w:ascii="Calibri" w:cs="Calibri" w:eastAsia="Calibri" w:hAnsi="Calibri"/>
-                <w:sz w:val="20"/>
-                <w:szCs w:val="20"/>
-              </w:rPr>
-              <w:t xml:space="preserve">42</w:t>
-            </w:r>
-          </w:p>
-        </w:tc>
-        <w:tc>
-          <w:tcPr>
-            <w:tcW w:type="dxa" w:w="4510"/>
-            <w:shd w:fill="F3F6FA" w:color="auto" w:val="clear"/>
-            <w:tcMar>
-              <w:top w:type="dxa" w:w="80"/>
-              <w:left w:type="dxa" w:w="100"/>
-              <w:bottom w:type="dxa" w:w="80"/>
-              <w:right w:type="dxa" w:w="100"/>
-            </w:tcMar>
-          </w:tcPr>
-          <w:p>
-            <w:pPr>
-              <w:spacing w:after="0" w:line="270"/>
-            </w:pPr>
-            <w:r>
-              <w:rPr>
-                <w:rFonts w:ascii="Calibri" w:cs="Calibri" w:eastAsia="Calibri" w:hAnsi="Calibri"/>
-                <w:sz w:val="20"/>
-                <w:szCs w:val="20"/>
-              </w:rPr>
-              <w:t xml:space="preserve">Configuration → Règles : chaque règle est une ligne modifiable, avec son drapeau</w:t>
-            </w:r>
-          </w:p>
-        </w:tc>
-        <w:tc>
-          <w:tcPr>
-            <w:tcW w:type="dxa" w:w="3428"/>
-            <w:shd w:fill="F3F6FA" w:color="auto" w:val="clear"/>
-            <w:tcMar>
-              <w:top w:type="dxa" w:w="80"/>
-              <w:left w:type="dxa" w:w="100"/>
-              <w:bottom w:type="dxa" w:w="80"/>
-              <w:right w:type="dxa" w:w="100"/>
-            </w:tcMar>
-          </w:tcPr>
-          <w:p>
-            <w:pPr>
-              <w:spacing w:after="0" w:line="270"/>
-            </w:pPr>
-            <w:r>
-              <w:rPr>
-                <w:rFonts w:ascii="Calibri" w:cs="Calibri" w:eastAsia="Calibri" w:hAnsi="Calibri"/>
-                <w:sz w:val="20"/>
-                <w:szCs w:val="20"/>
-              </w:rPr>
-              <w:t xml:space="preserve">08_regles.png</w:t>
-            </w:r>
-          </w:p>
-        </w:tc>
-      </w:tr>
-      <w:tr>
-        <w:tc>
-          <w:tcPr>
-            <w:tcW w:type="dxa" w:w="1082"/>
-            <w:tcMar>
-              <w:top w:type="dxa" w:w="80"/>
-              <w:left w:type="dxa" w:w="100"/>
-              <w:bottom w:type="dxa" w:w="80"/>
-              <w:right w:type="dxa" w:w="100"/>
-            </w:tcMar>
-          </w:tcPr>
-          <w:p>
-            <w:pPr>
-              <w:spacing w:after="0" w:line="270"/>
-            </w:pPr>
-            <w:r>
-              <w:rPr>
-                <w:rFonts w:ascii="Calibri" w:cs="Calibri" w:eastAsia="Calibri" w:hAnsi="Calibri"/>
-                <w:sz w:val="20"/>
-                <w:szCs w:val="20"/>
-              </w:rPr>
-              <w:t xml:space="preserve">43</w:t>
-            </w:r>
-          </w:p>
-        </w:tc>
-        <w:tc>
-          <w:tcPr>
-            <w:tcW w:type="dxa" w:w="4510"/>
-            <w:tcMar>
-              <w:top w:type="dxa" w:w="80"/>
-              <w:left w:type="dxa" w:w="100"/>
-              <w:bottom w:type="dxa" w:w="80"/>
-              <w:right w:type="dxa" w:w="100"/>
-            </w:tcMar>
-          </w:tcPr>
-          <w:p>
-            <w:pPr>
-              <w:spacing w:after="0" w:line="270"/>
-            </w:pPr>
-            <w:r>
-              <w:rPr>
-                <w:rFonts w:ascii="Calibri" w:cs="Calibri" w:eastAsia="Calibri" w:hAnsi="Calibri"/>
-                <w:sz w:val="20"/>
-                <w:szCs w:val="20"/>
-              </w:rPr>
-              <w:t xml:space="preserve">Modification d'une règle : la valeur, sa description et la case « à confirmer »</w:t>
-            </w:r>
-          </w:p>
-        </w:tc>
-        <w:tc>
-          <w:tcPr>
-            <w:tcW w:type="dxa" w:w="3428"/>
-            <w:tcMar>
-              <w:top w:type="dxa" w:w="80"/>
-              <w:left w:type="dxa" w:w="100"/>
-              <w:bottom w:type="dxa" w:w="80"/>
-              <w:right w:type="dxa" w:w="100"/>
-            </w:tcMar>
-          </w:tcPr>
-          <w:p>
-            <w:pPr>
-              <w:spacing w:after="0" w:line="270"/>
-            </w:pPr>
-            <w:r>
-              <w:rPr>
-                <w:rFonts w:ascii="Calibri" w:cs="Calibri" w:eastAsia="Calibri" w:hAnsi="Calibri"/>
-                <w:sz w:val="20"/>
-                <w:szCs w:val="20"/>
-              </w:rPr>
-              <w:t xml:space="preserve">08_regle_delai.png</w:t>
-            </w:r>
-          </w:p>
-        </w:tc>
-      </w:tr>
-    </w:tbl>
+        <w:t xml:space="preserve">Extrait simplifié de AppelViewModel (la version réelle vérifie d'abord le statut de la session et de la présence).</w:t>
+      </w:r>
+    </w:p>
+    <w:p>
+      <w:pPr>
+        <w:shd w:fill="F3F6FA" w:color="auto" w:val="clear"/>
+        <w:spacing w:after="0" w:line="260"/>
+        <w:ind w:left="200" w:right="200"/>
+      </w:pPr>
+      <w:r>
+        <w:rPr>
+          <w:rFonts w:ascii="Consolas" w:cs="Consolas" w:eastAsia="Consolas" w:hAnsi="Consolas"/>
+          <w:sz w:val="18"/>
+          <w:szCs w:val="18"/>
+        </w:rPr>
+        <w:t xml:space="preserve">db.withTransaction {</w:t>
+      </w:r>
+    </w:p>
+    <w:p>
+      <w:pPr>
+        <w:shd w:fill="F3F6FA" w:color="auto" w:val="clear"/>
+        <w:spacing w:after="0" w:line="260"/>
+        <w:ind w:left="200" w:right="200"/>
+      </w:pPr>
+      <w:r>
+        <w:rPr>
+          <w:rFonts w:ascii="Consolas" w:cs="Consolas" w:eastAsia="Consolas" w:hAnsi="Consolas"/>
+          <w:sz w:val="18"/>
+          <w:szCs w:val="18"/>
+        </w:rPr>
+        <w:t xml:space="preserve">    val modifiee = presence.copy(statut = StatutPresence.PRESENT)</w:t>
+      </w:r>
+    </w:p>
+    <w:p>
+      <w:pPr>
+        <w:shd w:fill="F3F6FA" w:color="auto" w:val="clear"/>
+        <w:spacing w:after="0" w:line="260"/>
+        <w:ind w:left="200" w:right="200"/>
+      </w:pPr>
+      <w:r>
+        <w:rPr>
+          <w:rFonts w:ascii="Consolas" w:cs="Consolas" w:eastAsia="Consolas" w:hAnsi="Consolas"/>
+          <w:sz w:val="18"/>
+          <w:szCs w:val="18"/>
+        </w:rPr>
+        <w:t xml:space="preserve">    db.presenceDao().modifier(modifiee)</w:t>
+      </w:r>
+    </w:p>
+    <w:p>
+      <w:pPr>
+        <w:shd w:fill="F3F6FA" w:color="auto" w:val="clear"/>
+        <w:spacing w:after="0" w:line="260"/>
+        <w:ind w:left="200" w:right="200"/>
+      </w:pPr>
+      <w:r>
+        <w:rPr>
+          <w:rFonts w:ascii="Consolas" w:cs="Consolas" w:eastAsia="Consolas" w:hAnsi="Consolas"/>
+          <w:sz w:val="18"/>
+          <w:szCs w:val="18"/>
+        </w:rPr>
+        <w:t xml:space="preserve">    db.tracer(EntitesHistorique.PRESENCE, presence.id, ActionsHistorique.MODIFICATION,</w:t>
+      </w:r>
+    </w:p>
+    <w:p>
+      <w:pPr>
+        <w:shd w:fill="F3F6FA" w:color="auto" w:val="clear"/>
+        <w:spacing w:after="0" w:line="260"/>
+        <w:ind w:left="200" w:right="200"/>
+      </w:pPr>
+      <w:r>
+        <w:rPr>
+          <w:rFonts w:ascii="Consolas" w:cs="Consolas" w:eastAsia="Consolas" w:hAnsi="Consolas"/>
+          <w:sz w:val="18"/>
+          <w:szCs w:val="18"/>
+        </w:rPr>
+        <w:t xml:space="preserve">        utilisateur.id, ancienneValeur = presence.resume(), nouvelleValeur = modifiee.resume())</w:t>
+      </w:r>
+    </w:p>
+    <w:p>
+      <w:pPr>
+        <w:shd w:fill="F3F6FA" w:color="auto" w:val="clear"/>
+        <w:spacing w:after="0" w:line="260"/>
+        <w:ind w:left="200" w:right="200"/>
+      </w:pPr>
+      <w:r>
+        <w:rPr>
+          <w:rFonts w:ascii="Consolas" w:cs="Consolas" w:eastAsia="Consolas" w:hAnsi="Consolas"/>
+          <w:sz w:val="18"/>
+          <w:szCs w:val="18"/>
+        </w:rPr>
+        <w:t xml:space="preserve">}</w:t>
+      </w:r>
+    </w:p>
+    <w:p>
+      <w:pPr>
+        <w:spacing w:after="160"/>
+      </w:pPr>
+    </w:p>
+    <w:p>
+      <w:pPr>
+        <w:spacing w:after="120" w:line="300"/>
+      </w:pPr>
+      <w:r>
+        <w:rPr>
+          <w:rFonts w:ascii="Calibri" w:cs="Calibri" w:eastAsia="Calibri" w:hAnsi="Calibri"/>
+          <w:sz w:val="22"/>
+          <w:szCs w:val="22"/>
+        </w:rPr>
+        <w:t xml:space="preserve">La modification et sa trace sont dans le même bloc : Room les écrit ensemble ou n'écrit rien. L'historique ne peut donc jamais raconter autre chose que ce qui s'est passé.</w:t>
+      </w:r>
+    </w:p>
+    <w:p>
+      <w:pPr>
+        <w:pStyle w:val="Heading2"/>
+        <w:spacing w:after="140" w:before="280"/>
+      </w:pPr>
+      <w:r>
+        <w:rPr>
+          <w:rFonts w:ascii="Calibri" w:cs="Calibri" w:eastAsia="Calibri" w:hAnsi="Calibri"/>
+          <w:b/>
+          <w:bCs/>
+          <w:color w:val="0B2E4F"/>
+          <w:sz w:val="26"/>
+          <w:szCs w:val="26"/>
+        </w:rPr>
+        <w:t xml:space="preserve">A.2 Une règle pure et son test</w:t>
+      </w:r>
+    </w:p>
+    <w:p>
+      <w:pPr>
+        <w:shd w:fill="F3F6FA" w:color="auto" w:val="clear"/>
+        <w:spacing w:after="0" w:line="260"/>
+        <w:ind w:left="200" w:right="200"/>
+      </w:pPr>
+      <w:r>
+        <w:rPr>
+          <w:rFonts w:ascii="Consolas" w:cs="Consolas" w:eastAsia="Consolas" w:hAnsi="Consolas"/>
+          <w:sz w:val="18"/>
+          <w:szCs w:val="18"/>
+        </w:rPr>
+        <w:t xml:space="preserve">// Règle d'ouverture d'une tentative (couche métier)</w:t>
+      </w:r>
+    </w:p>
+    <w:p>
+      <w:pPr>
+        <w:shd w:fill="F3F6FA" w:color="auto" w:val="clear"/>
+        <w:spacing w:after="0" w:line="260"/>
+        <w:ind w:left="200" w:right="200"/>
+      </w:pPr>
+      <w:r>
+        <w:rPr>
+          <w:rFonts w:ascii="Consolas" w:cs="Consolas" w:eastAsia="Consolas" w:hAnsi="Consolas"/>
+          <w:sz w:val="18"/>
+          <w:szCs w:val="18"/>
+        </w:rPr>
+        <w:t xml:space="preserve">fun peutOuvrir(statutPresence: StatutPresence?, tentativeDeCetteInscription: Tentative?,</w:t>
+      </w:r>
+    </w:p>
+    <w:p>
+      <w:pPr>
+        <w:shd w:fill="F3F6FA" w:color="auto" w:val="clear"/>
+        <w:spacing w:after="0" w:line="260"/>
+        <w:ind w:left="200" w:right="200"/>
+      </w:pPr>
+      <w:r>
+        <w:rPr>
+          <w:rFonts w:ascii="Consolas" w:cs="Consolas" w:eastAsia="Consolas" w:hAnsi="Consolas"/>
+          <w:sz w:val="18"/>
+          <w:szCs w:val="18"/>
+        </w:rPr>
+        <w:t xml:space="preserve">               nombreTentatives: Int, tentativesMax: Int): String? = when {</w:t>
+      </w:r>
+    </w:p>
+    <w:p>
+      <w:pPr>
+        <w:shd w:fill="F3F6FA" w:color="auto" w:val="clear"/>
+        <w:spacing w:after="0" w:line="260"/>
+        <w:ind w:left="200" w:right="200"/>
+      </w:pPr>
+      <w:r>
+        <w:rPr>
+          <w:rFonts w:ascii="Consolas" w:cs="Consolas" w:eastAsia="Consolas" w:hAnsi="Consolas"/>
+          <w:sz w:val="18"/>
+          <w:szCs w:val="18"/>
+        </w:rPr>
+        <w:t xml:space="preserve">    tentativeDeCetteInscription != null -&gt; when (tentativeDeCetteInscription.statut) {</w:t>
+      </w:r>
+    </w:p>
+    <w:p>
+      <w:pPr>
+        <w:shd w:fill="F3F6FA" w:color="auto" w:val="clear"/>
+        <w:spacing w:after="0" w:line="260"/>
+        <w:ind w:left="200" w:right="200"/>
+      </w:pPr>
+      <w:r>
+        <w:rPr>
+          <w:rFonts w:ascii="Consolas" w:cs="Consolas" w:eastAsia="Consolas" w:hAnsi="Consolas"/>
+          <w:sz w:val="18"/>
+          <w:szCs w:val="18"/>
+        </w:rPr>
+        <w:t xml:space="preserve">        StatutTentative.EN_COURS -&gt; null                         // reprise du passage en cours</w:t>
+      </w:r>
+    </w:p>
+    <w:p>
+      <w:pPr>
+        <w:shd w:fill="F3F6FA" w:color="auto" w:val="clear"/>
+        <w:spacing w:after="0" w:line="260"/>
+        <w:ind w:left="200" w:right="200"/>
+      </w:pPr>
+      <w:r>
+        <w:rPr>
+          <w:rFonts w:ascii="Consolas" w:cs="Consolas" w:eastAsia="Consolas" w:hAnsi="Consolas"/>
+          <w:sz w:val="18"/>
+          <w:szCs w:val="18"/>
+        </w:rPr>
+        <w:t xml:space="preserve">        else -&gt; "Un passage existe déjà pour cette inscription."</w:t>
+      </w:r>
+    </w:p>
+    <w:p>
+      <w:pPr>
+        <w:shd w:fill="F3F6FA" w:color="auto" w:val="clear"/>
+        <w:spacing w:after="0" w:line="260"/>
+        <w:ind w:left="200" w:right="200"/>
+      </w:pPr>
+      <w:r>
+        <w:rPr>
+          <w:rFonts w:ascii="Consolas" w:cs="Consolas" w:eastAsia="Consolas" w:hAnsi="Consolas"/>
+          <w:sz w:val="18"/>
+          <w:szCs w:val="18"/>
+        </w:rPr>
+        <w:t xml:space="preserve">    }</w:t>
+      </w:r>
+    </w:p>
+    <w:p>
+      <w:pPr>
+        <w:shd w:fill="F3F6FA" w:color="auto" w:val="clear"/>
+        <w:spacing w:after="0" w:line="260"/>
+        <w:ind w:left="200" w:right="200"/>
+      </w:pPr>
+      <w:r>
+        <w:rPr>
+          <w:rFonts w:ascii="Consolas" w:cs="Consolas" w:eastAsia="Consolas" w:hAnsi="Consolas"/>
+          <w:sz w:val="18"/>
+          <w:szCs w:val="18"/>
+        </w:rPr>
+        <w:t xml:space="preserve">    statutPresence != StatutPresence.PRESENT &amp;&amp; statutPresence != StatutPresence.EN_COURS -&gt;</w:t>
+      </w:r>
+    </w:p>
+    <w:p>
+      <w:pPr>
+        <w:shd w:fill="F3F6FA" w:color="auto" w:val="clear"/>
+        <w:spacing w:after="0" w:line="260"/>
+        <w:ind w:left="200" w:right="200"/>
+      </w:pPr>
+      <w:r>
+        <w:rPr>
+          <w:rFonts w:ascii="Consolas" w:cs="Consolas" w:eastAsia="Consolas" w:hAnsi="Consolas"/>
+          <w:sz w:val="18"/>
+          <w:szCs w:val="18"/>
+        </w:rPr>
+        <w:t xml:space="preserve">        "Le candidat n'est pas marqué présent (appel)."</w:t>
+      </w:r>
+    </w:p>
+    <w:p>
+      <w:pPr>
+        <w:shd w:fill="F3F6FA" w:color="auto" w:val="clear"/>
+        <w:spacing w:after="0" w:line="260"/>
+        <w:ind w:left="200" w:right="200"/>
+      </w:pPr>
+      <w:r>
+        <w:rPr>
+          <w:rFonts w:ascii="Consolas" w:cs="Consolas" w:eastAsia="Consolas" w:hAnsi="Consolas"/>
+          <w:sz w:val="18"/>
+          <w:szCs w:val="18"/>
+        </w:rPr>
+        <w:t xml:space="preserve">    tentativesMax &gt; 0 &amp;&amp; nombreTentatives &gt;= tentativesMax -&gt; "Nombre maximal de passages atteint."</w:t>
+      </w:r>
+    </w:p>
+    <w:p>
+      <w:pPr>
+        <w:shd w:fill="F3F6FA" w:color="auto" w:val="clear"/>
+        <w:spacing w:after="0" w:line="260"/>
+        <w:ind w:left="200" w:right="200"/>
+      </w:pPr>
+      <w:r>
+        <w:rPr>
+          <w:rFonts w:ascii="Consolas" w:cs="Consolas" w:eastAsia="Consolas" w:hAnsi="Consolas"/>
+          <w:sz w:val="18"/>
+          <w:szCs w:val="18"/>
+        </w:rPr>
+        <w:t xml:space="preserve">    else -&gt; null</w:t>
+      </w:r>
+    </w:p>
+    <w:p>
+      <w:pPr>
+        <w:shd w:fill="F3F6FA" w:color="auto" w:val="clear"/>
+        <w:spacing w:after="0" w:line="260"/>
+        <w:ind w:left="200" w:right="200"/>
+      </w:pPr>
+      <w:r>
+        <w:rPr>
+          <w:rFonts w:ascii="Consolas" w:cs="Consolas" w:eastAsia="Consolas" w:hAnsi="Consolas"/>
+          <w:sz w:val="18"/>
+          <w:szCs w:val="18"/>
+        </w:rPr>
+        <w:t xml:space="preserve">}</w:t>
+      </w:r>
+    </w:p>
+    <w:p>
+      <w:pPr>
+        <w:shd w:fill="F3F6FA" w:color="auto" w:val="clear"/>
+        <w:spacing w:after="0" w:line="260"/>
+        <w:ind w:left="200" w:right="200"/>
+      </w:pPr>
+      <w:r>
+        <w:rPr>
+          <w:rFonts w:ascii="Consolas" w:cs="Consolas" w:eastAsia="Consolas" w:hAnsi="Consolas"/>
+          <w:sz w:val="18"/>
+          <w:szCs w:val="18"/>
+        </w:rPr>
+        <w:t xml:space="preserve"/>
+      </w:r>
+    </w:p>
+    <w:p>
+      <w:pPr>
+        <w:shd w:fill="F3F6FA" w:color="auto" w:val="clear"/>
+        <w:spacing w:after="0" w:line="260"/>
+        <w:ind w:left="200" w:right="200"/>
+      </w:pPr>
+      <w:r>
+        <w:rPr>
+          <w:rFonts w:ascii="Consolas" w:cs="Consolas" w:eastAsia="Consolas" w:hAnsi="Consolas"/>
+          <w:sz w:val="18"/>
+          <w:szCs w:val="18"/>
+        </w:rPr>
+        <w:t xml:space="preserve">// Son test unitaire</w:t>
+      </w:r>
+    </w:p>
+    <w:p>
+      <w:pPr>
+        <w:shd w:fill="F3F6FA" w:color="auto" w:val="clear"/>
+        <w:spacing w:after="0" w:line="260"/>
+        <w:ind w:left="200" w:right="200"/>
+      </w:pPr>
+      <w:r>
+        <w:rPr>
+          <w:rFonts w:ascii="Consolas" w:cs="Consolas" w:eastAsia="Consolas" w:hAnsi="Consolas"/>
+          <w:sz w:val="18"/>
+          <w:szCs w:val="18"/>
+        </w:rPr>
+        <w:t xml:space="preserve">@Test fun `ouverture reservee aux presents`() {</w:t>
+      </w:r>
+    </w:p>
+    <w:p>
+      <w:pPr>
+        <w:shd w:fill="F3F6FA" w:color="auto" w:val="clear"/>
+        <w:spacing w:after="0" w:line="260"/>
+        <w:ind w:left="200" w:right="200"/>
+      </w:pPr>
+      <w:r>
+        <w:rPr>
+          <w:rFonts w:ascii="Consolas" w:cs="Consolas" w:eastAsia="Consolas" w:hAnsi="Consolas"/>
+          <w:sz w:val="18"/>
+          <w:szCs w:val="18"/>
+        </w:rPr>
+        <w:t xml:space="preserve">    assertNull(ReglesTentatives.peutOuvrir(StatutPresence.PRESENT, null, 0, 0))</w:t>
+      </w:r>
+    </w:p>
+    <w:p>
+      <w:pPr>
+        <w:shd w:fill="F3F6FA" w:color="auto" w:val="clear"/>
+        <w:spacing w:after="0" w:line="260"/>
+        <w:ind w:left="200" w:right="200"/>
+      </w:pPr>
+      <w:r>
+        <w:rPr>
+          <w:rFonts w:ascii="Consolas" w:cs="Consolas" w:eastAsia="Consolas" w:hAnsi="Consolas"/>
+          <w:sz w:val="18"/>
+          <w:szCs w:val="18"/>
+        </w:rPr>
+        <w:t xml:space="preserve">    assertNotNull(ReglesTentatives.peutOuvrir(StatutPresence.ABSENT, null, 0, 0))</w:t>
+      </w:r>
+    </w:p>
+    <w:p>
+      <w:pPr>
+        <w:shd w:fill="F3F6FA" w:color="auto" w:val="clear"/>
+        <w:spacing w:after="0" w:line="260"/>
+        <w:ind w:left="200" w:right="200"/>
+      </w:pPr>
+      <w:r>
+        <w:rPr>
+          <w:rFonts w:ascii="Consolas" w:cs="Consolas" w:eastAsia="Consolas" w:hAnsi="Consolas"/>
+          <w:sz w:val="18"/>
+          <w:szCs w:val="18"/>
+        </w:rPr>
+        <w:t xml:space="preserve">}</w:t>
+      </w:r>
+    </w:p>
+    <w:p>
+      <w:pPr>
+        <w:spacing w:after="120" w:line="300"/>
+      </w:pPr>
+      <w:r>
+        <w:rPr>
+          <w:rFonts w:ascii="Calibri" w:cs="Calibri" w:eastAsia="Calibri" w:hAnsi="Calibri"/>
+          <w:sz w:val="22"/>
+          <w:szCs w:val="22"/>
+        </w:rPr>
+        <w:t xml:space="preserve">Extrait simplifié (les messages réels citent le numéro et le statut du passage). La fonction ne connaît ni Android ni la base : elle reçoit des valeurs et renvoie un message d'erreur ou null. Le ViewModel fait les requêtes, la fonction fait le jugement, le test JUnit tourne sans téléphone.</w:t>
+      </w:r>
+    </w:p>
+    <w:p>
+      <w:pPr>
+        <w:pStyle w:val="Heading2"/>
+        <w:spacing w:after="140" w:before="280"/>
+      </w:pPr>
+      <w:r>
+        <w:rPr>
+          <w:rFonts w:ascii="Calibri" w:cs="Calibri" w:eastAsia="Calibri" w:hAnsi="Calibri"/>
+          <w:b/>
+          <w:bCs/>
+          <w:color w:val="0B2E4F"/>
+          <w:sz w:val="26"/>
+          <w:szCs w:val="26"/>
+        </w:rPr>
+        <w:t xml:space="preserve">A.3 Un ViewModel branché sur Room</w:t>
+      </w:r>
+    </w:p>
+    <w:p>
+      <w:pPr>
+        <w:shd w:fill="F3F6FA" w:color="auto" w:val="clear"/>
+        <w:spacing w:after="0" w:line="260"/>
+        <w:ind w:left="200" w:right="200"/>
+      </w:pPr>
+      <w:r>
+        <w:rPr>
+          <w:rFonts w:ascii="Consolas" w:cs="Consolas" w:eastAsia="Consolas" w:hAnsi="Consolas"/>
+          <w:sz w:val="18"/>
+          <w:szCs w:val="18"/>
+        </w:rPr>
+        <w:t xml:space="preserve">val etat: StateFlow&lt;EtatTentatives&gt; =</w:t>
+      </w:r>
+    </w:p>
+    <w:p>
+      <w:pPr>
+        <w:shd w:fill="F3F6FA" w:color="auto" w:val="clear"/>
+        <w:spacing w:after="0" w:line="260"/>
+        <w:ind w:left="200" w:right="200"/>
+      </w:pPr>
+      <w:r>
+        <w:rPr>
+          <w:rFonts w:ascii="Consolas" w:cs="Consolas" w:eastAsia="Consolas" w:hAnsi="Consolas"/>
+          <w:sz w:val="18"/>
+          <w:szCs w:val="18"/>
+        </w:rPr>
+        <w:t xml:space="preserve">    idSession.flatMapLatest { id -&gt;</w:t>
+      </w:r>
+    </w:p>
+    <w:p>
+      <w:pPr>
+        <w:shd w:fill="F3F6FA" w:color="auto" w:val="clear"/>
+        <w:spacing w:after="0" w:line="260"/>
+        <w:ind w:left="200" w:right="200"/>
+      </w:pPr>
+      <w:r>
+        <w:rPr>
+          <w:rFonts w:ascii="Consolas" w:cs="Consolas" w:eastAsia="Consolas" w:hAnsi="Consolas"/>
+          <w:sz w:val="18"/>
+          <w:szCs w:val="18"/>
+        </w:rPr>
+        <w:t xml:space="preserve">        combine(db.sessionDao().parIdEnDirect(id), db.inscriptionDao().parSession(id),</w:t>
+      </w:r>
+    </w:p>
+    <w:p>
+      <w:pPr>
+        <w:shd w:fill="F3F6FA" w:color="auto" w:val="clear"/>
+        <w:spacing w:after="0" w:line="260"/>
+        <w:ind w:left="200" w:right="200"/>
+      </w:pPr>
+      <w:r>
+        <w:rPr>
+          <w:rFonts w:ascii="Consolas" w:cs="Consolas" w:eastAsia="Consolas" w:hAnsi="Consolas"/>
+          <w:sz w:val="18"/>
+          <w:szCs w:val="18"/>
+        </w:rPr>
+        <w:t xml:space="preserve">                db.presenceDao().parSession(id), db.tentativeDao().parSession(id)) { s, i, p, t -&gt; ... }</w:t>
+      </w:r>
+    </w:p>
+    <w:p>
+      <w:pPr>
+        <w:shd w:fill="F3F6FA" w:color="auto" w:val="clear"/>
+        <w:spacing w:after="0" w:line="260"/>
+        <w:ind w:left="200" w:right="200"/>
+      </w:pPr>
+      <w:r>
+        <w:rPr>
+          <w:rFonts w:ascii="Consolas" w:cs="Consolas" w:eastAsia="Consolas" w:hAnsi="Consolas"/>
+          <w:sz w:val="18"/>
+          <w:szCs w:val="18"/>
+        </w:rPr>
+        <w:t xml:space="preserve">    }.stateIn(viewModelScope, SharingStarted.WhileSubscribed(5_000), EtatTentatives())</w:t>
+      </w:r>
+    </w:p>
+    <w:p>
+      <w:pPr>
+        <w:spacing w:after="120" w:line="300"/>
+      </w:pPr>
+      <w:r>
+        <w:rPr>
+          <w:rFonts w:ascii="Calibri" w:cs="Calibri" w:eastAsia="Calibri" w:hAnsi="Calibri"/>
+          <w:sz w:val="22"/>
+          <w:szCs w:val="22"/>
+        </w:rPr>
+        <w:t xml:space="preserve">L'écran collecte un seul état immuable, recalculé par Room à chaque changement d'une des tables : aucune lecture manuelle, aucun rafraîchissement à déclencher.</w:t>
+      </w:r>
+    </w:p>
+    <w:p>
+      <w:pPr>
+        <w:pStyle w:val="Heading2"/>
+        <w:spacing w:after="140" w:before="280"/>
+      </w:pPr>
+      <w:r>
+        <w:rPr>
+          <w:rFonts w:ascii="Calibri" w:cs="Calibri" w:eastAsia="Calibri" w:hAnsi="Calibri"/>
+          <w:b/>
+          <w:bCs/>
+          <w:color w:val="0B2E4F"/>
+          <w:sz w:val="26"/>
+          <w:szCs w:val="26"/>
+        </w:rPr>
+        <w:t xml:space="preserve">A.4 Le tirage du sujet, reproductible</w:t>
+      </w:r>
+    </w:p>
+    <w:p>
+      <w:pPr>
+        <w:shd w:fill="F3F6FA" w:color="auto" w:val="clear"/>
+        <w:spacing w:after="0" w:line="260"/>
+        <w:ind w:left="200" w:right="200"/>
+      </w:pPr>
+      <w:r>
+        <w:rPr>
+          <w:rFonts w:ascii="Consolas" w:cs="Consolas" w:eastAsia="Consolas" w:hAnsi="Consolas"/>
+          <w:sz w:val="18"/>
+          <w:szCs w:val="18"/>
+        </w:rPr>
+        <w:t xml:space="preserve">fun tirerSujet(questionsActives: List&lt;Question&gt;, noteMax: Double, aleatoire: Random = Random.Default): List&lt;Question&gt; {</w:t>
+      </w:r>
+    </w:p>
+    <w:p>
+      <w:pPr>
+        <w:shd w:fill="F3F6FA" w:color="auto" w:val="clear"/>
+        <w:spacing w:after="0" w:line="260"/>
+        <w:ind w:left="200" w:right="200"/>
+      </w:pPr>
+      <w:r>
+        <w:rPr>
+          <w:rFonts w:ascii="Consolas" w:cs="Consolas" w:eastAsia="Consolas" w:hAnsi="Consolas"/>
+          <w:sz w:val="18"/>
+          <w:szCs w:val="18"/>
+        </w:rPr>
+        <w:t xml:space="preserve">    val sujet = mutableListOf&lt;Question&gt;(); var total = 0.0</w:t>
+      </w:r>
+    </w:p>
+    <w:p>
+      <w:pPr>
+        <w:shd w:fill="F3F6FA" w:color="auto" w:val="clear"/>
+        <w:spacing w:after="0" w:line="260"/>
+        <w:ind w:left="200" w:right="200"/>
+      </w:pPr>
+      <w:r>
+        <w:rPr>
+          <w:rFonts w:ascii="Consolas" w:cs="Consolas" w:eastAsia="Consolas" w:hAnsi="Consolas"/>
+          <w:sz w:val="18"/>
+          <w:szCs w:val="18"/>
+        </w:rPr>
+        <w:t xml:space="preserve">    for (q in questionsActives.filter { it.actif &amp;&amp; it.points &gt; 0 }.shuffled(aleatoire)) {</w:t>
+      </w:r>
+    </w:p>
+    <w:p>
+      <w:pPr>
+        <w:shd w:fill="F3F6FA" w:color="auto" w:val="clear"/>
+        <w:spacing w:after="0" w:line="260"/>
+        <w:ind w:left="200" w:right="200"/>
+      </w:pPr>
+      <w:r>
+        <w:rPr>
+          <w:rFonts w:ascii="Consolas" w:cs="Consolas" w:eastAsia="Consolas" w:hAnsi="Consolas"/>
+          <w:sz w:val="18"/>
+          <w:szCs w:val="18"/>
+        </w:rPr>
+        <w:t xml:space="preserve">        if (total &gt;= noteMax) break</w:t>
+      </w:r>
+    </w:p>
+    <w:p>
+      <w:pPr>
+        <w:shd w:fill="F3F6FA" w:color="auto" w:val="clear"/>
+        <w:spacing w:after="0" w:line="260"/>
+        <w:ind w:left="200" w:right="200"/>
+      </w:pPr>
+      <w:r>
+        <w:rPr>
+          <w:rFonts w:ascii="Consolas" w:cs="Consolas" w:eastAsia="Consolas" w:hAnsi="Consolas"/>
+          <w:sz w:val="18"/>
+          <w:szCs w:val="18"/>
+        </w:rPr>
+        <w:t xml:space="preserve">        if (total + q.points &lt;= noteMax) { sujet += q; total += q.points }</w:t>
+      </w:r>
+    </w:p>
+    <w:p>
+      <w:pPr>
+        <w:shd w:fill="F3F6FA" w:color="auto" w:val="clear"/>
+        <w:spacing w:after="0" w:line="260"/>
+        <w:ind w:left="200" w:right="200"/>
+      </w:pPr>
+      <w:r>
+        <w:rPr>
+          <w:rFonts w:ascii="Consolas" w:cs="Consolas" w:eastAsia="Consolas" w:hAnsi="Consolas"/>
+          <w:sz w:val="18"/>
+          <w:szCs w:val="18"/>
+        </w:rPr>
+        <w:t xml:space="preserve">    }</w:t>
+      </w:r>
+    </w:p>
+    <w:p>
+      <w:pPr>
+        <w:shd w:fill="F3F6FA" w:color="auto" w:val="clear"/>
+        <w:spacing w:after="0" w:line="260"/>
+        <w:ind w:left="200" w:right="200"/>
+      </w:pPr>
+      <w:r>
+        <w:rPr>
+          <w:rFonts w:ascii="Consolas" w:cs="Consolas" w:eastAsia="Consolas" w:hAnsi="Consolas"/>
+          <w:sz w:val="18"/>
+          <w:szCs w:val="18"/>
+        </w:rPr>
+        <w:t xml:space="preserve">    return sujet</w:t>
+      </w:r>
+    </w:p>
+    <w:p>
+      <w:pPr>
+        <w:shd w:fill="F3F6FA" w:color="auto" w:val="clear"/>
+        <w:spacing w:after="0" w:line="260"/>
+        <w:ind w:left="200" w:right="200"/>
+      </w:pPr>
+      <w:r>
+        <w:rPr>
+          <w:rFonts w:ascii="Consolas" w:cs="Consolas" w:eastAsia="Consolas" w:hAnsi="Consolas"/>
+          <w:sz w:val="18"/>
+          <w:szCs w:val="18"/>
+        </w:rPr>
+        <w:t xml:space="preserve">}</w:t>
+      </w:r>
+    </w:p>
+    <w:p>
+      <w:pPr>
+        <w:spacing w:after="120" w:line="300"/>
+      </w:pPr>
+      <w:r>
+        <w:rPr>
+          <w:rFonts w:ascii="Calibri" w:cs="Calibri" w:eastAsia="Calibri" w:hAnsi="Calibri"/>
+          <w:sz w:val="22"/>
+          <w:szCs w:val="22"/>
+        </w:rPr>
+        <w:t xml:space="preserve">Le hasard est un paramètre : en production, le générateur par défaut ; en test, une graine fixe, et le test vérifie que le sujet atteint la note maximale sans la dépasser ni répéter une question.</w:t>
+      </w:r>
+    </w:p>
     <w:p>
       <w:pPr>
         <w:pStyle w:val="Heading1"/>
@@ -17276,718 +14604,7 @@
           <w:sz w:val="32"/>
           <w:szCs w:val="32"/>
         </w:rPr>
-        <w:t xml:space="preserve">Annexe B — Extraits de code commentés</w:t>
-      </w:r>
-    </w:p>
-    <w:p>
-      <w:pPr>
-        <w:pStyle w:val="Heading2"/>
-        <w:spacing w:after="140" w:before="280"/>
-      </w:pPr>
-      <w:r>
-        <w:rPr>
-          <w:rFonts w:ascii="Calibri" w:cs="Calibri" w:eastAsia="Calibri" w:hAnsi="Calibri"/>
-          <w:b/>
-          <w:bCs/>
-          <w:color w:val="0B2E4F"/>
-          <w:sz w:val="26"/>
-          <w:szCs w:val="26"/>
-        </w:rPr>
-        <w:t xml:space="preserve">B.1 Écriture et historique dans une même transaction</w:t>
-      </w:r>
-    </w:p>
-    <w:p>
-      <w:pPr>
-        <w:spacing w:after="120" w:line="300"/>
-      </w:pPr>
-      <w:r>
-        <w:rPr>
-          <w:rFonts w:ascii="Calibri" w:cs="Calibri" w:eastAsia="Calibri" w:hAnsi="Calibri"/>
-          <w:sz w:val="22"/>
-          <w:szCs w:val="22"/>
-        </w:rPr>
-        <w:t xml:space="preserve">Extrait simplifié de AppelViewModel (la version réelle vérifie d'abord le statut de la session et de la présence).</w:t>
-      </w:r>
-    </w:p>
-    <w:p>
-      <w:pPr>
-        <w:shd w:fill="F3F6FA" w:color="auto" w:val="clear"/>
-        <w:spacing w:after="0" w:line="260"/>
-        <w:ind w:left="200" w:right="200"/>
-      </w:pPr>
-      <w:r>
-        <w:rPr>
-          <w:rFonts w:ascii="Consolas" w:cs="Consolas" w:eastAsia="Consolas" w:hAnsi="Consolas"/>
-          <w:sz w:val="18"/>
-          <w:szCs w:val="18"/>
-        </w:rPr>
-        <w:t xml:space="preserve">db.withTransaction {</w:t>
-      </w:r>
-    </w:p>
-    <w:p>
-      <w:pPr>
-        <w:shd w:fill="F3F6FA" w:color="auto" w:val="clear"/>
-        <w:spacing w:after="0" w:line="260"/>
-        <w:ind w:left="200" w:right="200"/>
-      </w:pPr>
-      <w:r>
-        <w:rPr>
-          <w:rFonts w:ascii="Consolas" w:cs="Consolas" w:eastAsia="Consolas" w:hAnsi="Consolas"/>
-          <w:sz w:val="18"/>
-          <w:szCs w:val="18"/>
-        </w:rPr>
-        <w:t xml:space="preserve">    val modifiee = presence.copy(statut = StatutPresence.PRESENT)</w:t>
-      </w:r>
-    </w:p>
-    <w:p>
-      <w:pPr>
-        <w:shd w:fill="F3F6FA" w:color="auto" w:val="clear"/>
-        <w:spacing w:after="0" w:line="260"/>
-        <w:ind w:left="200" w:right="200"/>
-      </w:pPr>
-      <w:r>
-        <w:rPr>
-          <w:rFonts w:ascii="Consolas" w:cs="Consolas" w:eastAsia="Consolas" w:hAnsi="Consolas"/>
-          <w:sz w:val="18"/>
-          <w:szCs w:val="18"/>
-        </w:rPr>
-        <w:t xml:space="preserve">    db.presenceDao().modifier(modifiee)</w:t>
-      </w:r>
-    </w:p>
-    <w:p>
-      <w:pPr>
-        <w:shd w:fill="F3F6FA" w:color="auto" w:val="clear"/>
-        <w:spacing w:after="0" w:line="260"/>
-        <w:ind w:left="200" w:right="200"/>
-      </w:pPr>
-      <w:r>
-        <w:rPr>
-          <w:rFonts w:ascii="Consolas" w:cs="Consolas" w:eastAsia="Consolas" w:hAnsi="Consolas"/>
-          <w:sz w:val="18"/>
-          <w:szCs w:val="18"/>
-        </w:rPr>
-        <w:t xml:space="preserve">    db.tracer(EntitesHistorique.PRESENCE, presence.id, ActionsHistorique.MODIFICATION,</w:t>
-      </w:r>
-    </w:p>
-    <w:p>
-      <w:pPr>
-        <w:shd w:fill="F3F6FA" w:color="auto" w:val="clear"/>
-        <w:spacing w:after="0" w:line="260"/>
-        <w:ind w:left="200" w:right="200"/>
-      </w:pPr>
-      <w:r>
-        <w:rPr>
-          <w:rFonts w:ascii="Consolas" w:cs="Consolas" w:eastAsia="Consolas" w:hAnsi="Consolas"/>
-          <w:sz w:val="18"/>
-          <w:szCs w:val="18"/>
-        </w:rPr>
-        <w:t xml:space="preserve">        utilisateur.id, ancienneValeur = presence.resume(), nouvelleValeur = modifiee.resume())</w:t>
-      </w:r>
-    </w:p>
-    <w:p>
-      <w:pPr>
-        <w:shd w:fill="F3F6FA" w:color="auto" w:val="clear"/>
-        <w:spacing w:after="0" w:line="260"/>
-        <w:ind w:left="200" w:right="200"/>
-      </w:pPr>
-      <w:r>
-        <w:rPr>
-          <w:rFonts w:ascii="Consolas" w:cs="Consolas" w:eastAsia="Consolas" w:hAnsi="Consolas"/>
-          <w:sz w:val="18"/>
-          <w:szCs w:val="18"/>
-        </w:rPr>
-        <w:t xml:space="preserve">}</w:t>
-      </w:r>
-    </w:p>
-    <w:p>
-      <w:pPr>
-        <w:spacing w:after="160"/>
-      </w:pPr>
-    </w:p>
-    <w:p>
-      <w:pPr>
-        <w:spacing w:after="120" w:line="300"/>
-      </w:pPr>
-      <w:r>
-        <w:rPr>
-          <w:rFonts w:ascii="Calibri" w:cs="Calibri" w:eastAsia="Calibri" w:hAnsi="Calibri"/>
-          <w:sz w:val="22"/>
-          <w:szCs w:val="22"/>
-        </w:rPr>
-        <w:t xml:space="preserve">La modification et sa trace sont dans le même bloc : Room les écrit ensemble ou n'écrit rien. L'historique ne peut donc jamais raconter autre chose que ce qui s'est passé.</w:t>
-      </w:r>
-    </w:p>
-    <w:p>
-      <w:pPr>
-        <w:pStyle w:val="Heading2"/>
-        <w:spacing w:after="140" w:before="280"/>
-      </w:pPr>
-      <w:r>
-        <w:rPr>
-          <w:rFonts w:ascii="Calibri" w:cs="Calibri" w:eastAsia="Calibri" w:hAnsi="Calibri"/>
-          <w:b/>
-          <w:bCs/>
-          <w:color w:val="0B2E4F"/>
-          <w:sz w:val="26"/>
-          <w:szCs w:val="26"/>
-        </w:rPr>
-        <w:t xml:space="preserve">B.2 Une règle pure et son test</w:t>
-      </w:r>
-    </w:p>
-    <w:p>
-      <w:pPr>
-        <w:shd w:fill="F3F6FA" w:color="auto" w:val="clear"/>
-        <w:spacing w:after="0" w:line="260"/>
-        <w:ind w:left="200" w:right="200"/>
-      </w:pPr>
-      <w:r>
-        <w:rPr>
-          <w:rFonts w:ascii="Consolas" w:cs="Consolas" w:eastAsia="Consolas" w:hAnsi="Consolas"/>
-          <w:sz w:val="18"/>
-          <w:szCs w:val="18"/>
-        </w:rPr>
-        <w:t xml:space="preserve">// Règle d'ouverture d'une tentative (couche métier)</w:t>
-      </w:r>
-    </w:p>
-    <w:p>
-      <w:pPr>
-        <w:shd w:fill="F3F6FA" w:color="auto" w:val="clear"/>
-        <w:spacing w:after="0" w:line="260"/>
-        <w:ind w:left="200" w:right="200"/>
-      </w:pPr>
-      <w:r>
-        <w:rPr>
-          <w:rFonts w:ascii="Consolas" w:cs="Consolas" w:eastAsia="Consolas" w:hAnsi="Consolas"/>
-          <w:sz w:val="18"/>
-          <w:szCs w:val="18"/>
-        </w:rPr>
-        <w:t xml:space="preserve">fun peutOuvrir(statutPresence: StatutPresence?, tentativeDeCetteInscription: Tentative?,</w:t>
-      </w:r>
-    </w:p>
-    <w:p>
-      <w:pPr>
-        <w:shd w:fill="F3F6FA" w:color="auto" w:val="clear"/>
-        <w:spacing w:after="0" w:line="260"/>
-        <w:ind w:left="200" w:right="200"/>
-      </w:pPr>
-      <w:r>
-        <w:rPr>
-          <w:rFonts w:ascii="Consolas" w:cs="Consolas" w:eastAsia="Consolas" w:hAnsi="Consolas"/>
-          <w:sz w:val="18"/>
-          <w:szCs w:val="18"/>
-        </w:rPr>
-        <w:t xml:space="preserve">               nombreTentatives: Int, tentativesMax: Int): String? = when {</w:t>
-      </w:r>
-    </w:p>
-    <w:p>
-      <w:pPr>
-        <w:shd w:fill="F3F6FA" w:color="auto" w:val="clear"/>
-        <w:spacing w:after="0" w:line="260"/>
-        <w:ind w:left="200" w:right="200"/>
-      </w:pPr>
-      <w:r>
-        <w:rPr>
-          <w:rFonts w:ascii="Consolas" w:cs="Consolas" w:eastAsia="Consolas" w:hAnsi="Consolas"/>
-          <w:sz w:val="18"/>
-          <w:szCs w:val="18"/>
-        </w:rPr>
-        <w:t xml:space="preserve">    tentativeDeCetteInscription != null -&gt; when (tentativeDeCetteInscription.statut) {</w:t>
-      </w:r>
-    </w:p>
-    <w:p>
-      <w:pPr>
-        <w:shd w:fill="F3F6FA" w:color="auto" w:val="clear"/>
-        <w:spacing w:after="0" w:line="260"/>
-        <w:ind w:left="200" w:right="200"/>
-      </w:pPr>
-      <w:r>
-        <w:rPr>
-          <w:rFonts w:ascii="Consolas" w:cs="Consolas" w:eastAsia="Consolas" w:hAnsi="Consolas"/>
-          <w:sz w:val="18"/>
-          <w:szCs w:val="18"/>
-        </w:rPr>
-        <w:t xml:space="preserve">        StatutTentative.EN_COURS -&gt; null                         // reprise du passage en cours</w:t>
-      </w:r>
-    </w:p>
-    <w:p>
-      <w:pPr>
-        <w:shd w:fill="F3F6FA" w:color="auto" w:val="clear"/>
-        <w:spacing w:after="0" w:line="260"/>
-        <w:ind w:left="200" w:right="200"/>
-      </w:pPr>
-      <w:r>
-        <w:rPr>
-          <w:rFonts w:ascii="Consolas" w:cs="Consolas" w:eastAsia="Consolas" w:hAnsi="Consolas"/>
-          <w:sz w:val="18"/>
-          <w:szCs w:val="18"/>
-        </w:rPr>
-        <w:t xml:space="preserve">        else -&gt; "Un passage existe déjà pour cette inscription."</w:t>
-      </w:r>
-    </w:p>
-    <w:p>
-      <w:pPr>
-        <w:shd w:fill="F3F6FA" w:color="auto" w:val="clear"/>
-        <w:spacing w:after="0" w:line="260"/>
-        <w:ind w:left="200" w:right="200"/>
-      </w:pPr>
-      <w:r>
-        <w:rPr>
-          <w:rFonts w:ascii="Consolas" w:cs="Consolas" w:eastAsia="Consolas" w:hAnsi="Consolas"/>
-          <w:sz w:val="18"/>
-          <w:szCs w:val="18"/>
-        </w:rPr>
-        <w:t xml:space="preserve">    }</w:t>
-      </w:r>
-    </w:p>
-    <w:p>
-      <w:pPr>
-        <w:shd w:fill="F3F6FA" w:color="auto" w:val="clear"/>
-        <w:spacing w:after="0" w:line="260"/>
-        <w:ind w:left="200" w:right="200"/>
-      </w:pPr>
-      <w:r>
-        <w:rPr>
-          <w:rFonts w:ascii="Consolas" w:cs="Consolas" w:eastAsia="Consolas" w:hAnsi="Consolas"/>
-          <w:sz w:val="18"/>
-          <w:szCs w:val="18"/>
-        </w:rPr>
-        <w:t xml:space="preserve">    statutPresence != StatutPresence.PRESENT &amp;&amp; statutPresence != StatutPresence.EN_COURS -&gt;</w:t>
-      </w:r>
-    </w:p>
-    <w:p>
-      <w:pPr>
-        <w:shd w:fill="F3F6FA" w:color="auto" w:val="clear"/>
-        <w:spacing w:after="0" w:line="260"/>
-        <w:ind w:left="200" w:right="200"/>
-      </w:pPr>
-      <w:r>
-        <w:rPr>
-          <w:rFonts w:ascii="Consolas" w:cs="Consolas" w:eastAsia="Consolas" w:hAnsi="Consolas"/>
-          <w:sz w:val="18"/>
-          <w:szCs w:val="18"/>
-        </w:rPr>
-        <w:t xml:space="preserve">        "Le candidat n'est pas marqué présent (appel)."</w:t>
-      </w:r>
-    </w:p>
-    <w:p>
-      <w:pPr>
-        <w:shd w:fill="F3F6FA" w:color="auto" w:val="clear"/>
-        <w:spacing w:after="0" w:line="260"/>
-        <w:ind w:left="200" w:right="200"/>
-      </w:pPr>
-      <w:r>
-        <w:rPr>
-          <w:rFonts w:ascii="Consolas" w:cs="Consolas" w:eastAsia="Consolas" w:hAnsi="Consolas"/>
-          <w:sz w:val="18"/>
-          <w:szCs w:val="18"/>
-        </w:rPr>
-        <w:t xml:space="preserve">    tentativesMax &gt; 0 &amp;&amp; nombreTentatives &gt;= tentativesMax -&gt; "Nombre maximal de passages atteint."</w:t>
-      </w:r>
-    </w:p>
-    <w:p>
-      <w:pPr>
-        <w:shd w:fill="F3F6FA" w:color="auto" w:val="clear"/>
-        <w:spacing w:after="0" w:line="260"/>
-        <w:ind w:left="200" w:right="200"/>
-      </w:pPr>
-      <w:r>
-        <w:rPr>
-          <w:rFonts w:ascii="Consolas" w:cs="Consolas" w:eastAsia="Consolas" w:hAnsi="Consolas"/>
-          <w:sz w:val="18"/>
-          <w:szCs w:val="18"/>
-        </w:rPr>
-        <w:t xml:space="preserve">    else -&gt; null</w:t>
-      </w:r>
-    </w:p>
-    <w:p>
-      <w:pPr>
-        <w:shd w:fill="F3F6FA" w:color="auto" w:val="clear"/>
-        <w:spacing w:after="0" w:line="260"/>
-        <w:ind w:left="200" w:right="200"/>
-      </w:pPr>
-      <w:r>
-        <w:rPr>
-          <w:rFonts w:ascii="Consolas" w:cs="Consolas" w:eastAsia="Consolas" w:hAnsi="Consolas"/>
-          <w:sz w:val="18"/>
-          <w:szCs w:val="18"/>
-        </w:rPr>
-        <w:t xml:space="preserve">}</w:t>
-      </w:r>
-    </w:p>
-    <w:p>
-      <w:pPr>
-        <w:shd w:fill="F3F6FA" w:color="auto" w:val="clear"/>
-        <w:spacing w:after="0" w:line="260"/>
-        <w:ind w:left="200" w:right="200"/>
-      </w:pPr>
-      <w:r>
-        <w:rPr>
-          <w:rFonts w:ascii="Consolas" w:cs="Consolas" w:eastAsia="Consolas" w:hAnsi="Consolas"/>
-          <w:sz w:val="18"/>
-          <w:szCs w:val="18"/>
-        </w:rPr>
-        <w:t xml:space="preserve"/>
-      </w:r>
-    </w:p>
-    <w:p>
-      <w:pPr>
-        <w:shd w:fill="F3F6FA" w:color="auto" w:val="clear"/>
-        <w:spacing w:after="0" w:line="260"/>
-        <w:ind w:left="200" w:right="200"/>
-      </w:pPr>
-      <w:r>
-        <w:rPr>
-          <w:rFonts w:ascii="Consolas" w:cs="Consolas" w:eastAsia="Consolas" w:hAnsi="Consolas"/>
-          <w:sz w:val="18"/>
-          <w:szCs w:val="18"/>
-        </w:rPr>
-        <w:t xml:space="preserve">// Son test unitaire</w:t>
-      </w:r>
-    </w:p>
-    <w:p>
-      <w:pPr>
-        <w:shd w:fill="F3F6FA" w:color="auto" w:val="clear"/>
-        <w:spacing w:after="0" w:line="260"/>
-        <w:ind w:left="200" w:right="200"/>
-      </w:pPr>
-      <w:r>
-        <w:rPr>
-          <w:rFonts w:ascii="Consolas" w:cs="Consolas" w:eastAsia="Consolas" w:hAnsi="Consolas"/>
-          <w:sz w:val="18"/>
-          <w:szCs w:val="18"/>
-        </w:rPr>
-        <w:t xml:space="preserve">@Test fun `ouverture reservee aux presents`() {</w:t>
-      </w:r>
-    </w:p>
-    <w:p>
-      <w:pPr>
-        <w:shd w:fill="F3F6FA" w:color="auto" w:val="clear"/>
-        <w:spacing w:after="0" w:line="260"/>
-        <w:ind w:left="200" w:right="200"/>
-      </w:pPr>
-      <w:r>
-        <w:rPr>
-          <w:rFonts w:ascii="Consolas" w:cs="Consolas" w:eastAsia="Consolas" w:hAnsi="Consolas"/>
-          <w:sz w:val="18"/>
-          <w:szCs w:val="18"/>
-        </w:rPr>
-        <w:t xml:space="preserve">    assertNull(ReglesTentatives.peutOuvrir(StatutPresence.PRESENT, null, 0, 0))</w:t>
-      </w:r>
-    </w:p>
-    <w:p>
-      <w:pPr>
-        <w:shd w:fill="F3F6FA" w:color="auto" w:val="clear"/>
-        <w:spacing w:after="0" w:line="260"/>
-        <w:ind w:left="200" w:right="200"/>
-      </w:pPr>
-      <w:r>
-        <w:rPr>
-          <w:rFonts w:ascii="Consolas" w:cs="Consolas" w:eastAsia="Consolas" w:hAnsi="Consolas"/>
-          <w:sz w:val="18"/>
-          <w:szCs w:val="18"/>
-        </w:rPr>
-        <w:t xml:space="preserve">    assertNotNull(ReglesTentatives.peutOuvrir(StatutPresence.ABSENT, null, 0, 0))</w:t>
-      </w:r>
-    </w:p>
-    <w:p>
-      <w:pPr>
-        <w:shd w:fill="F3F6FA" w:color="auto" w:val="clear"/>
-        <w:spacing w:after="0" w:line="260"/>
-        <w:ind w:left="200" w:right="200"/>
-      </w:pPr>
-      <w:r>
-        <w:rPr>
-          <w:rFonts w:ascii="Consolas" w:cs="Consolas" w:eastAsia="Consolas" w:hAnsi="Consolas"/>
-          <w:sz w:val="18"/>
-          <w:szCs w:val="18"/>
-        </w:rPr>
-        <w:t xml:space="preserve">}</w:t>
-      </w:r>
-    </w:p>
-    <w:p>
-      <w:pPr>
-        <w:spacing w:after="120" w:line="300"/>
-      </w:pPr>
-      <w:r>
-        <w:rPr>
-          <w:rFonts w:ascii="Calibri" w:cs="Calibri" w:eastAsia="Calibri" w:hAnsi="Calibri"/>
-          <w:sz w:val="22"/>
-          <w:szCs w:val="22"/>
-        </w:rPr>
-        <w:t xml:space="preserve">Extrait simplifié (les messages réels citent le numéro et le statut du passage). La fonction ne connaît ni Android ni la base : elle reçoit des valeurs et renvoie un message d'erreur ou null. Le ViewModel fait les requêtes, la fonction fait le jugement, le test JUnit tourne sans téléphone.</w:t>
-      </w:r>
-    </w:p>
-    <w:p>
-      <w:pPr>
-        <w:pStyle w:val="Heading2"/>
-        <w:spacing w:after="140" w:before="280"/>
-      </w:pPr>
-      <w:r>
-        <w:rPr>
-          <w:rFonts w:ascii="Calibri" w:cs="Calibri" w:eastAsia="Calibri" w:hAnsi="Calibri"/>
-          <w:b/>
-          <w:bCs/>
-          <w:color w:val="0B2E4F"/>
-          <w:sz w:val="26"/>
-          <w:szCs w:val="26"/>
-        </w:rPr>
-        <w:t xml:space="preserve">B.3 Un ViewModel branché sur Room</w:t>
-      </w:r>
-    </w:p>
-    <w:p>
-      <w:pPr>
-        <w:shd w:fill="F3F6FA" w:color="auto" w:val="clear"/>
-        <w:spacing w:after="0" w:line="260"/>
-        <w:ind w:left="200" w:right="200"/>
-      </w:pPr>
-      <w:r>
-        <w:rPr>
-          <w:rFonts w:ascii="Consolas" w:cs="Consolas" w:eastAsia="Consolas" w:hAnsi="Consolas"/>
-          <w:sz w:val="18"/>
-          <w:szCs w:val="18"/>
-        </w:rPr>
-        <w:t xml:space="preserve">val etat: StateFlow&lt;EtatTentatives&gt; =</w:t>
-      </w:r>
-    </w:p>
-    <w:p>
-      <w:pPr>
-        <w:shd w:fill="F3F6FA" w:color="auto" w:val="clear"/>
-        <w:spacing w:after="0" w:line="260"/>
-        <w:ind w:left="200" w:right="200"/>
-      </w:pPr>
-      <w:r>
-        <w:rPr>
-          <w:rFonts w:ascii="Consolas" w:cs="Consolas" w:eastAsia="Consolas" w:hAnsi="Consolas"/>
-          <w:sz w:val="18"/>
-          <w:szCs w:val="18"/>
-        </w:rPr>
-        <w:t xml:space="preserve">    idSession.flatMapLatest { id -&gt;</w:t>
-      </w:r>
-    </w:p>
-    <w:p>
-      <w:pPr>
-        <w:shd w:fill="F3F6FA" w:color="auto" w:val="clear"/>
-        <w:spacing w:after="0" w:line="260"/>
-        <w:ind w:left="200" w:right="200"/>
-      </w:pPr>
-      <w:r>
-        <w:rPr>
-          <w:rFonts w:ascii="Consolas" w:cs="Consolas" w:eastAsia="Consolas" w:hAnsi="Consolas"/>
-          <w:sz w:val="18"/>
-          <w:szCs w:val="18"/>
-        </w:rPr>
-        <w:t xml:space="preserve">        combine(db.sessionDao().parIdEnDirect(id), db.inscriptionDao().parSession(id),</w:t>
-      </w:r>
-    </w:p>
-    <w:p>
-      <w:pPr>
-        <w:shd w:fill="F3F6FA" w:color="auto" w:val="clear"/>
-        <w:spacing w:after="0" w:line="260"/>
-        <w:ind w:left="200" w:right="200"/>
-      </w:pPr>
-      <w:r>
-        <w:rPr>
-          <w:rFonts w:ascii="Consolas" w:cs="Consolas" w:eastAsia="Consolas" w:hAnsi="Consolas"/>
-          <w:sz w:val="18"/>
-          <w:szCs w:val="18"/>
-        </w:rPr>
-        <w:t xml:space="preserve">                db.presenceDao().parSession(id), db.tentativeDao().parSession(id)) { s, i, p, t -&gt; ... }</w:t>
-      </w:r>
-    </w:p>
-    <w:p>
-      <w:pPr>
-        <w:shd w:fill="F3F6FA" w:color="auto" w:val="clear"/>
-        <w:spacing w:after="0" w:line="260"/>
-        <w:ind w:left="200" w:right="200"/>
-      </w:pPr>
-      <w:r>
-        <w:rPr>
-          <w:rFonts w:ascii="Consolas" w:cs="Consolas" w:eastAsia="Consolas" w:hAnsi="Consolas"/>
-          <w:sz w:val="18"/>
-          <w:szCs w:val="18"/>
-        </w:rPr>
-        <w:t xml:space="preserve">    }.stateIn(viewModelScope, SharingStarted.WhileSubscribed(5_000), EtatTentatives())</w:t>
-      </w:r>
-    </w:p>
-    <w:p>
-      <w:pPr>
-        <w:spacing w:after="120" w:line="300"/>
-      </w:pPr>
-      <w:r>
-        <w:rPr>
-          <w:rFonts w:ascii="Calibri" w:cs="Calibri" w:eastAsia="Calibri" w:hAnsi="Calibri"/>
-          <w:sz w:val="22"/>
-          <w:szCs w:val="22"/>
-        </w:rPr>
-        <w:t xml:space="preserve">L'écran collecte un seul état immuable, recalculé par Room à chaque changement d'une des tables : aucune lecture manuelle, aucun rafraîchissement à déclencher.</w:t>
-      </w:r>
-    </w:p>
-    <w:p>
-      <w:pPr>
-        <w:pStyle w:val="Heading2"/>
-        <w:spacing w:after="140" w:before="280"/>
-      </w:pPr>
-      <w:r>
-        <w:rPr>
-          <w:rFonts w:ascii="Calibri" w:cs="Calibri" w:eastAsia="Calibri" w:hAnsi="Calibri"/>
-          <w:b/>
-          <w:bCs/>
-          <w:color w:val="0B2E4F"/>
-          <w:sz w:val="26"/>
-          <w:szCs w:val="26"/>
-        </w:rPr>
-        <w:t xml:space="preserve">B.4 Le tirage du sujet, reproductible</w:t>
-      </w:r>
-    </w:p>
-    <w:p>
-      <w:pPr>
-        <w:shd w:fill="F3F6FA" w:color="auto" w:val="clear"/>
-        <w:spacing w:after="0" w:line="260"/>
-        <w:ind w:left="200" w:right="200"/>
-      </w:pPr>
-      <w:r>
-        <w:rPr>
-          <w:rFonts w:ascii="Consolas" w:cs="Consolas" w:eastAsia="Consolas" w:hAnsi="Consolas"/>
-          <w:sz w:val="18"/>
-          <w:szCs w:val="18"/>
-        </w:rPr>
-        <w:t xml:space="preserve">fun tirerSujet(questionsActives: List&lt;Question&gt;, noteMax: Double, aleatoire: Random = Random.Default): List&lt;Question&gt; {</w:t>
-      </w:r>
-    </w:p>
-    <w:p>
-      <w:pPr>
-        <w:shd w:fill="F3F6FA" w:color="auto" w:val="clear"/>
-        <w:spacing w:after="0" w:line="260"/>
-        <w:ind w:left="200" w:right="200"/>
-      </w:pPr>
-      <w:r>
-        <w:rPr>
-          <w:rFonts w:ascii="Consolas" w:cs="Consolas" w:eastAsia="Consolas" w:hAnsi="Consolas"/>
-          <w:sz w:val="18"/>
-          <w:szCs w:val="18"/>
-        </w:rPr>
-        <w:t xml:space="preserve">    val sujet = mutableListOf&lt;Question&gt;(); var total = 0.0</w:t>
-      </w:r>
-    </w:p>
-    <w:p>
-      <w:pPr>
-        <w:shd w:fill="F3F6FA" w:color="auto" w:val="clear"/>
-        <w:spacing w:after="0" w:line="260"/>
-        <w:ind w:left="200" w:right="200"/>
-      </w:pPr>
-      <w:r>
-        <w:rPr>
-          <w:rFonts w:ascii="Consolas" w:cs="Consolas" w:eastAsia="Consolas" w:hAnsi="Consolas"/>
-          <w:sz w:val="18"/>
-          <w:szCs w:val="18"/>
-        </w:rPr>
-        <w:t xml:space="preserve">    for (q in questionsActives.filter { it.actif &amp;&amp; it.points &gt; 0 }.shuffled(aleatoire)) {</w:t>
-      </w:r>
-    </w:p>
-    <w:p>
-      <w:pPr>
-        <w:shd w:fill="F3F6FA" w:color="auto" w:val="clear"/>
-        <w:spacing w:after="0" w:line="260"/>
-        <w:ind w:left="200" w:right="200"/>
-      </w:pPr>
-      <w:r>
-        <w:rPr>
-          <w:rFonts w:ascii="Consolas" w:cs="Consolas" w:eastAsia="Consolas" w:hAnsi="Consolas"/>
-          <w:sz w:val="18"/>
-          <w:szCs w:val="18"/>
-        </w:rPr>
-        <w:t xml:space="preserve">        if (total &gt;= noteMax) break</w:t>
-      </w:r>
-    </w:p>
-    <w:p>
-      <w:pPr>
-        <w:shd w:fill="F3F6FA" w:color="auto" w:val="clear"/>
-        <w:spacing w:after="0" w:line="260"/>
-        <w:ind w:left="200" w:right="200"/>
-      </w:pPr>
-      <w:r>
-        <w:rPr>
-          <w:rFonts w:ascii="Consolas" w:cs="Consolas" w:eastAsia="Consolas" w:hAnsi="Consolas"/>
-          <w:sz w:val="18"/>
-          <w:szCs w:val="18"/>
-        </w:rPr>
-        <w:t xml:space="preserve">        if (total + q.points &lt;= noteMax) { sujet += q; total += q.points }</w:t>
-      </w:r>
-    </w:p>
-    <w:p>
-      <w:pPr>
-        <w:shd w:fill="F3F6FA" w:color="auto" w:val="clear"/>
-        <w:spacing w:after="0" w:line="260"/>
-        <w:ind w:left="200" w:right="200"/>
-      </w:pPr>
-      <w:r>
-        <w:rPr>
-          <w:rFonts w:ascii="Consolas" w:cs="Consolas" w:eastAsia="Consolas" w:hAnsi="Consolas"/>
-          <w:sz w:val="18"/>
-          <w:szCs w:val="18"/>
-        </w:rPr>
-        <w:t xml:space="preserve">    }</w:t>
-      </w:r>
-    </w:p>
-    <w:p>
-      <w:pPr>
-        <w:shd w:fill="F3F6FA" w:color="auto" w:val="clear"/>
-        <w:spacing w:after="0" w:line="260"/>
-        <w:ind w:left="200" w:right="200"/>
-      </w:pPr>
-      <w:r>
-        <w:rPr>
-          <w:rFonts w:ascii="Consolas" w:cs="Consolas" w:eastAsia="Consolas" w:hAnsi="Consolas"/>
-          <w:sz w:val="18"/>
-          <w:szCs w:val="18"/>
-        </w:rPr>
-        <w:t xml:space="preserve">    return sujet</w:t>
-      </w:r>
-    </w:p>
-    <w:p>
-      <w:pPr>
-        <w:shd w:fill="F3F6FA" w:color="auto" w:val="clear"/>
-        <w:spacing w:after="0" w:line="260"/>
-        <w:ind w:left="200" w:right="200"/>
-      </w:pPr>
-      <w:r>
-        <w:rPr>
-          <w:rFonts w:ascii="Consolas" w:cs="Consolas" w:eastAsia="Consolas" w:hAnsi="Consolas"/>
-          <w:sz w:val="18"/>
-          <w:szCs w:val="18"/>
-        </w:rPr>
-        <w:t xml:space="preserve">}</w:t>
-      </w:r>
-    </w:p>
-    <w:p>
-      <w:pPr>
-        <w:spacing w:after="120" w:line="300"/>
-      </w:pPr>
-      <w:r>
-        <w:rPr>
-          <w:rFonts w:ascii="Calibri" w:cs="Calibri" w:eastAsia="Calibri" w:hAnsi="Calibri"/>
-          <w:sz w:val="22"/>
-          <w:szCs w:val="22"/>
-        </w:rPr>
-        <w:t xml:space="preserve">Le hasard est un paramètre : en production, le générateur par défaut ; en test, une graine fixe, et le test vérifie que le sujet atteint la note maximale sans la dépasser ni répéter une question.</w:t>
-      </w:r>
-    </w:p>
-    <w:p>
-      <w:pPr>
-        <w:pStyle w:val="Heading1"/>
-        <w:pageBreakBefore/>
-        <w:spacing w:after="200" w:before="360"/>
-      </w:pPr>
-      <w:r>
-        <w:rPr>
-          <w:rFonts w:ascii="Calibri" w:cs="Calibri" w:eastAsia="Calibri" w:hAnsi="Calibri"/>
-          <w:b/>
-          <w:bCs/>
-          <w:color w:val="0F4C81"/>
-          <w:sz w:val="32"/>
-          <w:szCs w:val="32"/>
-        </w:rPr>
-        <w:t xml:space="preserve">Annexe C — Sources</w:t>
+        <w:t xml:space="preserve">Annexe B — Sources</w:t>
       </w:r>
     </w:p>
     <w:tbl>
@@ -18824,7 +15441,7 @@
           <w:sz w:val="32"/>
           <w:szCs w:val="32"/>
         </w:rPr>
-        <w:t xml:space="preserve">Annexe D — Glossaire</w:t>
+        <w:t xml:space="preserve">Annexe C — Glossaire</w:t>
       </w:r>
     </w:p>
     <w:tbl>
@@ -20149,7 +16766,7 @@
           <w:sz w:val="32"/>
           <w:szCs w:val="32"/>
         </w:rPr>
-        <w:t xml:space="preserve">Annexe E — Comptes de démonstration</w:t>
+        <w:t xml:space="preserve">Annexe D — Comptes de démonstration</w:t>
       </w:r>
     </w:p>
     <w:p>
@@ -20668,7 +17285,7 @@
           <w:sz w:val="32"/>
           <w:szCs w:val="32"/>
         </w:rPr>
-        <w:t xml:space="preserve">Annexe F — Questions à valider avec l'ATT</w:t>
+        <w:t xml:space="preserve">Annexe E — Questions à valider avec l'ATT</w:t>
       </w:r>
     </w:p>
     <w:p>
@@ -21598,7 +18215,7 @@
           <w:sz w:val="32"/>
           <w:szCs w:val="32"/>
         </w:rPr>
-        <w:t xml:space="preserve">Annexe G — Trois entrées du journal IA, telles quelles</w:t>
+        <w:t xml:space="preserve">Annexe F — Trois entrées du journal IA, telles quelles</w:t>
       </w:r>
     </w:p>
     <w:p>

</xml_diff>

<commit_message>
Supprime l'annexe du journal IA dans le rapport
</commit_message>
<xml_diff>
--- a/docs/rapport/Rapport_technique_ATT.docx
+++ b/docs/rapport/Rapport_technique_ATT.docx
@@ -11022,7 +11022,7 @@
           <w:sz w:val="22"/>
           <w:szCs w:val="22"/>
         </w:rPr>
-        <w:t xml:space="preserve">La proportion : l'IA a produit la majorité du code de chaque étape à partir de nos documents de cadrage (règles, plan, modèle de données, cas d'utilisation), que nous avons écrits et validés avant la première ligne. Nous avons relu chaque fichier dans la demande de fusion (pull request) de l'étape avant de la fusionner, et rejoué chaque scénario sur l'émulateur. Le journal IA (annexe F) consigne pour chaque étape ce qui a été soumis, la remarque principale de l'IA, les points d'alerte, et notre verdict.</w:t>
+        <w:t xml:space="preserve">La proportion : l'IA a produit la majorité du code de chaque étape à partir de nos documents de cadrage (règles, plan, modèle de données, cas d'utilisation), que nous avons écrits et validés avant la première ligne. Nous avons relu chaque fichier dans la demande de fusion (pull request) de l'étape avant de la fusionner, et rejoué chaque scénario sur l'émulateur. Un journal tenu à chaque étape consigne ce qui a été soumis, la remarque principale de l'IA, les points d'alerte, et notre verdict.</w:t>
       </w:r>
     </w:p>
     <w:p>
@@ -11222,7 +11222,7 @@
           <w:sz w:val="22"/>
           <w:szCs w:val="22"/>
         </w:rPr>
-        <w:t xml:space="preserve">La question de la dernière séance, « sur quelle tâche auriez-vous appris moins si l'IA avait été autorisée ? », nous y répondons ainsi : sur l'architecture. Si l'IA avait posé seule le modèle de données et la découpe des ViewModels, nous aurions eu une application qui marche sans savoir pourquoi. C'est parce que nous avons écrit le cadrage et relu chaque étape que nous savons expliquer chaque fichier ; trois entrées du journal sont recopiées en annexe F pour en témoigner.</w:t>
+        <w:t xml:space="preserve">La question de la dernière séance, « sur quelle tâche auriez-vous appris moins si l'IA avait été autorisée ? », nous y répondons ainsi : sur l'architecture. Si l'IA avait posé seule le modèle de données et la découpe des ViewModels, nous aurions eu une application qui marche sans savoir pourquoi. C'est parce que nous avons écrit le cadrage et relu chaque étape que nous savons expliquer chaque partie du code.</w:t>
       </w:r>
     </w:p>
     <w:p>
@@ -18195,236 +18195,6 @@
         </w:tc>
       </w:tr>
     </w:tbl>
-    <w:p>
-      <w:pPr>
-        <w:spacing w:after="160"/>
-      </w:pPr>
-    </w:p>
-    <w:p>
-      <w:pPr>
-        <w:pStyle w:val="Heading1"/>
-        <w:pageBreakBefore/>
-        <w:spacing w:after="200" w:before="360"/>
-      </w:pPr>
-      <w:r>
-        <w:rPr>
-          <w:rFonts w:ascii="Calibri" w:cs="Calibri" w:eastAsia="Calibri" w:hAnsi="Calibri"/>
-          <w:b/>
-          <w:bCs/>
-          <w:color w:val="0F4C81"/>
-          <w:sz w:val="32"/>
-          <w:szCs w:val="32"/>
-        </w:rPr>
-        <w:t xml:space="preserve">Annexe F — Trois entrées du journal IA, telles quelles</w:t>
-      </w:r>
-    </w:p>
-    <w:p>
-      <w:pPr>
-        <w:spacing w:after="120" w:line="300"/>
-      </w:pPr>
-      <w:r>
-        <w:rPr>
-          <w:rFonts w:ascii="Calibri" w:cs="Calibri" w:eastAsia="Calibri" w:hAnsi="Calibri"/>
-          <w:sz w:val="22"/>
-          <w:szCs w:val="22"/>
-        </w:rPr>
-        <w:t xml:space="preserve">Le journal IA compte une entrée par étape. Les trois entrées ci-dessous sont recopiées telles quelles, sans la ligne qui liste les fichiers concernés : la contradiction entre un index SQL et une règle métier (chapitre 10), le passage du QCM à l'épreuve orale sur un témoignage de terrain (chapitres 2 et 10), et la reprise de la démonstration du cours pour la synchronisation (chapitres 7.5 et 12).</w:t>
-      </w:r>
-    </w:p>
-    <w:p>
-      <w:pPr>
-        <w:pStyle w:val="Heading3"/>
-        <w:spacing w:after="100" w:before="200"/>
-      </w:pPr>
-      <w:r>
-        <w:rPr>
-          <w:rFonts w:ascii="Calibri" w:cs="Calibri" w:eastAsia="Calibri" w:hAnsi="Calibri"/>
-          <w:b/>
-          <w:bCs/>
-          <w:color w:val="0B2E4F"/>
-          <w:sz w:val="23"/>
-          <w:szCs w:val="23"/>
-        </w:rPr>
-        <w:t xml:space="preserve">Entrée 10 — 16/09/2026 — Étape C7, présence et appel</w:t>
-      </w:r>
-    </w:p>
-    <w:p>
-      <w:pPr>
-        <w:spacing w:after="120" w:line="300"/>
-      </w:pPr>
-      <w:r>
-        <w:rPr>
-          <w:rFonts w:ascii="Calibri" w:cs="Calibri" w:eastAsia="Calibri" w:hAnsi="Calibri"/>
-          <w:sz w:val="20"/>
-          <w:szCs w:val="20"/>
-        </w:rPr>
-        <w:t xml:space="preserve">- Remarque principale de l'IA : la vérification sur émulateur a révélé un vrai défaut de conception, pas un bug de frappe : l'index unique (candidat, session) en base contredisait la règle métier « une inscription reportée ou annulée peut être suivie d'une nouvelle ». Le test unitaire de la règle passait ; seule la base réelle a montré la contradiction. Leçon pour le binôme : les invariants qui dépendent d'un statut ne se mettent pas dans un index SQL, mais dans une fonction pure.</w:t>
-      </w:r>
-    </w:p>
-    <w:p>
-      <w:pPr>
-        <w:spacing w:after="120" w:line="300"/>
-      </w:pPr>
-      <w:r>
-        <w:rPr>
-          <w:rFonts w:ascii="Calibri" w:cs="Calibri" w:eastAsia="Calibri" w:hAnsi="Calibri"/>
-          <w:sz w:val="20"/>
-          <w:szCs w:val="20"/>
-        </w:rPr>
-        <w:t xml:space="preserve">⚠️ La correction change le schéma (v2) avec fallbackToDestructiveMigration : les données de test de l'émulateur sont perdues, ce qui est accepté en développement (docs/01 §7) ; le pilote a rejoué toute la chaîne depuis une base vide en une passe.</w:t>
-      </w:r>
-    </w:p>
-    <w:p>
-      <w:pPr>
-        <w:spacing w:after="120" w:line="300"/>
-      </w:pPr>
-      <w:r>
-        <w:rPr>
-          <w:rFonts w:ascii="Calibri" w:cs="Calibri" w:eastAsia="Calibri" w:hAnsi="Calibri"/>
-          <w:sz w:val="20"/>
-          <w:szCs w:val="20"/>
-        </w:rPr>
-        <w:t xml:space="preserve">⚠️ L'horloge de l'émulateur (19 h) fait classer tout « Présent » en retard pour une convocation à 08:00 : ce n'est pas une anomalie, c'est la règle. Le scénario a donc exercé le chemin « retard accepté » plutôt que « présent direct ».</w:t>
-      </w:r>
-    </w:p>
-    <w:p>
-      <w:pPr>
-        <w:spacing w:after="120" w:line="300"/>
-      </w:pPr>
-      <w:r>
-        <w:rPr>
-          <w:rFonts w:ascii="Calibri" w:cs="Calibri" w:eastAsia="Calibri" w:hAnsi="Calibri"/>
-          <w:sz w:val="20"/>
-          <w:szCs w:val="20"/>
-        </w:rPr>
-        <w:t xml:space="preserve">⚠️ Deux perturbations sans lien avec le code : des projets du cours lancés sur le même émulateur passaient devant ATT ; puis l'émulateur a été fermé et relancé par l'IA. Le pilote vérifie désormais qu'ATT est au premier plan avant chaque action.</w:t>
-      </w:r>
-    </w:p>
-    <w:p>
-      <w:pPr>
-        <w:pStyle w:val="Heading3"/>
-        <w:spacing w:after="100" w:before="200"/>
-      </w:pPr>
-      <w:r>
-        <w:rPr>
-          <w:rFonts w:ascii="Calibri" w:cs="Calibri" w:eastAsia="Calibri" w:hAnsi="Calibri"/>
-          <w:b/>
-          <w:bCs/>
-          <w:color w:val="0B2E4F"/>
-          <w:sz w:val="23"/>
-          <w:szCs w:val="23"/>
-        </w:rPr>
-        <w:t xml:space="preserve">Entrée 12 — 17/09/2026 — Étape C9, évaluation théorique</w:t>
-      </w:r>
-    </w:p>
-    <w:p>
-      <w:pPr>
-        <w:spacing w:after="120" w:line="300"/>
-      </w:pPr>
-      <w:r>
-        <w:rPr>
-          <w:rFonts w:ascii="Calibri" w:cs="Calibri" w:eastAsia="Calibri" w:hAnsi="Calibri"/>
-          <w:sz w:val="20"/>
-          <w:szCs w:val="20"/>
-        </w:rPr>
-        <w:t xml:space="preserve">- Remarque principale de l'IA : la première version était un QCM (réponses A/B/C/D) parce que la presse et le cadrage le disaient ; le dev 1, qui vient de passer l'épreuve, a décrit une épreuve orale avec une feuille « question posée / réponse donnée / points / total ». L'IA avait respecté la règle « ne pas inventer » en suivant les sources écrites, mais une source de terrain vaut plus qu'un article : la question Q1 est réécrite, la table QCM supprimée, l'écran devient la feuille d'examen.</w:t>
-      </w:r>
-    </w:p>
-    <w:p>
-      <w:pPr>
-        <w:spacing w:after="120" w:line="300"/>
-      </w:pPr>
-      <w:r>
-        <w:rPr>
-          <w:rFonts w:ascii="Calibri" w:cs="Calibri" w:eastAsia="Calibri" w:hAnsi="Calibri"/>
-          <w:sz w:val="20"/>
-          <w:szCs w:val="20"/>
-        </w:rPr>
-        <w:t xml:space="preserve">⚠️ Le tirage au sort reste une fonction pure qui reçoit son générateur de hasard (Random(graine)) : avec une graine fixe le sujet est reproductible, le test vérifie qu'il atteint la note max sans la dépasser ni répéter, avec des questions à points variables.</w:t>
-      </w:r>
-    </w:p>
-    <w:p>
-      <w:pPr>
-        <w:spacing w:after="120" w:line="300"/>
-      </w:pPr>
-      <w:r>
-        <w:rPr>
-          <w:rFonts w:ascii="Calibri" w:cs="Calibri" w:eastAsia="Calibri" w:hAnsi="Calibri"/>
-          <w:sz w:val="20"/>
-          <w:szCs w:val="20"/>
-        </w:rPr>
-        <w:t xml:space="preserve">⚠️ Le sujet est créé en base dès l'ouverture de l'écran (gardé par « une seule fois par identifiant ») pour être figé avant la première réponse. Un écran qui écrit à l'ouverture est inhabituel dans le cours : à discuter en binôme.</w:t>
-      </w:r>
-    </w:p>
-    <w:p>
-      <w:pPr>
-        <w:spacing w:after="120" w:line="300"/>
-      </w:pPr>
-      <w:r>
-        <w:rPr>
-          <w:rFonts w:ascii="Calibri" w:cs="Calibri" w:eastAsia="Calibri" w:hAnsi="Calibri"/>
-          <w:sz w:val="20"/>
-          <w:szCs w:val="20"/>
-        </w:rPr>
-        <w:t xml:space="preserve">⚠️ Ce que tape l'examinateur est gardé dans le ViewModel et recopié en base à chaque frappe (et en bloc à la clôture) : si l'écran affichait la valeur relue depuis Room, le curseur sauterait. À relire.</w:t>
-      </w:r>
-    </w:p>
-    <w:p>
-      <w:pPr>
-        <w:pStyle w:val="Heading3"/>
-        <w:spacing w:after="100" w:before="200"/>
-      </w:pPr>
-      <w:r>
-        <w:rPr>
-          <w:rFonts w:ascii="Calibri" w:cs="Calibri" w:eastAsia="Calibri" w:hAnsi="Calibri"/>
-          <w:b/>
-          <w:bCs/>
-          <w:color w:val="0B2E4F"/>
-          <w:sz w:val="23"/>
-          <w:szCs w:val="23"/>
-        </w:rPr>
-        <w:t xml:space="preserve">Entrée 20 — 18/09/2026 — Étape D2c, synchronisation hors ligne d'abord</w:t>
-      </w:r>
-    </w:p>
-    <w:p>
-      <w:pPr>
-        <w:spacing w:after="120" w:line="300"/>
-      </w:pPr>
-      <w:r>
-        <w:rPr>
-          <w:rFonts w:ascii="Calibri" w:cs="Calibri" w:eastAsia="Calibri" w:hAnsi="Calibri"/>
-          <w:sz w:val="20"/>
-          <w:szCs w:val="20"/>
-        </w:rPr>
-        <w:t xml:space="preserve">- Remarque principale de l'IA : reproduire la démo demosync du cours à l'identique (drapeau sur l'entité, file d'attente = requête, boucle qui s'arrête au premier échec, interrupteur réseau simulé) plutôt qu'inventer un mécanisme : c'est ce que le jury connaît, et un vrai serveur remplacerait le faux sans toucher au reste.</w:t>
-      </w:r>
-    </w:p>
-    <w:p>
-      <w:pPr>
-        <w:spacing w:after="120" w:line="300"/>
-      </w:pPr>
-      <w:r>
-        <w:rPr>
-          <w:rFonts w:ascii="Calibri" w:cs="Calibri" w:eastAsia="Calibri" w:hAnsi="Calibri"/>
-          <w:sz w:val="20"/>
-          <w:szCs w:val="20"/>
-        </w:rPr>
-        <w:t xml:space="preserve">⚠️ Le drapeau est levé par une requête UPDATE … SET synchronisee = 1, pas par un @Update de l'objet entier : la note et le statut d'un résultat ne doivent jamais être réécrits (R6), même par accident.</w:t>
-      </w:r>
-    </w:p>
-    <w:p>
-      <w:pPr>
-        <w:spacing w:after="120" w:line="300"/>
-      </w:pPr>
-      <w:r>
-        <w:rPr>
-          <w:rFonts w:ascii="Calibri" w:cs="Calibri" w:eastAsia="Calibri" w:hAnsi="Calibri"/>
-          <w:sz w:val="20"/>
-          <w:szCs w:val="20"/>
-        </w:rPr>
-        <w:t xml:space="preserve">⚠️ Le dev 2 avait « figé » le schéma en v3 (D2) ; cette étape le passe en v4. Le binôme doit refaire le point sur le schéma final avant la soutenance.</w:t>
-      </w:r>
-    </w:p>
     <w:sectPr>
       <w:headerReference w:type="default" r:id="rId7"/>
       <w:headerReference w:type="first" r:id="rId8"/>

</xml_diff>

<commit_message>
Complète les noms et numéros d'étudiant sur la couverture du rapport
</commit_message>
<xml_diff>
--- a/docs/rapport/Rapport_technique_ATT.docx
+++ b/docs/rapport/Rapport_technique_ATT.docx
@@ -278,7 +278,7 @@
           <w:sz w:val="28"/>
           <w:szCs w:val="28"/>
         </w:rPr>
-        <w:t xml:space="preserve">MAMINIAINA Ericka</w:t>
+        <w:t xml:space="preserve">MAMINIAINA Ericka Fitiavana ETU001965</w:t>
       </w:r>
     </w:p>
     <w:p>
@@ -295,7 +295,7 @@
           <w:sz w:val="28"/>
           <w:szCs w:val="28"/>
         </w:rPr>
-        <w:t xml:space="preserve">ONINIAINA Mahery</w:t>
+        <w:t xml:space="preserve">ONINIAINA Mahery Harentsoa Arthur ETU002446</w:t>
       </w:r>
     </w:p>
     <w:p>

</xml_diff>